<commit_message>
Add reviewer response uncertainty audits
</commit_message>
<xml_diff>
--- a/analysis/diagnostic_measurement_audit_paper/manuscript_reframed_rq_draft.docx
+++ b/analysis/diagnostic_measurement_audit_paper/manuscript_reframed_rq_draft.docx
@@ -119,85 +119,97 @@
         <w:t xml:space="preserve"> </w:t>
       </w:r>
       <w:r>
-        <w:t xml:space="preserve">that match the target-label budget and allow target labels to update the same</w:t>
-      </w:r>
-      <w:r>
-        <w:t xml:space="preserve"> </w:t>
-      </w:r>
-      <w:r>
-        <w:t xml:space="preserve">shared layers. This fair ablation changes the interpretation of the original</w:t>
-      </w:r>
-      <w:r>
-        <w:t xml:space="preserve"> </w:t>
-      </w:r>
-      <w:r>
-        <w:t xml:space="preserve">large gain over a frozen corpus-specific-head comparator: target-supervised</w:t>
-      </w:r>
-      <w:r>
-        <w:t xml:space="preserve"> </w:t>
-      </w:r>
-      <w:r>
-        <w:t xml:space="preserve">representation adaptation explains much of that improvement. Under matched</w:t>
-      </w:r>
-      <w:r>
-        <w:t xml:space="preserve"> </w:t>
-      </w:r>
-      <w:r>
-        <w:t xml:space="preserve">target-label exposure, target-calibrated shared-layer adaptation consistently</w:t>
-      </w:r>
-      <w:r>
-        <w:t xml:space="preserve"> </w:t>
-      </w:r>
-      <w:r>
-        <w:t xml:space="preserve">improves over frozen source representations. The ordinal measurement-aware</w:t>
-      </w:r>
-      <w:r>
-        <w:t xml:space="preserve"> </w:t>
-      </w:r>
-      <w:r>
-        <w:t xml:space="preserve">pathway is competitive, with benefits over generic or direct calibrated heads</w:t>
-      </w:r>
-      <w:r>
-        <w:t xml:space="preserve"> </w:t>
-      </w:r>
-      <w:r>
-        <w:t xml:space="preserve">in one transfer direction, but corpus-specific ordinal parameterization is not</w:t>
-      </w:r>
-      <w:r>
-        <w:t xml:space="preserve"> </w:t>
-      </w:r>
-      <w:r>
-        <w:t xml:space="preserve">uniformly superior to a shared ordinal head or direct multitask adaptation.</w:t>
-      </w:r>
-      <w:r>
-        <w:t xml:space="preserve"> </w:t>
-      </w:r>
-      <w:r>
-        <w:t xml:space="preserve">Item-targeted and fixed-latent simulation analyses further show that</w:t>
-      </w:r>
-      <w:r>
-        <w:t xml:space="preserve"> </w:t>
-      </w:r>
-      <w:r>
-        <w:t xml:space="preserve">corpus-specific heads are at most a bounded, item-local mechanism under the</w:t>
-      </w:r>
-      <w:r>
-        <w:t xml:space="preserve"> </w:t>
-      </w:r>
-      <w:r>
-        <w:t xml:space="preserve">current calibration budgets. Stronger encoders remain useful, but</w:t>
-      </w:r>
-      <w:r>
-        <w:t xml:space="preserve"> </w:t>
-      </w:r>
-      <w:r>
-        <w:t xml:space="preserve">cross-corpus depression models should not treat representation alignment,</w:t>
-      </w:r>
-      <w:r>
-        <w:t xml:space="preserve"> </w:t>
-      </w:r>
-      <w:r>
-        <w:t xml:space="preserve">target calibration, or measurement modeling as interchangeable evidence.</w:t>
+        <w:t xml:space="preserve">that match the target-label budget, trainable capacity, and optimization</w:t>
+      </w:r>
+      <w:r>
+        <w:t xml:space="preserve"> </w:t>
+      </w:r>
+      <w:r>
+        <w:t xml:space="preserve">exposure. This fair ablation changes the interpretation of the original large</w:t>
+      </w:r>
+      <w:r>
+        <w:t xml:space="preserve"> </w:t>
+      </w:r>
+      <w:r>
+        <w:t xml:space="preserve">gain over a frozen corpus-specific-head comparator: the main effect is the</w:t>
+      </w:r>
+      <w:r>
+        <w:t xml:space="preserve"> </w:t>
+      </w:r>
+      <w:r>
+        <w:t xml:space="preserve">target-label calibration regime, not an independently verified</w:t>
+      </w:r>
+      <w:r>
+        <w:t xml:space="preserve"> </w:t>
+      </w:r>
+      <w:r>
+        <w:t xml:space="preserve">corpus-specific measurement pathway. At the MV24 default budgets and across a</w:t>
+      </w:r>
+      <w:r>
+        <w:t xml:space="preserve"> </w:t>
+      </w:r>
+      <w:r>
+        <w:t xml:space="preserve">k=4–24 target-label budget sweep, a target-only direct MLP is the lowest-error</w:t>
+      </w:r>
+      <w:r>
+        <w:t xml:space="preserve"> </w:t>
+      </w:r>
+      <w:r>
+        <w:t xml:space="preserve">Macro Item MAE model; source-plus-target calibrated rows more often improve</w:t>
+      </w:r>
+      <w:r>
+        <w:t xml:space="preserve"> </w:t>
+      </w:r>
+      <w:r>
+        <w:t xml:space="preserve">calibration-in-the-large than item reconstruction. The ordinal</w:t>
+      </w:r>
+      <w:r>
+        <w:t xml:space="preserve"> </w:t>
+      </w:r>
+      <w:r>
+        <w:t xml:space="preserve">measurement-aware pathway remains a constructive framework instance, but it is</w:t>
+      </w:r>
+      <w:r>
+        <w:t xml:space="preserve"> </w:t>
+      </w:r>
+      <w:r>
+        <w:t xml:space="preserve">not uniformly superior to target-only, generic calibrated, shared-ordinal, or</w:t>
+      </w:r>
+      <w:r>
+        <w:t xml:space="preserve"> </w:t>
+      </w:r>
+      <w:r>
+        <w:t xml:space="preserve">direct multitask alternatives. Item-targeted and fixed-latent simulation</w:t>
+      </w:r>
+      <w:r>
+        <w:t xml:space="preserve"> </w:t>
+      </w:r>
+      <w:r>
+        <w:t xml:space="preserve">analyses further show that corpus-specific heads are at most a bounded,</w:t>
+      </w:r>
+      <w:r>
+        <w:t xml:space="preserve"> </w:t>
+      </w:r>
+      <w:r>
+        <w:t xml:space="preserve">item-local mechanism under the current calibration budgets. Stronger encoders</w:t>
+      </w:r>
+      <w:r>
+        <w:t xml:space="preserve"> </w:t>
+      </w:r>
+      <w:r>
+        <w:t xml:space="preserve">remain useful, but cross-corpus depression models should not treat</w:t>
+      </w:r>
+      <w:r>
+        <w:t xml:space="preserve"> </w:t>
+      </w:r>
+      <w:r>
+        <w:t xml:space="preserve">representation alignment, target calibration, or measurement modeling as</w:t>
+      </w:r>
+      <w:r>
+        <w:t xml:space="preserve"> </w:t>
+      </w:r>
+      <w:r>
+        <w:t xml:space="preserve">interchangeable evidence.</w:t>
       </w:r>
     </w:p>
     <w:p>
@@ -1294,25 +1306,19 @@
         <w:t xml:space="preserve"> </w:t>
       </w:r>
       <w:r>
-        <w:t xml:space="preserve">cumulative-logit item heads, then use matched calibrated ablations to show</w:t>
-      </w:r>
-      <w:r>
-        <w:t xml:space="preserve"> </w:t>
-      </w:r>
-      <w:r>
-        <w:t xml:space="preserve">that the robust empirical gain is target calibration with shared-layer</w:t>
-      </w:r>
-      <w:r>
-        <w:t xml:space="preserve"> </w:t>
-      </w:r>
-      <w:r>
-        <w:t xml:space="preserve">adaptation, while corpus-specific ordinal parameterization remains bounded</w:t>
-      </w:r>
-      <w:r>
-        <w:t xml:space="preserve"> </w:t>
-      </w:r>
-      <w:r>
-        <w:t xml:space="preserve">and direction-dependent.</w:t>
+        <w:t xml:space="preserve">cumulative-logit item heads, then use matched calibrated ablations and</w:t>
+      </w:r>
+      <w:r>
+        <w:t xml:space="preserve"> </w:t>
+      </w:r>
+      <w:r>
+        <w:t xml:space="preserve">repeated target-label budget splits to show that calibration regime, not</w:t>
+      </w:r>
+      <w:r>
+        <w:t xml:space="preserve"> </w:t>
+      </w:r>
+      <w:r>
+        <w:t xml:space="preserve">corpus-specific ordinal parameterization, is the empirically robust factor.</w:t>
       </w:r>
     </w:p>
     <w:p>
@@ -1912,6 +1918,101 @@
         <w:pStyle w:val="FirstParagraph"/>
       </w:pPr>
       <w:r>
+        <w:t xml:space="preserve">Benchmark construct validity is now an active topic in machine learning and</w:t>
+      </w:r>
+      <w:r>
+        <w:t xml:space="preserve"> </w:t>
+      </w:r>
+      <w:r>
+        <w:t xml:space="preserve">medical AI evaluation. Alaa et al. argue that medical LLM benchmarks should be</w:t>
+      </w:r>
+      <w:r>
+        <w:t xml:space="preserve"> </w:t>
+      </w:r>
+      <w:r>
+        <w:t xml:space="preserve">evaluated as construct-validity problems rather than treated as neutral</w:t>
+      </w:r>
+      <w:r>
+        <w:t xml:space="preserve"> </w:t>
+      </w:r>
+      <w:r>
+        <w:t xml:space="preserve">leaderboards</w:t>
+      </w:r>
+      <w:r>
+        <w:t xml:space="preserve"> </w:t>
+      </w:r>
+      <w:r>
+        <w:t xml:space="preserve">(Alaa et al. 2025)</w:t>
+      </w:r>
+      <w:r>
+        <w:t xml:space="preserve">. Bean et al. review LLM benchmarks</w:t>
+      </w:r>
+      <w:r>
+        <w:t xml:space="preserve"> </w:t>
+      </w:r>
+      <w:r>
+        <w:t xml:space="preserve">through the same measurement lens</w:t>
+      </w:r>
+      <w:r>
+        <w:t xml:space="preserve"> </w:t>
+      </w:r>
+      <w:r>
+        <w:t xml:space="preserve">(Bean et al. 2025)</w:t>
+      </w:r>
+      <w:r>
+        <w:t xml:space="preserve">, and Freiesleben and</w:t>
+      </w:r>
+      <w:r>
+        <w:t xml:space="preserve"> </w:t>
+      </w:r>
+      <w:r>
+        <w:t xml:space="preserve">Zezulka frame predictive benchmark scores as claims that require explicit</w:t>
+      </w:r>
+      <w:r>
+        <w:t xml:space="preserve"> </w:t>
+      </w:r>
+      <w:r>
+        <w:t xml:space="preserve">assumptions about the task, evaluation function, and data distribution</w:t>
+      </w:r>
+      <w:r>
+        <w:t xml:space="preserve"> </w:t>
+      </w:r>
+      <w:r>
+        <w:t xml:space="preserve">(Freiesleben and Zezulka 2025)</w:t>
+      </w:r>
+      <w:r>
+        <w:t xml:space="preserve">. We therefore do not claim that importing</w:t>
+      </w:r>
+      <w:r>
+        <w:t xml:space="preserve"> </w:t>
+      </w:r>
+      <w:r>
+        <w:t xml:space="preserve">construct validity into AI benchmarking is new. Our contribution is narrower</w:t>
+      </w:r>
+      <w:r>
+        <w:t xml:space="preserve"> </w:t>
+      </w:r>
+      <w:r>
+        <w:t xml:space="preserve">and more empirical: we operationalize target-contract validity for</w:t>
+      </w:r>
+      <w:r>
+        <w:t xml:space="preserve"> </w:t>
+      </w:r>
+      <w:r>
+        <w:t xml:space="preserve">cross-corpus depression detection, where clinical labels are scale-based</w:t>
+      </w:r>
+      <w:r>
+        <w:t xml:space="preserve"> </w:t>
+      </w:r>
+      <w:r>
+        <w:t xml:space="preserve">measurements rather than generic class names.</w:t>
+      </w:r>
+    </w:p>
+    <w:p>
+      <w:pPr>
+        <w:pStyle w:val="BodyText"/>
+      </w:pPr>
+      <w:r>
         <w:t xml:space="preserve">Benchmark-validity work in depression detection has shown that high scores can</w:t>
       </w:r>
       <w:r>
@@ -1981,25 +2082,19 @@
         <w:t xml:space="preserve">(Ishikawa and Duke 2026)</w:t>
       </w:r>
       <w:r>
-        <w:t xml:space="preserve">.</w:t>
-      </w:r>
-      <w:r>
-        <w:t xml:space="preserve"> </w:t>
-      </w:r>
-      <w:r>
-        <w:t xml:space="preserve">Related criterion-contamination audits make the same warning sharper: models</w:t>
-      </w:r>
-      <w:r>
-        <w:t xml:space="preserve"> </w:t>
-      </w:r>
-      <w:r>
-        <w:t xml:space="preserve">can appear clinically meaningful when the target criterion is mirrored in the</w:t>
-      </w:r>
-      <w:r>
-        <w:t xml:space="preserve"> </w:t>
-      </w:r>
-      <w:r>
-        <w:t xml:space="preserve">input evidence</w:t>
+        <w:t xml:space="preserve">. Related criterion-contamination audits make the</w:t>
+      </w:r>
+      <w:r>
+        <w:t xml:space="preserve"> </w:t>
+      </w:r>
+      <w:r>
+        <w:t xml:space="preserve">same warning sharper: models can appear clinically meaningful when the target</w:t>
+      </w:r>
+      <w:r>
+        <w:t xml:space="preserve"> </w:t>
+      </w:r>
+      <w:r>
+        <w:t xml:space="preserve">criterion is mirrored in the input evidence</w:t>
       </w:r>
       <w:r>
         <w:t xml:space="preserve"> </w:t>
@@ -2398,13 +2493,25 @@
         <w:t xml:space="preserve"> </w:t>
       </w:r>
       <w:r>
-        <w:t xml:space="preserve">transferable depression representations. We ask whether the targets used to</w:t>
-      </w:r>
-      <w:r>
-        <w:t xml:space="preserve"> </w:t>
-      </w:r>
-      <w:r>
-        <w:t xml:space="preserve">supervise those representations are themselves comparable across corpora.</w:t>
+        <w:t xml:space="preserve">transferable depression representations, or how to validate benchmarks in</w:t>
+      </w:r>
+      <w:r>
+        <w:t xml:space="preserve"> </w:t>
+      </w:r>
+      <w:r>
+        <w:t xml:space="preserve">general. We ask whether the depression targets used to supervise those</w:t>
+      </w:r>
+      <w:r>
+        <w:t xml:space="preserve"> </w:t>
+      </w:r>
+      <w:r>
+        <w:t xml:space="preserve">representations are themselves comparable across corpora, and how that audit</w:t>
+      </w:r>
+      <w:r>
+        <w:t xml:space="preserve"> </w:t>
+      </w:r>
+      <w:r>
+        <w:t xml:space="preserve">changes calibrated transfer claims.</w:t>
       </w:r>
     </w:p>
     <w:p>
@@ -4095,7 +4202,7 @@
         <w:t xml:space="preserve"> </w:t>
       </w:r>
       <w:r>
-        <w:t xml:space="preserve">target ordinal head from the source head; then adapt the target measurement</w:t>
+        <w:t xml:space="preserve">target ordinal head from the source head; then adapt the target-side ordinal</w:t>
       </w:r>
       <w:r>
         <w:t xml:space="preserve"> </w:t>
@@ -4149,13 +4256,13 @@
         <w:t xml:space="preserve"> </w:t>
       </w:r>
       <w:r>
-        <w:t xml:space="preserve">explicit target-calibrated ordinal measurement pathway; whether the ordinal</w:t>
-      </w:r>
-      <w:r>
-        <w:t xml:space="preserve"> </w:t>
-      </w:r>
-      <w:r>
-        <w:t xml:space="preserve">head must be corpus-specific is evaluated empirically.</w:t>
+        <w:t xml:space="preserve">explicit target-calibrated ordinal prediction path; whether the ordinal head</w:t>
+      </w:r>
+      <w:r>
+        <w:t xml:space="preserve"> </w:t>
+      </w:r>
+      <w:r>
+        <w:t xml:space="preserve">must be corpus-specific is evaluated empirically.</w:t>
       </w:r>
     </w:p>
     <w:p>
@@ -5350,6 +5457,74 @@
     </w:p>
     <w:p>
       <w:pPr>
+        <w:pStyle w:val="BodyText"/>
+      </w:pPr>
+      <w:r>
+        <w:t xml:space="preserve">Because the main E-DAIC/CMDC probe drops sharply after controls, we report the</w:t>
+      </w:r>
+      <w:r>
+        <w:t xml:space="preserve"> </w:t>
+      </w:r>
+      <w:r>
+        <w:t xml:space="preserve">residualization protocol explicitly. Controls are applied inside each</w:t>
+      </w:r>
+      <w:r>
+        <w:t xml:space="preserve"> </w:t>
+      </w:r>
+      <w:r>
+        <w:t xml:space="preserve">cross-validation fold: training-fold medians impute features, training-fold</w:t>
+      </w:r>
+      <w:r>
+        <w:t xml:space="preserve"> </w:t>
+      </w:r>
+      <w:r>
+        <w:t xml:space="preserve">standardization is applied, ordinary least-squares residualization is fitted on</w:t>
+      </w:r>
+      <w:r>
+        <w:t xml:space="preserve"> </w:t>
+      </w:r>
+      <w:r>
+        <w:t xml:space="preserve">the training fold with an intercept, and the held-out fold is transformed using</w:t>
+      </w:r>
+      <w:r>
+        <w:t xml:space="preserve"> </w:t>
+      </w:r>
+      <w:r>
+        <w:t xml:space="preserve">only those training-fold quantities. We decompose the control effect into</w:t>
+      </w:r>
+      <w:r>
+        <w:t xml:space="preserve"> </w:t>
+      </w:r>
+      <w:r>
+        <w:t xml:space="preserve">length-only, severity-only, length-plus-severity, and a shuffled-control</w:t>
+      </w:r>
+      <w:r>
+        <w:t xml:space="preserve"> </w:t>
+      </w:r>
+      <w:r>
+        <w:t xml:space="preserve">sensitivity that preserves covariate marginals while breaking subject-level</w:t>
+      </w:r>
+      <w:r>
+        <w:t xml:space="preserve"> </w:t>
+      </w:r>
+      <w:r>
+        <w:t xml:space="preserve">alignment. We also repeat the identity probe with a nonlinear random-forest</w:t>
+      </w:r>
+      <w:r>
+        <w:t xml:space="preserve"> </w:t>
+      </w:r>
+      <w:r>
+        <w:t xml:space="preserve">classifier after the same fold-internal preprocessing to test whether</w:t>
+      </w:r>
+      <w:r>
+        <w:t xml:space="preserve"> </w:t>
+      </w:r>
+      <w:r>
+        <w:t xml:space="preserve">near-chance controlled identity is specific to linear-probe capacity.</w:t>
+      </w:r>
+    </w:p>
+    <w:p>
+      <w:pPr>
         <w:pStyle w:val="Heading3"/>
       </w:pPr>
       <w:bookmarkStart w:id="38" w:name="rq2-measurement-discrepancy-design"/>
@@ -5692,6 +5867,50 @@
       </w:r>
       <w:r>
         <w:t xml:space="preserve">sample sizes.</w:t>
+      </w:r>
+    </w:p>
+    <w:p>
+      <w:pPr>
+        <w:pStyle w:val="BodyText"/>
+      </w:pPr>
+      <w:r>
+        <w:t xml:space="preserve">Finally, because the approximate invariance thresholds are heuristic screening</w:t>
+      </w:r>
+      <w:r>
+        <w:t xml:space="preserve"> </w:t>
+      </w:r>
+      <w:r>
+        <w:t xml:space="preserve">rules rather than universal psychometric standards, we report a sensitivity</w:t>
+      </w:r>
+      <w:r>
+        <w:t xml:space="preserve"> </w:t>
+      </w:r>
+      <w:r>
+        <w:t xml:space="preserve">grid over loading-difference tolerances 0.15, 0.20, and 0.25, threshold</w:t>
+      </w:r>
+      <w:r>
+        <w:t xml:space="preserve"> </w:t>
+      </w:r>
+      <w:r>
+        <w:t xml:space="preserve">tolerances 0.25, 0.35, and 0.45, and minimum-anchor requirements of 3, 4, and</w:t>
+      </w:r>
+      <w:r>
+        <w:t xml:space="preserve"> </w:t>
+      </w:r>
+      <w:r>
+        <w:t xml:space="preserve">5 items. The sensitivity grid is paired with the bootstrap item-DIF stability</w:t>
+      </w:r>
+      <w:r>
+        <w:t xml:space="preserve"> </w:t>
+      </w:r>
+      <w:r>
+        <w:t xml:space="preserve">summary, so anchor and threshold-shift readings are treated as robust only when</w:t>
+      </w:r>
+      <w:r>
+        <w:t xml:space="preserve"> </w:t>
+      </w:r>
+      <w:r>
+        <w:t xml:space="preserve">they recur across both sources of uncertainty.</w:t>
       </w:r>
     </w:p>
     <w:p>
@@ -6173,7 +6392,7 @@
         <w:t xml:space="preserve"> </w:t>
       </w:r>
       <w:r>
-        <w:t xml:space="preserve">Macro Item MAE and Calibration MAE. Their sum is reported as a compact</w:t>
+        <w:t xml:space="preserve">Macro Item MAE and binned item calibration MAE. Their sum is reported as a compact</w:t>
       </w:r>
       <w:r>
         <w:t xml:space="preserve"> </w:t>
@@ -6415,13 +6634,13 @@
         <w:pStyle w:val="FirstParagraph"/>
       </w:pPr>
       <w:r>
-        <w:t xml:space="preserve">Calibration MAE bins subjects into five equal-frequency predicted-severity</w:t>
-      </w:r>
-      <w:r>
-        <w:t xml:space="preserve"> </w:t>
-      </w:r>
-      <w:r>
-        <w:t xml:space="preserve">bins using predicted total score</w:t>
+        <w:t xml:space="preserve">Binned item calibration MAE bins subjects into five equal-frequency</w:t>
+      </w:r>
+      <w:r>
+        <w:t xml:space="preserve"> </w:t>
+      </w:r>
+      <w:r>
+        <w:t xml:space="preserve">predicted-severity bins using predicted total score</w:t>
       </w:r>
       <w:r>
         <w:t xml:space="preserve"> </w:t>
@@ -6493,19 +6712,13 @@
         </m:nary>
       </m:oMath>
       <w:r>
-        <w:t xml:space="preserve">, then</w:t>
-      </w:r>
-      <w:r>
-        <w:t xml:space="preserve"> </w:t>
-      </w:r>
-      <w:r>
-        <w:t xml:space="preserve">computes the weighted absolute gap between predicted and observed mean total</w:t>
-      </w:r>
-      <w:r>
-        <w:t xml:space="preserve"> </w:t>
-      </w:r>
-      <w:r>
-        <w:t xml:space="preserve">score:</w:t>
+        <w:t xml:space="preserve">, then computes the weighted absolute gap</w:t>
+      </w:r>
+      <w:r>
+        <w:t xml:space="preserve"> </w:t>
+      </w:r>
+      <w:r>
+        <w:t xml:space="preserve">between predicted and observed mean total score:</w:t>
       </w:r>
     </w:p>
     <w:p>
@@ -6878,6 +7091,56 @@
         <w:pStyle w:val="BodyText"/>
       </w:pPr>
       <w:r>
+        <w:t xml:space="preserve">For the reviewer-facing calibration analysis, we add a target-label budget</w:t>
+      </w:r>
+      <w:r>
+        <w:t xml:space="preserve"> </w:t>
+      </w:r>
+      <w:r>
+        <w:t xml:space="preserve">study with repeated subject-level calibration/evaluation splits. Target budgets</w:t>
+      </w:r>
+      <w:r>
+        <w:t xml:space="preserve"> </w:t>
+      </w:r>
+      <w:r>
+        <w:t xml:space="preserve">are varied while the frozen Qwen3+WavLM+OpenFace representation, source data,</w:t>
+      </w:r>
+      <w:r>
+        <w:t xml:space="preserve"> </w:t>
+      </w:r>
+      <w:r>
+        <w:t xml:space="preserve">trainable shared layers, and target evaluation protocol are held fixed. This</w:t>
+      </w:r>
+      <w:r>
+        <w:t xml:space="preserve"> </w:t>
+      </w:r>
+      <w:r>
+        <w:t xml:space="preserve">analysis also reports participant-bootstrap paired deltas for observed-scale</w:t>
+      </w:r>
+      <w:r>
+        <w:t xml:space="preserve"> </w:t>
+      </w:r>
+      <w:r>
+        <w:t xml:space="preserve">reconstruction and calibration metrics, so small architecture differences are</w:t>
+      </w:r>
+      <w:r>
+        <w:t xml:space="preserve"> </w:t>
+      </w:r>
+      <w:r>
+        <w:t xml:space="preserve">treated as uncertainty-bounded evidence rather than seed-level superiority</w:t>
+      </w:r>
+      <w:r>
+        <w:t xml:space="preserve"> </w:t>
+      </w:r>
+      <w:r>
+        <w:t xml:space="preserve">claims.</w:t>
+      </w:r>
+    </w:p>
+    <w:p>
+      <w:pPr>
+        <w:pStyle w:val="BodyText"/>
+      </w:pPr>
+      <w:r>
         <w:t xml:space="preserve">This design makes bounded results interpretable. If a method reduces output</w:t>
       </w:r>
       <w:r>
@@ -6974,25 +7237,19 @@
         <w:t xml:space="preserve"> </w:t>
       </w:r>
       <w:r>
-        <w:t xml:space="preserve">paired tests on the reconstruction-plus-calibration score are used as</w:t>
-      </w:r>
-      <w:r>
-        <w:t xml:space="preserve"> </w:t>
-      </w:r>
-      <w:r>
-        <w:t xml:space="preserve">descriptive stress checks; participant-level or repeated-split uncertainty</w:t>
-      </w:r>
-      <w:r>
-        <w:t xml:space="preserve"> </w:t>
-      </w:r>
-      <w:r>
-        <w:t xml:space="preserve">would be needed before turning small differences into primary superiority</w:t>
-      </w:r>
-      <w:r>
-        <w:t xml:space="preserve"> </w:t>
-      </w:r>
-      <w:r>
-        <w:t xml:space="preserve">evidence.</w:t>
+        <w:t xml:space="preserve">paired tests on the reconstruction-plus-calibration score are treated only as</w:t>
+      </w:r>
+      <w:r>
+        <w:t xml:space="preserve"> </w:t>
+      </w:r>
+      <w:r>
+        <w:t xml:space="preserve">descriptive stress checks; the repeated-split and participant-bootstrap budget</w:t>
+      </w:r>
+      <w:r>
+        <w:t xml:space="preserve"> </w:t>
+      </w:r>
+      <w:r>
+        <w:t xml:space="preserve">study is the primary uncertainty evidence for calibrated architecture claims.</w:t>
       </w:r>
     </w:p>
     <w:p>
@@ -7134,7 +7391,7 @@
               <w:jc w:val="left"/>
             </w:pPr>
             <w:r>
-              <w:t xml:space="preserve">Raw corpus-identity probes are strong screens, but residual identity is contrast-dependent. E-DAIC/CMDC drops near chance after length and severity controls, while DAIC-lineage identity remains high.</w:t>
+              <w:t xml:space="preserve">Raw corpus-identity probes are strong screens, but residual identity is control- and probe-dependent. In E-DAIC/CMDC, aligned length/acquisition controls explain the linear-probe signal, while nonlinear Qwen text probing still recovers identity.</w:t>
             </w:r>
           </w:p>
         </w:tc>
@@ -7204,7 +7461,7 @@
               <w:jc w:val="left"/>
             </w:pPr>
             <w:r>
-              <w:t xml:space="preserve">Qwen3 and lightweight multimodal stress tests show that stronger features do not erase target-mapping needs; fair calibrated ablations show that the large gain over a frozen-head comparator is largely target-supervised adaptation, while the measurement-aware ordinal pathway is competitive but not uniformly best.</w:t>
+              <w:t xml:space="preserve">Qwen3 and lightweight multimodal stress tests show that stronger features do not erase target-mapping needs; fair calibrated ablations and repeated target-budget splits show that the frozen-head gain is largely a calibration-regime effect, while target-only direct calibration is the strongest Macro Item MAE competitor.</w:t>
             </w:r>
           </w:p>
         </w:tc>
@@ -7215,7 +7472,7 @@
               <w:jc w:val="left"/>
             </w:pPr>
             <w:r>
-              <w:t xml:space="preserve">Stronger encoders and feature-alignment baselines should be paired with explicit target contracts, calibrated adaptation baselines, and calibration-aware evaluation before assigning gains to measurement modeling.</w:t>
+              <w:t xml:space="preserve">Stronger encoders and feature-alignment baselines should be paired with explicit target contracts, target-only and source-plus-target calibrated baselines, and calibration-aware evaluation before assigning gains to measurement modeling.</w:t>
             </w:r>
           </w:p>
         </w:tc>
@@ -7298,43 +7555,123 @@
         <w:pStyle w:val="BodyText"/>
       </w:pPr>
       <w:r>
-        <w:t xml:space="preserve">Figure 3 shows what happens after fold-internal length and severity</w:t>
-      </w:r>
-      <w:r>
-        <w:t xml:space="preserve"> </w:t>
-      </w:r>
-      <w:r>
-        <w:t xml:space="preserve">residualization. The cross-language E-DAIC/CMDC contrast drops from raw</w:t>
-      </w:r>
-      <w:r>
-        <w:t xml:space="preserve"> </w:t>
-      </w:r>
-      <w:r>
-        <w:t xml:space="preserve">near-perfect identity to chance-level balanced accuracy in Qwen3 text (0.497),</w:t>
-      </w:r>
-      <w:r>
-        <w:t xml:space="preserve"> </w:t>
-      </w:r>
-      <w:r>
-        <w:t xml:space="preserve">WavLM audio (0.484), and OpenFace video (0.522). After controlling for length</w:t>
-      </w:r>
-      <w:r>
-        <w:t xml:space="preserve"> </w:t>
-      </w:r>
-      <w:r>
-        <w:t xml:space="preserve">and severity, the E-DAIC/CMDC identity signal approaches chance, indicating</w:t>
-      </w:r>
-      <w:r>
-        <w:t xml:space="preserve"> </w:t>
-      </w:r>
-      <w:r>
-        <w:t xml:space="preserve">that the raw near-perfect probe was strongly coupled to these corpus-linked</w:t>
-      </w:r>
-      <w:r>
-        <w:t xml:space="preserve"> </w:t>
-      </w:r>
-      <w:r>
-        <w:t xml:space="preserve">factors rather than reflecting a stable residual corpus signature.</w:t>
+        <w:t xml:space="preserve">Figure 3 shows the original fold-internal linear-probe result after length and</w:t>
+      </w:r>
+      <w:r>
+        <w:t xml:space="preserve"> </w:t>
+      </w:r>
+      <w:r>
+        <w:t xml:space="preserve">severity residualization. The cross-language E-DAIC/CMDC contrast drops from</w:t>
+      </w:r>
+      <w:r>
+        <w:t xml:space="preserve"> </w:t>
+      </w:r>
+      <w:r>
+        <w:t xml:space="preserve">raw near-perfect identity to chance-level balanced accuracy in Qwen3 text</w:t>
+      </w:r>
+      <w:r>
+        <w:t xml:space="preserve"> </w:t>
+      </w:r>
+      <w:r>
+        <w:t xml:space="preserve">(0.497), WavLM audio (0.484), and OpenFace video (0.522). MV30 decomposes this</w:t>
+      </w:r>
+      <w:r>
+        <w:t xml:space="preserve"> </w:t>
+      </w:r>
+      <w:r>
+        <w:t xml:space="preserve">drop: severity-only control leaves the linear identity probe near 1.000, while</w:t>
+      </w:r>
+      <w:r>
+        <w:t xml:space="preserve"> </w:t>
+      </w:r>
+      <w:r>
+        <w:t xml:space="preserve">length-only control already reduces it to 0.495 in Qwen3 text, 0.481 in WavLM</w:t>
+      </w:r>
+      <w:r>
+        <w:t xml:space="preserve"> </w:t>
+      </w:r>
+      <w:r>
+        <w:t xml:space="preserve">audio, and 0.508 in OpenFace. Shuffling the length-plus-severity controls</w:t>
+      </w:r>
+      <w:r>
+        <w:t xml:space="preserve"> </w:t>
+      </w:r>
+      <w:r>
+        <w:t xml:space="preserve">returns the linear probe to near-perfect identity, showing that the reduction</w:t>
+      </w:r>
+      <w:r>
+        <w:t xml:space="preserve"> </w:t>
+      </w:r>
+      <w:r>
+        <w:t xml:space="preserve">depends on subject-aligned corpus-linked length/acquisition structure rather</w:t>
+      </w:r>
+      <w:r>
+        <w:t xml:space="preserve"> </w:t>
+      </w:r>
+      <w:r>
+        <w:t xml:space="preserve">than residualization mechanically erasing any signal.</w:t>
+      </w:r>
+    </w:p>
+    <w:p>
+      <w:pPr>
+        <w:pStyle w:val="BodyText"/>
+      </w:pPr>
+      <w:r>
+        <w:t xml:space="preserve">The same sensitivity also exposes a real caveat. With a nonlinear random-forest</w:t>
+      </w:r>
+      <w:r>
+        <w:t xml:space="preserve"> </w:t>
+      </w:r>
+      <w:r>
+        <w:t xml:space="preserve">probe after the same preprocessing, controlled identity remains high for Qwen3</w:t>
+      </w:r>
+      <w:r>
+        <w:t xml:space="preserve"> </w:t>
+      </w:r>
+      <w:r>
+        <w:t xml:space="preserve">text (0.987) and modest for WavLM audio (0.614), while OpenFace remains near</w:t>
+      </w:r>
+      <w:r>
+        <w:t xml:space="preserve"> </w:t>
+      </w:r>
+      <w:r>
+        <w:t xml:space="preserve">chance (0.504). Thus the correct RQ1 conclusion is not that E-DAIC/CMDC has no</w:t>
+      </w:r>
+      <w:r>
+        <w:t xml:space="preserve"> </w:t>
+      </w:r>
+      <w:r>
+        <w:t xml:space="preserve">residual corpus signature. It is that raw identity is strongly coupled to</w:t>
+      </w:r>
+      <w:r>
+        <w:t xml:space="preserve"> </w:t>
+      </w:r>
+      <w:r>
+        <w:t xml:space="preserve">length/acquisition structure under a linear probe, but higher-capacity probes</w:t>
+      </w:r>
+      <w:r>
+        <w:t xml:space="preserve"> </w:t>
+      </w:r>
+      <w:r>
+        <w:t xml:space="preserve">can still recover residual corpus information from some foundation feature</w:t>
+      </w:r>
+      <w:r>
+        <w:t xml:space="preserve"> </w:t>
+      </w:r>
+      <w:r>
+        <w:t xml:space="preserve">views. This is exactly why representation auditing is useful but insufficient:</w:t>
+      </w:r>
+      <w:r>
+        <w:t xml:space="preserve"> </w:t>
+      </w:r>
+      <w:r>
+        <w:t xml:space="preserve">the target-validity question cannot be settled by a single corpus-identity</w:t>
+      </w:r>
+      <w:r>
+        <w:t xml:space="preserve"> </w:t>
+      </w:r>
+      <w:r>
+        <w:t xml:space="preserve">number.</w:t>
       </w:r>
     </w:p>
     <w:p>
@@ -7346,7 +7683,7 @@
           <wp:inline>
             <wp:extent cx="5334000" cy="2439294"/>
             <wp:effectExtent b="0" l="0" r="0" t="0"/>
-            <wp:docPr descr="Figure 3. Control-dependent corpus identity. Points report balanced accuracy before and after fold-internal length plus severity residualization. E-DAIC/CMDC drops near chance after controls, while DAIC-lineage identity remains high, showing why raw corpus identity is a useful screen but not the final RQ1 evidence." title="" id="1" name="Picture"/>
+            <wp:docPr descr="Figure 3. Control-dependent corpus identity under the linear probe. Points report balanced accuracy before and after fold-internal length plus severity residualization. E-DAIC/CMDC drops near chance under the linear probe, while DAIC-lineage identity remains high; nonlinear sensitivity is reported separately." title="" id="1" name="Picture"/>
             <a:graphic>
               <a:graphicData uri="http://schemas.openxmlformats.org/drawingml/2006/picture">
                 <pic:pic>
@@ -7389,7 +7726,7 @@
         <w:pStyle w:val="ImageCaption"/>
       </w:pPr>
       <w:r>
-        <w:t xml:space="preserve">Figure 3. Control-dependent corpus identity. Points report balanced accuracy before and after fold-internal length plus severity residualization. E-DAIC/CMDC drops near chance after controls, while DAIC-lineage identity remains high, showing why raw corpus identity is a useful screen but not the final RQ1 evidence.</w:t>
+        <w:t xml:space="preserve">Figure 3. Control-dependent corpus identity under the linear probe. Points report balanced accuracy before and after fold-internal length plus severity residualization. E-DAIC/CMDC drops near chance under the linear probe, while DAIC-lineage identity remains high; nonlinear sensitivity is reported separately.</w:t>
       </w:r>
     </w:p>
     <w:p>
@@ -7415,37 +7752,37 @@
         <w:t xml:space="preserve"> </w:t>
       </w:r>
       <w:r>
-        <w:t xml:space="preserve">controls, with balanced accuracy 0.839 for Qwen3 text and 0.897 for WavLM</w:t>
-      </w:r>
-      <w:r>
-        <w:t xml:space="preserve"> </w:t>
-      </w:r>
-      <w:r>
-        <w:t xml:space="preserve">audio. A Chinese same-scale control, CMDC versus PDCH HAMD, is more modest but</w:t>
-      </w:r>
-      <w:r>
-        <w:t xml:space="preserve"> </w:t>
-      </w:r>
-      <w:r>
-        <w:t xml:space="preserve">still above chance in the Qwen3 text view (0.572). Thus, residual corpus</w:t>
-      </w:r>
-      <w:r>
-        <w:t xml:space="preserve"> </w:t>
-      </w:r>
-      <w:r>
-        <w:t xml:space="preserve">identity is not uniform: it weakens sharply for the main E-DAIC/CMDC contrast,</w:t>
-      </w:r>
-      <w:r>
-        <w:t xml:space="preserve"> </w:t>
-      </w:r>
-      <w:r>
-        <w:t xml:space="preserve">but persists in some lineage and clinical-setting contrasts after length and</w:t>
-      </w:r>
-      <w:r>
-        <w:t xml:space="preserve"> </w:t>
-      </w:r>
-      <w:r>
-        <w:t xml:space="preserve">severity shortcuts are removed.</w:t>
+        <w:t xml:space="preserve">linear controls, with balanced accuracy 0.839 for Qwen3 text and 0.897 for</w:t>
+      </w:r>
+      <w:r>
+        <w:t xml:space="preserve"> </w:t>
+      </w:r>
+      <w:r>
+        <w:t xml:space="preserve">WavLM audio. A Chinese same-scale control, CMDC versus PDCH HAMD, is more</w:t>
+      </w:r>
+      <w:r>
+        <w:t xml:space="preserve"> </w:t>
+      </w:r>
+      <w:r>
+        <w:t xml:space="preserve">modest but still above chance in the Qwen3 text view (0.572). Thus, residual</w:t>
+      </w:r>
+      <w:r>
+        <w:t xml:space="preserve"> </w:t>
+      </w:r>
+      <w:r>
+        <w:t xml:space="preserve">corpus identity is not uniform: it depends on contrast, controls, modality, and</w:t>
+      </w:r>
+      <w:r>
+        <w:t xml:space="preserve"> </w:t>
+      </w:r>
+      <w:r>
+        <w:t xml:space="preserve">probe capacity, and it can persist in lineage or clinical-setting contrasts</w:t>
+      </w:r>
+      <w:r>
+        <w:t xml:space="preserve"> </w:t>
+      </w:r>
+      <w:r>
+        <w:t xml:space="preserve">after length and severity shortcuts are removed.</w:t>
       </w:r>
     </w:p>
     <w:p>
@@ -7886,6 +8223,68 @@
         <w:pStyle w:val="BodyText"/>
       </w:pPr>
       <w:r>
+        <w:t xml:space="preserve">The sensitivity grid makes this claim boundary clearer. Across loading</w:t>
+      </w:r>
+      <w:r>
+        <w:t xml:space="preserve"> </w:t>
+      </w:r>
+      <w:r>
+        <w:t xml:space="preserve">tolerances of 0.15–0.25, threshold tolerances of 0.25–0.45, and</w:t>
+      </w:r>
+      <w:r>
+        <w:t xml:space="preserve"> </w:t>
+      </w:r>
+      <w:r>
+        <w:t xml:space="preserve">minimum-anchor requirements of 3–5 items, the default C01/C04/C05/C07 anchor</w:t>
+      </w:r>
+      <w:r>
+        <w:t xml:space="preserve"> </w:t>
+      </w:r>
+      <w:r>
+        <w:t xml:space="preserve">set is exactly recovered in only one third of grid rows and retained in two</w:t>
+      </w:r>
+      <w:r>
+        <w:t xml:space="preserve"> </w:t>
+      </w:r>
+      <w:r>
+        <w:t xml:space="preserve">thirds. By contrast, C02 and C06 remain threshold-free in every grid row.</w:t>
+      </w:r>
+      <w:r>
+        <w:t xml:space="preserve"> </w:t>
+      </w:r>
+      <w:r>
+        <w:t xml:space="preserve">Combining this grid with bootstrap DIF stability yields four stable anchor</w:t>
+      </w:r>
+      <w:r>
+        <w:t xml:space="preserve"> </w:t>
+      </w:r>
+      <w:r>
+        <w:t xml:space="preserve">items with strict-threshold caveats (C01, C04, C05, C07) and two stable</w:t>
+      </w:r>
+      <w:r>
+        <w:t xml:space="preserve"> </w:t>
+      </w:r>
+      <w:r>
+        <w:t xml:space="preserve">threshold-shift signals (C02, C06). This strengthens the audit as a bounded</w:t>
+      </w:r>
+      <w:r>
+        <w:t xml:space="preserve"> </w:t>
+      </w:r>
+      <w:r>
+        <w:t xml:space="preserve">target-contract result while preserving the finite-sample caution, especially</w:t>
+      </w:r>
+      <w:r>
+        <w:t xml:space="preserve"> </w:t>
+      </w:r>
+      <w:r>
+        <w:t xml:space="preserve">for sparse response categories.</w:t>
+      </w:r>
+    </w:p>
+    <w:p>
+      <w:pPr>
+        <w:pStyle w:val="BodyText"/>
+      </w:pPr>
+      <w:r>
         <w:rPr>
           <w:b/>
         </w:rPr>
@@ -8117,7 +8516,7 @@
         <w:t xml:space="preserve"> </w:t>
       </w:r>
       <w:r>
-        <w:t xml:space="preserve">Calibration MAE; Total MAE is shown as a severity-scale summary. The</w:t>
+        <w:t xml:space="preserve">binned item calibration MAE; Total MAE is shown as a severity-scale summary. The</w:t>
       </w:r>
       <w:r>
         <w:t xml:space="preserve"> </w:t>
@@ -8176,7 +8575,7 @@
         <w:rPr>
           <w:b/>
         </w:rPr>
-        <w:t xml:space="preserve">same-budget target-calibrated comparison; significance is discussed only within</w:t>
+        <w:t xml:space="preserve">same-budget source-plus-target calibrated comparison. Repeated-split</w:t>
       </w:r>
       <w:r>
         <w:rPr>
@@ -8188,7 +8587,7 @@
         <w:rPr>
           <w:b/>
         </w:rPr>
-        <w:t xml:space="preserve">target-calibrated rows.</w:t>
+        <w:t xml:space="preserve">target-only calibration audits are reported immediately after the table.</w:t>
       </w:r>
     </w:p>
     <w:p>
@@ -8301,7 +8700,7 @@
               <w:jc w:val="right"/>
             </w:pPr>
             <w:r>
-              <w:t xml:space="preserve">Calibration MAE ↓</w:t>
+              <w:t xml:space="preserve">Binned Item Calib. MAE ↓</w:t>
             </w:r>
           </w:p>
         </w:tc>
@@ -9380,7 +9779,7 @@
               <w:jc w:val="right"/>
             </w:pPr>
             <w:r>
-              <w:t xml:space="preserve">Calibration MAE ↓</w:t>
+              <w:t xml:space="preserve">Binned Item Calib. MAE ↓</w:t>
             </w:r>
           </w:p>
         </w:tc>
@@ -10378,7 +10777,13 @@
         <w:t xml:space="preserve"> </w:t>
       </w:r>
       <w:r>
-        <w:t xml:space="preserve">without target clinical labels. Within the calibrated block, the old</w:t>
+        <w:t xml:space="preserve">without target clinical labels. Within the source-plus-target calibrated block,</w:t>
+      </w:r>
+      <w:r>
+        <w:t xml:space="preserve"> </w:t>
+      </w:r>
+      <w:r>
+        <w:t xml:space="preserve">the old</w:t>
       </w:r>
       <w:r>
         <w:t xml:space="preserve"> </w:t>
@@ -10405,7 +10810,7 @@
         <w:t xml:space="preserve"> </w:t>
       </w:r>
       <w:r>
-        <w:t xml:space="preserve">identify the value of target calibration and shared-layer adaptation, not the</w:t>
+        <w:t xml:space="preserve">identify a target-calibration and shared-layer adaptation effect, not the</w:t>
       </w:r>
       <w:r>
         <w:t xml:space="preserve"> </w:t>
@@ -10419,13 +10824,19 @@
         <w:pStyle w:val="BodyText"/>
       </w:pPr>
       <w:r>
-        <w:t xml:space="preserve">The fair calibrated ablations give the claim boundary. The strongest result is</w:t>
-      </w:r>
-      <w:r>
-        <w:t xml:space="preserve"> </w:t>
-      </w:r>
-      <w:r>
-        <w:t xml:space="preserve">target calibration with shared-layer adaptation. In both directions, the frozen</w:t>
+        <w:t xml:space="preserve">MV28 adds the missing target-only and repeated-split comparison. At the MV24</w:t>
+      </w:r>
+      <w:r>
+        <w:t xml:space="preserve"> </w:t>
+      </w:r>
+      <w:r>
+        <w:t xml:space="preserve">default budgets, the target-only direct MLP has the lowest Macro Item MAE in</w:t>
+      </w:r>
+      <w:r>
+        <w:t xml:space="preserve"> </w:t>
+      </w:r>
+      <w:r>
+        <w:t xml:space="preserve">both directions:</w:t>
       </w:r>
       <w:r>
         <w:t xml:space="preserve"> </w:t>
@@ -10434,25 +10845,13 @@
         <w:rPr>
           <w:rStyle w:val="VerbatimChar"/>
         </w:rPr>
-        <w:t xml:space="preserve">Corpus-specific head</w:t>
-      </w:r>
-      <w:r>
-        <w:t xml:space="preserve"> </w:t>
-      </w:r>
-      <w:r>
-        <w:t xml:space="preserve">baseline is much worse than calibrated variants that</w:t>
-      </w:r>
-      <w:r>
-        <w:t xml:space="preserve"> </w:t>
-      </w:r>
-      <w:r>
-        <w:t xml:space="preserve">allow target labels to update the projector and shared symptom layer. Thus the</w:t>
-      </w:r>
-      <w:r>
-        <w:t xml:space="preserve"> </w:t>
-      </w:r>
-      <w:r>
-        <w:t xml:space="preserve">large original changes, from</w:t>
+        <w:t xml:space="preserve">0.840</w:t>
+      </w:r>
+      <w:r>
+        <w:t xml:space="preserve"> </w:t>
+      </w:r>
+      <w:r>
+        <w:t xml:space="preserve">for CMDC-to-E-DAIC at</w:t>
       </w:r>
       <w:r>
         <w:t xml:space="preserve"> </w:t>
@@ -10461,13 +10860,10 @@
         <w:rPr>
           <w:rStyle w:val="VerbatimChar"/>
         </w:rPr>
-        <w:t xml:space="preserve">0.967</w:t>
-      </w:r>
-      <w:r>
-        <w:t xml:space="preserve"> </w:t>
-      </w:r>
-      <w:r>
-        <w:t xml:space="preserve">to</w:t>
+        <w:t xml:space="preserve">k=66</w:t>
+      </w:r>
+      <w:r>
+        <w:t xml:space="preserve">, compared with</w:t>
       </w:r>
       <w:r>
         <w:t xml:space="preserve"> </w:t>
@@ -10476,34 +10872,13 @@
         <w:rPr>
           <w:rStyle w:val="VerbatimChar"/>
         </w:rPr>
-        <w:t xml:space="preserve">0.818</w:t>
-      </w:r>
-      <w:r>
-        <w:t xml:space="preserve"> </w:t>
-      </w:r>
-      <w:r>
-        <w:t xml:space="preserve">Item MAE in CMDC-to-E-DAIC and</w:t>
-      </w:r>
-      <w:r>
-        <w:t xml:space="preserve"> </w:t>
-      </w:r>
-      <w:r>
-        <w:t xml:space="preserve">from</w:t>
-      </w:r>
-      <w:r>
-        <w:t xml:space="preserve"> </w:t>
-      </w:r>
-      <w:r>
-        <w:rPr>
-          <w:rStyle w:val="VerbatimChar"/>
-        </w:rPr>
-        <w:t xml:space="preserve">1.346</w:t>
-      </w:r>
-      <w:r>
-        <w:t xml:space="preserve"> </w:t>
-      </w:r>
-      <w:r>
-        <w:t xml:space="preserve">to</w:t>
+        <w:t xml:space="preserve">0.873</w:t>
+      </w:r>
+      <w:r>
+        <w:t xml:space="preserve"> </w:t>
+      </w:r>
+      <w:r>
+        <w:t xml:space="preserve">for Measurement-aware, and</w:t>
       </w:r>
       <w:r>
         <w:t xml:space="preserve"> </w:t>
@@ -10518,45 +10893,19 @@
         <w:t xml:space="preserve"> </w:t>
       </w:r>
       <w:r>
-        <w:t xml:space="preserve">in E-DAIC-to-CMDC, should be read mainly as evidence</w:t>
-      </w:r>
-      <w:r>
-        <w:t xml:space="preserve"> </w:t>
-      </w:r>
-      <w:r>
-        <w:t xml:space="preserve">for target-supervised shared-layer adaptation rather than as proof of a</w:t>
-      </w:r>
-      <w:r>
-        <w:t xml:space="preserve"> </w:t>
-      </w:r>
-      <w:r>
-        <w:t xml:space="preserve">corpus-specific measurement head.</w:t>
-      </w:r>
-    </w:p>
-    <w:p>
-      <w:pPr>
-        <w:pStyle w:val="BodyText"/>
-      </w:pPr>
-      <w:r>
-        <w:t xml:space="preserve">The second result is narrower. In CMDC-to-E-DAIC, the core measurement-aware</w:t>
-      </w:r>
-      <w:r>
-        <w:t xml:space="preserve"> </w:t>
-      </w:r>
-      <w:r>
-        <w:t xml:space="preserve">model improves over direct target fine-tuning (</w:t>
+        <w:t xml:space="preserve">for E-DAIC-to-CMDC at</w:t>
+      </w:r>
+      <w:r>
+        <w:t xml:space="preserve"> </w:t>
       </w:r>
       <w:r>
         <w:rPr>
           <w:rStyle w:val="VerbatimChar"/>
         </w:rPr>
-        <w:t xml:space="preserve">0.851/0.482</w:t>
-      </w:r>
-      <w:r>
-        <w:t xml:space="preserve"> </w:t>
-      </w:r>
-      <w:r>
-        <w:t xml:space="preserve">to</w:t>
+        <w:t xml:space="preserve">k=24</w:t>
+      </w:r>
+      <w:r>
+        <w:t xml:space="preserve">, compared with</w:t>
       </w:r>
       <w:r>
         <w:t xml:space="preserve"> </w:t>
@@ -10565,31 +10914,40 @@
         <w:rPr>
           <w:rStyle w:val="VerbatimChar"/>
         </w:rPr>
-        <w:t xml:space="preserve">0.818/0.433</w:t>
-      </w:r>
-      <w:r>
-        <w:t xml:space="preserve"> </w:t>
-      </w:r>
-      <w:r>
-        <w:t xml:space="preserve">for Item MAE/Calibration MAE) and over the generic target MLP head</w:t>
-      </w:r>
-      <w:r>
-        <w:t xml:space="preserve"> </w:t>
-      </w:r>
-      <w:r>
-        <w:t xml:space="preserve">(</w:t>
+        <w:t xml:space="preserve">0.674</w:t>
+      </w:r>
+      <w:r>
+        <w:t xml:space="preserve"> </w:t>
+      </w:r>
+      <w:r>
+        <w:t xml:space="preserve">for Measurement-aware. Extending the audit to</w:t>
+      </w:r>
+      <w:r>
+        <w:t xml:space="preserve"> </w:t>
       </w:r>
       <w:r>
         <w:rPr>
           <w:rStyle w:val="VerbatimChar"/>
         </w:rPr>
-        <w:t xml:space="preserve">0.884/0.455</w:t>
-      </w:r>
-      <w:r>
-        <w:t xml:space="preserve"> </w:t>
-      </w:r>
-      <w:r>
-        <w:t xml:space="preserve">to</w:t>
+        <w:t xml:space="preserve">k=4,8,12,16,24</w:t>
+      </w:r>
+      <w:r>
+        <w:t xml:space="preserve"> </w:t>
+      </w:r>
+      <w:r>
+        <w:t xml:space="preserve">target-label budgets gives the same primary reconstruction result: target-only</w:t>
+      </w:r>
+      <w:r>
+        <w:t xml:space="preserve"> </w:t>
+      </w:r>
+      <w:r>
+        <w:t xml:space="preserve">direct calibration is the best Macro Item MAE row in all ten</w:t>
+      </w:r>
+      <w:r>
+        <w:t xml:space="preserve"> </w:t>
+      </w:r>
+      <w:r>
+        <w:t xml:space="preserve">direction-by-budget cells, and source-plus-target calibrated rows beat it in</w:t>
       </w:r>
       <w:r>
         <w:t xml:space="preserve"> </w:t>
@@ -10598,60 +10956,19 @@
         <w:rPr>
           <w:rStyle w:val="VerbatimChar"/>
         </w:rPr>
-        <w:t xml:space="preserve">0.818/0.433</w:t>
-      </w:r>
-      <w:r>
-        <w:t xml:space="preserve">), with paired compact score tests significant</w:t>
-      </w:r>
-      <w:r>
-        <w:t xml:space="preserve"> </w:t>
-      </w:r>
-      <w:r>
-        <w:t xml:space="preserve">at</w:t>
-      </w:r>
-      <w:r>
-        <w:t xml:space="preserve"> </w:t>
-      </w:r>
-      <m:oMath>
-        <m:r>
-          <m:t>p</m:t>
-        </m:r>
-        <m:r>
-          <m:t>&lt;</m:t>
-        </m:r>
-        <m:r>
-          <m:t>.05</m:t>
-        </m:r>
-      </m:oMath>
-      <w:r>
-        <w:t xml:space="preserve"> </w:t>
-      </w:r>
-      <w:r>
-        <w:t xml:space="preserve">for both comparisons. This supports a direction-dependent ordinal</w:t>
-      </w:r>
-      <w:r>
-        <w:t xml:space="preserve"> </w:t>
-      </w:r>
-      <w:r>
-        <w:t xml:space="preserve">inductive-bias reading. It does not support a universal architecture claim:</w:t>
-      </w:r>
-      <w:r>
-        <w:t xml:space="preserve"> </w:t>
-      </w:r>
-      <w:r>
-        <w:t xml:space="preserve">the same advantage is absent in E-DAIC-to-CMDC, where direct target fine-tuning</w:t>
-      </w:r>
-      <w:r>
-        <w:t xml:space="preserve"> </w:t>
-      </w:r>
-      <w:r>
-        <w:t xml:space="preserve">and direct source-plus-target multitask adaptation match or slightly beat the</w:t>
-      </w:r>
-      <w:r>
-        <w:t xml:space="preserve"> </w:t>
-      </w:r>
-      <w:r>
-        <w:t xml:space="preserve">measurement-aware row.</w:t>
+        <w:t xml:space="preserve">0/50</w:t>
+      </w:r>
+      <w:r>
+        <w:t xml:space="preserve"> </w:t>
+      </w:r>
+      <w:r>
+        <w:t xml:space="preserve">method-budget-direction cells. Participant-bootstrap deltas do not</w:t>
+      </w:r>
+      <w:r>
+        <w:t xml:space="preserve"> </w:t>
+      </w:r>
+      <w:r>
+        <w:t xml:space="preserve">produce a Macro Item MAE interval that favors source-plus-target calibration.</w:t>
       </w:r>
     </w:p>
     <w:p>
@@ -10659,13 +10976,78 @@
         <w:pStyle w:val="BodyText"/>
       </w:pPr>
       <w:r>
-        <w:t xml:space="preserve">The direct test of corpus-specific ordinal parameterization is the comparison</w:t>
-      </w:r>
-      <w:r>
-        <w:t xml:space="preserve"> </w:t>
-      </w:r>
-      <w:r>
-        <w:t xml:space="preserve">between</w:t>
+        <w:t xml:space="preserve">This does not mean source labels are useless. The repeated-split calibration</w:t>
+      </w:r>
+      <w:r>
+        <w:t xml:space="preserve"> </w:t>
+      </w:r>
+      <w:r>
+        <w:t xml:space="preserve">metrics show a tradeoff: source-plus-target calibrated rows reduce absolute</w:t>
+      </w:r>
+      <w:r>
+        <w:t xml:space="preserve"> </w:t>
+      </w:r>
+      <w:r>
+        <w:t xml:space="preserve">calibration-in-the-large in</w:t>
+      </w:r>
+      <w:r>
+        <w:t xml:space="preserve"> </w:t>
+      </w:r>
+      <w:r>
+        <w:rPr>
+          <w:rStyle w:val="VerbatimChar"/>
+        </w:rPr>
+        <w:t xml:space="preserve">46/50</w:t>
+      </w:r>
+      <w:r>
+        <w:t xml:space="preserve"> </w:t>
+      </w:r>
+      <w:r>
+        <w:t xml:space="preserve">cells and sometimes reduce binned item</w:t>
+      </w:r>
+      <w:r>
+        <w:t xml:space="preserve"> </w:t>
+      </w:r>
+      <w:r>
+        <w:t xml:space="preserve">calibration error in E-DAIC-to-CMDC, even while target-only direct calibration</w:t>
+      </w:r>
+      <w:r>
+        <w:t xml:space="preserve"> </w:t>
+      </w:r>
+      <w:r>
+        <w:t xml:space="preserve">keeps the best item reconstruction. The prediction-gate conclusion is</w:t>
+      </w:r>
+      <w:r>
+        <w:t xml:space="preserve"> </w:t>
+      </w:r>
+      <w:r>
+        <w:t xml:space="preserve">therefore not that measurement-aware transfer wins a leaderboard, but that</w:t>
+      </w:r>
+      <w:r>
+        <w:t xml:space="preserve"> </w:t>
+      </w:r>
+      <w:r>
+        <w:t xml:space="preserve">calibration regime, reconstruction, and calibration should be reported as</w:t>
+      </w:r>
+      <w:r>
+        <w:t xml:space="preserve"> </w:t>
+      </w:r>
+      <w:r>
+        <w:t xml:space="preserve">separate target-validity quantities.</w:t>
+      </w:r>
+    </w:p>
+    <w:p>
+      <w:pPr>
+        <w:pStyle w:val="BodyText"/>
+      </w:pPr>
+      <w:r>
+        <w:t xml:space="preserve">The direct test of corpus-specific ordinal parameterization remains negative.</w:t>
+      </w:r>
+      <w:r>
+        <w:t xml:space="preserve"> </w:t>
+      </w:r>
+      <w:r>
+        <w:t xml:space="preserve">In the original Table 3 default split,</w:t>
       </w:r>
       <w:r>
         <w:t xml:space="preserve"> </w:t>
@@ -10692,28 +11074,40 @@
         <w:t xml:space="preserve">Measurement-aware</w:t>
       </w:r>
       <w:r>
-        <w:t xml:space="preserve">. That comparison is</w:t>
-      </w:r>
-      <w:r>
-        <w:t xml:space="preserve"> </w:t>
-      </w:r>
-      <w:r>
-        <w:t xml:space="preserve">essentially tied. The compact reconstruction-plus-calibration score is</w:t>
-      </w:r>
-      <w:r>
-        <w:t xml:space="preserve"> </w:t>
+        <w:t xml:space="preserve"> </w:t>
+      </w:r>
+      <w:r>
+        <w:t xml:space="preserve">are essentially tied. MV28 preserves that conclusion under</w:t>
+      </w:r>
+      <w:r>
+        <w:t xml:space="preserve"> </w:t>
+      </w:r>
+      <w:r>
+        <w:t xml:space="preserve">repeated splits: the shared-head minus measurement-aware Macro Item MAE delta</w:t>
+      </w:r>
+      <w:r>
+        <w:t xml:space="preserve"> </w:t>
+      </w:r>
+      <w:r>
+        <w:t xml:space="preserve">is near zero at the MV24 default budgets (</w:t>
       </w:r>
       <w:r>
         <w:rPr>
           <w:rStyle w:val="VerbatimChar"/>
         </w:rPr>
-        <w:t xml:space="preserve">1.252</w:t>
-      </w:r>
-      <w:r>
-        <w:t xml:space="preserve"> </w:t>
-      </w:r>
-      <w:r>
-        <w:t xml:space="preserve">versus</w:t>
+        <w:t xml:space="preserve">0.002</w:t>
+      </w:r>
+      <w:r>
+        <w:t xml:space="preserve"> </w:t>
+      </w:r>
+      <w:r>
+        <w:t xml:space="preserve">in CMDC-to-E-DAIC and</w:t>
+      </w:r>
+      <w:r>
+        <w:t xml:space="preserve"> </w:t>
+      </w:r>
+      <w:r>
+        <w:t xml:space="preserve">approximately</w:t>
       </w:r>
       <w:r>
         <w:t xml:space="preserve"> </w:t>
@@ -10722,13 +11116,19 @@
         <w:rPr>
           <w:rStyle w:val="VerbatimChar"/>
         </w:rPr>
-        <w:t xml:space="preserve">1.251</w:t>
-      </w:r>
-      <w:r>
-        <w:t xml:space="preserve"> </w:t>
-      </w:r>
-      <w:r>
-        <w:t xml:space="preserve">in CMDC-to-E-DAIC and</w:t>
+        <w:t xml:space="preserve">0.000</w:t>
+      </w:r>
+      <w:r>
+        <w:t xml:space="preserve"> </w:t>
+      </w:r>
+      <w:r>
+        <w:t xml:space="preserve">in E-DAIC-to-CMDC), with participant-bootstrap intervals</w:t>
+      </w:r>
+      <w:r>
+        <w:t xml:space="preserve"> </w:t>
+      </w:r>
+      <w:r>
+        <w:t xml:space="preserve">spanning zero. Across the</w:t>
       </w:r>
       <w:r>
         <w:t xml:space="preserve"> </w:t>
@@ -10737,13 +11137,19 @@
         <w:rPr>
           <w:rStyle w:val="VerbatimChar"/>
         </w:rPr>
-        <w:t xml:space="preserve">0.988</w:t>
-      </w:r>
-      <w:r>
-        <w:t xml:space="preserve"> </w:t>
-      </w:r>
-      <w:r>
-        <w:t xml:space="preserve">versus</w:t>
+        <w:t xml:space="preserve">k=4--24</w:t>
+      </w:r>
+      <w:r>
+        <w:t xml:space="preserve"> </w:t>
+      </w:r>
+      <w:r>
+        <w:t xml:space="preserve">budget sweep, the measurement-aware ordinal</w:t>
+      </w:r>
+      <w:r>
+        <w:t xml:space="preserve"> </w:t>
+      </w:r>
+      <w:r>
+        <w:t xml:space="preserve">row beats matched alternatives on mean Macro Item MAE in only</w:t>
       </w:r>
       <w:r>
         <w:t xml:space="preserve"> </w:t>
@@ -10752,31 +11158,51 @@
         <w:rPr>
           <w:rStyle w:val="VerbatimChar"/>
         </w:rPr>
-        <w:t xml:space="preserve">0.987</w:t>
-      </w:r>
-      <w:r>
-        <w:t xml:space="preserve"> </w:t>
-      </w:r>
-      <w:r>
-        <w:t xml:space="preserve">in</w:t>
-      </w:r>
-      <w:r>
-        <w:t xml:space="preserve"> </w:t>
-      </w:r>
-      <w:r>
-        <w:t xml:space="preserve">E-DAIC-to-CMDC. A targeted item analysis reaches the same conclusion. For the</w:t>
-      </w:r>
-      <w:r>
-        <w:t xml:space="preserve"> </w:t>
-      </w:r>
-      <w:r>
-        <w:t xml:space="preserve">measurement-gate C02/C06 threshold-shift set, the shared-head minus</w:t>
-      </w:r>
-      <w:r>
-        <w:t xml:space="preserve"> </w:t>
-      </w:r>
-      <w:r>
-        <w:t xml:space="preserve">measurement-aware delta is only</w:t>
+        <w:t xml:space="preserve">3/50</w:t>
+      </w:r>
+      <w:r>
+        <w:t xml:space="preserve"> </w:t>
+      </w:r>
+      <w:r>
+        <w:t xml:space="preserve">cells,</w:t>
+      </w:r>
+      <w:r>
+        <w:t xml:space="preserve"> </w:t>
+      </w:r>
+      <w:r>
+        <w:t xml:space="preserve">and no participant-bootstrap interval supports a uniform measurement-aware</w:t>
+      </w:r>
+      <w:r>
+        <w:t xml:space="preserve"> </w:t>
+      </w:r>
+      <w:r>
+        <w:t xml:space="preserve">advantage. Thus the corpus-specific ordinal head is a tested framework</w:t>
+      </w:r>
+      <w:r>
+        <w:t xml:space="preserve"> </w:t>
+      </w:r>
+      <w:r>
+        <w:t xml:space="preserve">component, not an independently supported source of overall improvement.</w:t>
+      </w:r>
+    </w:p>
+    <w:p>
+      <w:pPr>
+        <w:pStyle w:val="BodyText"/>
+      </w:pPr>
+      <w:r>
+        <w:t xml:space="preserve">A targeted item analysis reaches the same conclusion. For the measurement-gate</w:t>
+      </w:r>
+      <w:r>
+        <w:t xml:space="preserve"> </w:t>
+      </w:r>
+      <w:r>
+        <w:t xml:space="preserve">C02/C06 threshold-shift set, the shared-head minus measurement-aware delta is</w:t>
+      </w:r>
+      <w:r>
+        <w:t xml:space="preserve"> </w:t>
+      </w:r>
+      <w:r>
+        <w:t xml:space="preserve">only</w:t>
       </w:r>
       <w:r>
         <w:t xml:space="preserve"> </w:t>
@@ -10806,69 +11232,49 @@
         <w:t xml:space="preserve"> </w:t>
       </w:r>
       <w:r>
-        <w:t xml:space="preserve">MAE</w:t>
-      </w:r>
-      <w:r>
-        <w:t xml:space="preserve"> </w:t>
-      </w:r>
-      <w:r>
-        <w:t xml:space="preserve">in E-DAIC-to-CMDC, with confidence intervals spanning zero in both directions.</w:t>
-      </w:r>
-      <w:r>
-        <w:t xml:space="preserve"> </w:t>
-      </w:r>
-      <w:r>
-        <w:t xml:space="preserve">The C01/C04/C05/C07 anchor set is also near tied. Thus Table 3 does not prove</w:t>
-      </w:r>
-      <w:r>
-        <w:t xml:space="preserve"> </w:t>
-      </w:r>
-      <w:r>
-        <w:t xml:space="preserve">that corpus-specific measurement parameterization is an independent source of</w:t>
-      </w:r>
-      <w:r>
-        <w:t xml:space="preserve"> </w:t>
-      </w:r>
-      <w:r>
-        <w:t xml:space="preserve">performance improvement.</w:t>
-      </w:r>
-    </w:p>
-    <w:p>
-      <w:pPr>
-        <w:pStyle w:val="BodyText"/>
-      </w:pPr>
-      <w:r>
-        <w:t xml:space="preserve">A fixed-latent companion simulation clarifies what this negative result does</w:t>
-      </w:r>
-      <w:r>
-        <w:t xml:space="preserve"> </w:t>
-      </w:r>
-      <w:r>
-        <w:t xml:space="preserve">and does not mean. When the latent severity coordinate is given directly to the</w:t>
-      </w:r>
-      <w:r>
-        <w:t xml:space="preserve"> </w:t>
-      </w:r>
-      <w:r>
-        <w:t xml:space="preserve">measurement head, a scalar-invariant world shows no benefit from adding</w:t>
-      </w:r>
-      <w:r>
-        <w:t xml:space="preserve"> </w:t>
-      </w:r>
-      <w:r>
-        <w:t xml:space="preserve">corpus-specific ordinal thresholds. Under a planted C02/C06 threshold-DIF</w:t>
-      </w:r>
-      <w:r>
-        <w:t xml:space="preserve"> </w:t>
-      </w:r>
-      <w:r>
-        <w:t xml:space="preserve">world, the C02/C06 item-set delta becomes positive in both transfer directions</w:t>
-      </w:r>
-      <w:r>
-        <w:t xml:space="preserve"> </w:t>
-      </w:r>
-      <w:r>
-        <w:t xml:space="preserve">(</w:t>
+        <w:t xml:space="preserve">MAE in E-DAIC-to-CMDC, with</w:t>
+      </w:r>
+      <w:r>
+        <w:t xml:space="preserve"> </w:t>
+      </w:r>
+      <w:r>
+        <w:t xml:space="preserve">confidence intervals spanning zero in both directions. The C01/C04/C05/C07</w:t>
+      </w:r>
+      <w:r>
+        <w:t xml:space="preserve"> </w:t>
+      </w:r>
+      <w:r>
+        <w:t xml:space="preserve">anchor set is also near tied. A fixed-latent companion simulation clarifies</w:t>
+      </w:r>
+      <w:r>
+        <w:t xml:space="preserve"> </w:t>
+      </w:r>
+      <w:r>
+        <w:t xml:space="preserve">what this negative result does and does not mean. When the latent severity</w:t>
+      </w:r>
+      <w:r>
+        <w:t xml:space="preserve"> </w:t>
+      </w:r>
+      <w:r>
+        <w:t xml:space="preserve">coordinate is given directly to the measurement head, a scalar-invariant world</w:t>
+      </w:r>
+      <w:r>
+        <w:t xml:space="preserve"> </w:t>
+      </w:r>
+      <w:r>
+        <w:t xml:space="preserve">shows no benefit from adding corpus-specific ordinal thresholds. Under a</w:t>
+      </w:r>
+      <w:r>
+        <w:t xml:space="preserve"> </w:t>
+      </w:r>
+      <w:r>
+        <w:t xml:space="preserve">planted C02/C06 threshold-DIF world, the C02/C06 item-set delta becomes</w:t>
+      </w:r>
+      <w:r>
+        <w:t xml:space="preserve"> </w:t>
+      </w:r>
+      <w:r>
+        <w:t xml:space="preserve">positive in both transfer directions (</w:t>
       </w:r>
       <w:r>
         <w:rPr>
@@ -10895,55 +11301,49 @@
         <w:t xml:space="preserve"> </w:t>
       </w:r>
       <w:r>
-        <w:t xml:space="preserve">MAE in favor of the corpus-specific head), while anchor</w:t>
-      </w:r>
-      <w:r>
-        <w:t xml:space="preserve"> </w:t>
-      </w:r>
-      <w:r>
-        <w:t xml:space="preserve">items do not improve. This is weak item-local mechanism consistency, not a</w:t>
-      </w:r>
-      <w:r>
-        <w:t xml:space="preserve"> </w:t>
-      </w:r>
-      <w:r>
-        <w:t xml:space="preserve">large practical gain at the observed calibration budgets. The correct</w:t>
-      </w:r>
-      <w:r>
-        <w:t xml:space="preserve"> </w:t>
-      </w:r>
-      <w:r>
-        <w:t xml:space="preserve">interpretation is therefore: measurement audits can identify where target</w:t>
-      </w:r>
-      <w:r>
-        <w:t xml:space="preserve"> </w:t>
-      </w:r>
-      <w:r>
-        <w:t xml:space="preserve">mechanisms should be checked, but detected heterogeneity does not automatically</w:t>
-      </w:r>
-      <w:r>
-        <w:t xml:space="preserve"> </w:t>
-      </w:r>
-      <w:r>
-        <w:t xml:space="preserve">mean that every corpus needs a fully separate measurement head in the real</w:t>
-      </w:r>
-      <w:r>
-        <w:t xml:space="preserve"> </w:t>
-      </w:r>
-      <w:r>
-        <w:t xml:space="preserve">multimodal transfer setting. Adding MMD changes the compact score only</w:t>
-      </w:r>
-      <w:r>
-        <w:t xml:space="preserve"> </w:t>
-      </w:r>
-      <w:r>
-        <w:t xml:space="preserve">slightly and is treated as an auxiliary variant rather than the definition of</w:t>
-      </w:r>
-      <w:r>
-        <w:t xml:space="preserve"> </w:t>
-      </w:r>
-      <w:r>
-        <w:t xml:space="preserve">the method.</w:t>
+        <w:t xml:space="preserve">MAE in favor of the</w:t>
+      </w:r>
+      <w:r>
+        <w:t xml:space="preserve"> </w:t>
+      </w:r>
+      <w:r>
+        <w:t xml:space="preserve">corpus-specific head), while anchor items do not improve. This is weak</w:t>
+      </w:r>
+      <w:r>
+        <w:t xml:space="preserve"> </w:t>
+      </w:r>
+      <w:r>
+        <w:t xml:space="preserve">item-local mechanism consistency, not a large practical gain at the observed</w:t>
+      </w:r>
+      <w:r>
+        <w:t xml:space="preserve"> </w:t>
+      </w:r>
+      <w:r>
+        <w:t xml:space="preserve">calibration budgets. Measurement audits can identify where target mechanisms</w:t>
+      </w:r>
+      <w:r>
+        <w:t xml:space="preserve"> </w:t>
+      </w:r>
+      <w:r>
+        <w:t xml:space="preserve">should be checked, but detected heterogeneity does not automatically mean that</w:t>
+      </w:r>
+      <w:r>
+        <w:t xml:space="preserve"> </w:t>
+      </w:r>
+      <w:r>
+        <w:t xml:space="preserve">every corpus needs a fully separate measurement head in the real multimodal</w:t>
+      </w:r>
+      <w:r>
+        <w:t xml:space="preserve"> </w:t>
+      </w:r>
+      <w:r>
+        <w:t xml:space="preserve">transfer setting. Adding MMD changes the compact score only slightly and is</w:t>
+      </w:r>
+      <w:r>
+        <w:t xml:space="preserve"> </w:t>
+      </w:r>
+      <w:r>
+        <w:t xml:space="preserve">treated as an auxiliary variant rather than the definition of the method.</w:t>
       </w:r>
     </w:p>
     <w:p>
@@ -10957,37 +11357,49 @@
         <w:t xml:space="preserve"> </w:t>
       </w:r>
       <w:r>
-        <w:t xml:space="preserve">MMD-style alignment lower some transfer errors, and direct calibrated adaptation</w:t>
-      </w:r>
-      <w:r>
-        <w:t xml:space="preserve"> </w:t>
-      </w:r>
-      <w:r>
-        <w:t xml:space="preserve">is a strong competitor once it is allowed to update the same shared layers. This</w:t>
-      </w:r>
-      <w:r>
-        <w:t xml:space="preserve"> </w:t>
-      </w:r>
-      <w:r>
-        <w:t xml:space="preserve">is exactly why target-label exposure and trainable-capacity controls matter:</w:t>
-      </w:r>
-      <w:r>
-        <w:t xml:space="preserve"> </w:t>
-      </w:r>
-      <w:r>
-        <w:t xml:space="preserve">under a strong frozen multimodal foundation representation, clinical target</w:t>
-      </w:r>
-      <w:r>
-        <w:t xml:space="preserve"> </w:t>
-      </w:r>
-      <w:r>
-        <w:t xml:space="preserve">calibration changes the result, but the specific measurement parameterization</w:t>
-      </w:r>
-      <w:r>
-        <w:t xml:space="preserve"> </w:t>
-      </w:r>
-      <w:r>
-        <w:t xml:space="preserve">must earn its contribution against fair calibrated alternatives.</w:t>
+        <w:t xml:space="preserve">MMD-style alignment lower some transfer errors, target-only direct calibration</w:t>
+      </w:r>
+      <w:r>
+        <w:t xml:space="preserve"> </w:t>
+      </w:r>
+      <w:r>
+        <w:t xml:space="preserve">is a strong small-budget reconstruction baseline, and source-plus-target</w:t>
+      </w:r>
+      <w:r>
+        <w:t xml:space="preserve"> </w:t>
+      </w:r>
+      <w:r>
+        <w:t xml:space="preserve">calibrated adaptation can improve calibration-in-the-large even when it does</w:t>
+      </w:r>
+      <w:r>
+        <w:t xml:space="preserve"> </w:t>
+      </w:r>
+      <w:r>
+        <w:t xml:space="preserve">not improve Macro Item MAE. This is exactly why target-label exposure,</w:t>
+      </w:r>
+      <w:r>
+        <w:t xml:space="preserve"> </w:t>
+      </w:r>
+      <w:r>
+        <w:t xml:space="preserve">trainable-capacity controls, and calibration metrics matter: under a strong</w:t>
+      </w:r>
+      <w:r>
+        <w:t xml:space="preserve"> </w:t>
+      </w:r>
+      <w:r>
+        <w:t xml:space="preserve">frozen multimodal foundation representation, clinical target calibration</w:t>
+      </w:r>
+      <w:r>
+        <w:t xml:space="preserve"> </w:t>
+      </w:r>
+      <w:r>
+        <w:t xml:space="preserve">changes the result, but the specific measurement parameterization must earn its</w:t>
+      </w:r>
+      <w:r>
+        <w:t xml:space="preserve"> </w:t>
+      </w:r>
+      <w:r>
+        <w:t xml:space="preserve">contribution against fair calibrated alternatives.</w:t>
       </w:r>
     </w:p>
     <w:p>
@@ -11375,31 +11787,43 @@
         <w:t xml:space="preserve"> </w:t>
       </w:r>
       <w:r>
-        <w:t xml:space="preserve">baseline comes from allowing target calibration labels to update the shared</w:t>
-      </w:r>
-      <w:r>
-        <w:t xml:space="preserve"> </w:t>
-      </w:r>
-      <w:r>
-        <w:t xml:space="preserve">layers. In the formal PHQ shared-item model, corpus-specific cumulative-logit</w:t>
-      </w:r>
-      <w:r>
-        <w:t xml:space="preserve"> </w:t>
-      </w:r>
-      <w:r>
-        <w:t xml:space="preserve">heads remain a principled and competitive way to encode different ordinal</w:t>
-      </w:r>
-      <w:r>
-        <w:t xml:space="preserve"> </w:t>
-      </w:r>
-      <w:r>
-        <w:t xml:space="preserve">response processes, and the fixed-latent simulation shows weak item-local</w:t>
-      </w:r>
-      <w:r>
-        <w:t xml:space="preserve"> </w:t>
-      </w:r>
-      <w:r>
-        <w:t xml:space="preserve">benefit under planted C02/C06 threshold shift. But the real-data</w:t>
+        <w:t xml:space="preserve">baseline comes from the target calibration regime, including the ability of</w:t>
+      </w:r>
+      <w:r>
+        <w:t xml:space="preserve"> </w:t>
+      </w:r>
+      <w:r>
+        <w:t xml:space="preserve">target labels to update trainable layers. But when target-only direct</w:t>
+      </w:r>
+      <w:r>
+        <w:t xml:space="preserve"> </w:t>
+      </w:r>
+      <w:r>
+        <w:t xml:space="preserve">calibration is added at matched budgets, it becomes the strongest Macro Item</w:t>
+      </w:r>
+      <w:r>
+        <w:t xml:space="preserve"> </w:t>
+      </w:r>
+      <w:r>
+        <w:t xml:space="preserve">MAE comparator at both MV24 default budgets and throughout the small-budget</w:t>
+      </w:r>
+      <w:r>
+        <w:t xml:space="preserve"> </w:t>
+      </w:r>
+      <w:r>
+        <w:t xml:space="preserve">sweep. Corpus-specific cumulative-logit heads remain a principled way to encode</w:t>
+      </w:r>
+      <w:r>
+        <w:t xml:space="preserve"> </w:t>
+      </w:r>
+      <w:r>
+        <w:t xml:space="preserve">different ordinal response processes, and the fixed-latent simulation shows</w:t>
+      </w:r>
+      <w:r>
+        <w:t xml:space="preserve"> </w:t>
+      </w:r>
+      <w:r>
+        <w:t xml:space="preserve">weak item-local benefit under planted C02/C06 threshold shift. The real-data</w:t>
       </w:r>
       <w:r>
         <w:t xml:space="preserve"> </w:t>
@@ -11441,7 +11865,13 @@
         <w:t xml:space="preserve"> </w:t>
       </w:r>
       <w:r>
-        <w:t xml:space="preserve">an accidental advantage.</w:t>
+        <w:t xml:space="preserve">an accidental advantage, and target-only calibration must be reported beside</w:t>
+      </w:r>
+      <w:r>
+        <w:t xml:space="preserve"> </w:t>
+      </w:r>
+      <w:r>
+        <w:t xml:space="preserve">source-plus-target calibration.</w:t>
       </w:r>
     </w:p>
     <w:p>
@@ -11647,13 +12077,7 @@
         <w:pStyle w:val="BodyText"/>
       </w:pPr>
       <w:r>
-        <w:t xml:space="preserve">Sixth, the current uncertainty summaries are seed-level and split-level</w:t>
-      </w:r>
-      <w:r>
-        <w:t xml:space="preserve"> </w:t>
-      </w:r>
-      <w:r>
-        <w:t xml:space="preserve">descriptive checks. The paired tests over five seeds are useful for detecting</w:t>
+        <w:t xml:space="preserve">Sixth, the paired tests over the original five seeds are useful for detecting</w:t>
       </w:r>
       <w:r>
         <w:t xml:space="preserve"> </w:t>
@@ -11671,19 +12095,19 @@
         <w:t xml:space="preserve"> </w:t>
       </w:r>
       <w:r>
-        <w:t xml:space="preserve">where the target evaluation set contains 20 subjects. Participant-level or</w:t>
-      </w:r>
-      <w:r>
-        <w:t xml:space="preserve"> </w:t>
-      </w:r>
-      <w:r>
-        <w:t xml:space="preserve">repeated-split uncertainty should be used before making stronger superiority</w:t>
-      </w:r>
-      <w:r>
-        <w:t xml:space="preserve"> </w:t>
-      </w:r>
-      <w:r>
-        <w:t xml:space="preserve">claims from small differences.</w:t>
+        <w:t xml:space="preserve">where the target evaluation set is small. We therefore treat the repeated</w:t>
+      </w:r>
+      <w:r>
+        <w:t xml:space="preserve"> </w:t>
+      </w:r>
+      <w:r>
+        <w:t xml:space="preserve">target-calibration splits and participant-bootstrap deltas as the relevant</w:t>
+      </w:r>
+      <w:r>
+        <w:t xml:space="preserve"> </w:t>
+      </w:r>
+      <w:r>
+        <w:t xml:space="preserve">uncertainty layer for calibrated architecture claims.</w:t>
       </w:r>
     </w:p>
     <w:p>
@@ -11775,25 +12199,25 @@
         <w:t xml:space="preserve"> </w:t>
       </w:r>
       <w:r>
-        <w:t xml:space="preserve">claim boundary. The robust empirical lesson is that target calibration and</w:t>
-      </w:r>
-      <w:r>
-        <w:t xml:space="preserve"> </w:t>
-      </w:r>
-      <w:r>
-        <w:t xml:space="preserve">shared-layer adaptation matter; ordinal measurement modeling can help in a</w:t>
-      </w:r>
-      <w:r>
-        <w:t xml:space="preserve"> </w:t>
-      </w:r>
-      <w:r>
-        <w:t xml:space="preserve">direction-dependent way; and corpus-specific ordinal heads have not yet shown</w:t>
-      </w:r>
-      <w:r>
-        <w:t xml:space="preserve"> </w:t>
-      </w:r>
-      <w:r>
-        <w:t xml:space="preserve">an independent overall advantage over a shared ordinal head in the real</w:t>
+        <w:t xml:space="preserve">claim boundary. The robust empirical lesson is that target-label calibration</w:t>
+      </w:r>
+      <w:r>
+        <w:t xml:space="preserve"> </w:t>
+      </w:r>
+      <w:r>
+        <w:t xml:space="preserve">and adaptation regime matter; target-only direct calibration is a strong and</w:t>
+      </w:r>
+      <w:r>
+        <w:t xml:space="preserve"> </w:t>
+      </w:r>
+      <w:r>
+        <w:t xml:space="preserve">often lower-error baseline; and corpus-specific ordinal heads have not yet</w:t>
+      </w:r>
+      <w:r>
+        <w:t xml:space="preserve"> </w:t>
+      </w:r>
+      <w:r>
+        <w:t xml:space="preserve">shown an independent overall advantage over a shared ordinal head in the real</w:t>
       </w:r>
       <w:r>
         <w:t xml:space="preserve"> </w:t>
@@ -11805,34 +12229,76 @@
         <w:t xml:space="preserve"> </w:t>
       </w:r>
       <w:r>
-        <w:t xml:space="preserve">can still do what they do well, but clinical measurement contracts, target</w:t>
-      </w:r>
-      <w:r>
-        <w:t xml:space="preserve"> </w:t>
-      </w:r>
-      <w:r>
-        <w:t xml:space="preserve">calibration, shared-layer adaptation, and corpus-specific measurement</w:t>
-      </w:r>
-      <w:r>
-        <w:t xml:space="preserve"> </w:t>
-      </w:r>
-      <w:r>
-        <w:t xml:space="preserve">parameterization must be reported separately. This makes cross-corpus</w:t>
-      </w:r>
-      <w:r>
-        <w:t xml:space="preserve"> </w:t>
-      </w:r>
-      <w:r>
-        <w:t xml:space="preserve">depression benchmarks harder to overread, but easier to trust.</w:t>
-      </w:r>
-    </w:p>
-    <w:bookmarkStart w:id="139" w:name="refs"/>
-    <w:bookmarkStart w:id="52" w:name="ref-arjovsky2019irm"/>
+        <w:t xml:space="preserve">can still do what they do well, but clinical measurement contracts,</w:t>
+      </w:r>
+      <w:r>
+        <w:t xml:space="preserve"> </w:t>
+      </w:r>
+      <w:r>
+        <w:t xml:space="preserve">target-only calibration, source-plus-target calibration, shared-layer</w:t>
+      </w:r>
+      <w:r>
+        <w:t xml:space="preserve"> </w:t>
+      </w:r>
+      <w:r>
+        <w:t xml:space="preserve">adaptation, and corpus-specific measurement parameterization must be reported</w:t>
+      </w:r>
+      <w:r>
+        <w:t xml:space="preserve"> </w:t>
+      </w:r>
+      <w:r>
+        <w:t xml:space="preserve">separately. This makes cross-corpus depression benchmarks harder to overread,</w:t>
+      </w:r>
+      <w:r>
+        <w:t xml:space="preserve"> </w:t>
+      </w:r>
+      <w:r>
+        <w:t xml:space="preserve">but easier to trust.</w:t>
+      </w:r>
+    </w:p>
+    <w:bookmarkStart w:id="145" w:name="refs"/>
+    <w:bookmarkStart w:id="52" w:name="ref-alaa2025medicalconstruct"/>
     <w:p>
       <w:pPr>
         <w:pStyle w:val="Bibliography"/>
       </w:pPr>
       <w:r>
+        <w:t xml:space="preserve">Alaa, Ahmed, Thomas Hartvigsen, Niloufar Golchini, Shiladitya Dutta, Frances Dean, Inioluwa Deborah Raji, and Travis Zack. 2025. “Position: Medical Large Language Model Benchmarks Should Prioritize Construct Validity.” In</w:t>
+      </w:r>
+      <w:r>
+        <w:t xml:space="preserve"> </w:t>
+      </w:r>
+      <w:r>
+        <w:rPr>
+          <w:i/>
+        </w:rPr>
+        <w:t xml:space="preserve">Proceedings of the 42nd International Conference on Machine Learning</w:t>
+      </w:r>
+      <w:r>
+        <w:t xml:space="preserve">, 267:80991–81004. Proceedings of Machine Learning Research. PMLR.</w:t>
+      </w:r>
+      <w:r>
+        <w:t xml:space="preserve"> </w:t>
+      </w:r>
+      <w:hyperlink r:id="rId51">
+        <w:r>
+          <w:rPr>
+            <w:rStyle w:val="Hyperlink"/>
+          </w:rPr>
+          <w:t xml:space="preserve">https://proceedings.mlr.press/v267/alaa25a.html</w:t>
+        </w:r>
+      </w:hyperlink>
+      <w:r>
+        <w:t xml:space="preserve">.</w:t>
+      </w:r>
+    </w:p>
+    <w:bookmarkEnd w:id="52"/>
+    <w:bookmarkStart w:id="54" w:name="ref-arjovsky2019irm"/>
+    <w:p>
+      <w:pPr>
+        <w:pStyle w:val="Bibliography"/>
+      </w:pPr>
+      <w:r>
         <w:t xml:space="preserve">Arjovsky, Martin, L</w:t>
       </w:r>
       <w:r>
@@ -11844,7 +12310,7 @@
       <w:r>
         <w:t xml:space="preserve"> </w:t>
       </w:r>
-      <w:hyperlink r:id="rId51">
+      <w:hyperlink r:id="rId53">
         <w:r>
           <w:rPr>
             <w:rStyle w:val="Hyperlink"/>
@@ -11856,8 +12322,8 @@
         <w:t xml:space="preserve">.</w:t>
       </w:r>
     </w:p>
-    <w:bookmarkEnd w:id="52"/>
-    <w:bookmarkStart w:id="54" w:name="ref-baevski2020wav2vec2"/>
+    <w:bookmarkEnd w:id="54"/>
+    <w:bookmarkStart w:id="56" w:name="ref-baevski2020wav2vec2"/>
     <w:p>
       <w:pPr>
         <w:pStyle w:val="Bibliography"/>
@@ -11868,7 +12334,7 @@
       <w:r>
         <w:t xml:space="preserve"> </w:t>
       </w:r>
-      <w:hyperlink r:id="rId53">
+      <w:hyperlink r:id="rId55">
         <w:r>
           <w:rPr>
             <w:rStyle w:val="Hyperlink"/>
@@ -11880,19 +12346,55 @@
         <w:t xml:space="preserve">.</w:t>
       </w:r>
     </w:p>
-    <w:bookmarkEnd w:id="54"/>
-    <w:bookmarkStart w:id="56" w:name="ref-baai2026bgem3"/>
+    <w:bookmarkEnd w:id="56"/>
+    <w:bookmarkStart w:id="58" w:name="ref-bean2025measuring"/>
     <w:p>
       <w:pPr>
         <w:pStyle w:val="Bibliography"/>
       </w:pPr>
       <w:r>
+        <w:t xml:space="preserve">Bean, Andrew M., Ryan Othniel Kearns, Angelika Romanou, Franziska Sofia Hafner, Harry Mayne, Jan Batzner, Negar Foroutan Eghlidi, et al. 2025. “Measuring What Matters: Construct Validity in Large Language Model Benchmarks.” In</w:t>
+      </w:r>
+      <w:r>
+        <w:t xml:space="preserve"> </w:t>
+      </w:r>
+      <w:r>
+        <w:rPr>
+          <w:i/>
+        </w:rPr>
+        <w:t xml:space="preserve">Advances in Neural Information Processing Systems 38</w:t>
+      </w:r>
+      <w:r>
+        <w:t xml:space="preserve">.</w:t>
+      </w:r>
+      <w:r>
+        <w:t xml:space="preserve"> </w:t>
+      </w:r>
+      <w:hyperlink r:id="rId57">
+        <w:r>
+          <w:rPr>
+            <w:rStyle w:val="Hyperlink"/>
+          </w:rPr>
+          <w:t xml:space="preserve">https://doi.org/10.52202/085713-0590</w:t>
+        </w:r>
+      </w:hyperlink>
+      <w:r>
+        <w:t xml:space="preserve">.</w:t>
+      </w:r>
+    </w:p>
+    <w:bookmarkEnd w:id="58"/>
+    <w:bookmarkStart w:id="60" w:name="ref-baai2026bgem3"/>
+    <w:p>
+      <w:pPr>
+        <w:pStyle w:val="Bibliography"/>
+      </w:pPr>
+      <w:r>
         <w:t xml:space="preserve">Beijing Academy of Artificial Intelligence. 2026. “BAAI/bge-m3 Model Card.”</w:t>
       </w:r>
       <w:r>
         <w:t xml:space="preserve"> </w:t>
       </w:r>
-      <w:hyperlink r:id="rId55">
+      <w:hyperlink r:id="rId59">
         <w:r>
           <w:rPr>
             <w:rStyle w:val="Hyperlink"/>
@@ -11904,8 +12406,8 @@
         <w:t xml:space="preserve">.</w:t>
       </w:r>
     </w:p>
-    <w:bookmarkEnd w:id="56"/>
-    <w:bookmarkStart w:id="58" w:name="ref-bulut2017detecting"/>
+    <w:bookmarkEnd w:id="60"/>
+    <w:bookmarkStart w:id="62" w:name="ref-bulut2017detecting"/>
     <w:p>
       <w:pPr>
         <w:pStyle w:val="Bibliography"/>
@@ -11931,7 +12433,7 @@
       <w:r>
         <w:t xml:space="preserve"> </w:t>
       </w:r>
-      <w:hyperlink r:id="rId57">
+      <w:hyperlink r:id="rId61">
         <w:r>
           <w:rPr>
             <w:rStyle w:val="Hyperlink"/>
@@ -11943,8 +12445,8 @@
         <w:t xml:space="preserve">.</w:t>
       </w:r>
     </w:p>
-    <w:bookmarkEnd w:id="58"/>
-    <w:bookmarkStart w:id="60" w:name="ref-burdisso2024daicprompts"/>
+    <w:bookmarkEnd w:id="62"/>
+    <w:bookmarkStart w:id="64" w:name="ref-burdisso2024daicprompts"/>
     <w:p>
       <w:pPr>
         <w:pStyle w:val="Bibliography"/>
@@ -11985,7 +12487,7 @@
       <w:r>
         <w:t xml:space="preserve"> </w:t>
       </w:r>
-      <w:hyperlink r:id="rId59">
+      <w:hyperlink r:id="rId63">
         <w:r>
           <w:rPr>
             <w:rStyle w:val="Hyperlink"/>
@@ -11997,8 +12499,8 @@
         <w:t xml:space="preserve">.</w:t>
       </w:r>
     </w:p>
-    <w:bookmarkEnd w:id="60"/>
-    <w:bookmarkStart w:id="62" w:name="ref-cai2020modma"/>
+    <w:bookmarkEnd w:id="64"/>
+    <w:bookmarkStart w:id="66" w:name="ref-cai2020modma"/>
     <w:p>
       <w:pPr>
         <w:pStyle w:val="Bibliography"/>
@@ -12024,7 +12526,7 @@
       <w:r>
         <w:t xml:space="preserve"> </w:t>
       </w:r>
-      <w:hyperlink r:id="rId61">
+      <w:hyperlink r:id="rId65">
         <w:r>
           <w:rPr>
             <w:rStyle w:val="Hyperlink"/>
@@ -12036,8 +12538,8 @@
         <w:t xml:space="preserve">.</w:t>
       </w:r>
     </w:p>
-    <w:bookmarkEnd w:id="62"/>
-    <w:bookmarkStart w:id="64" w:name="ref-chalmers2012mirt"/>
+    <w:bookmarkEnd w:id="66"/>
+    <w:bookmarkStart w:id="68" w:name="ref-chalmers2012mirt"/>
     <w:p>
       <w:pPr>
         <w:pStyle w:val="Bibliography"/>
@@ -12063,7 +12565,7 @@
       <w:r>
         <w:t xml:space="preserve"> </w:t>
       </w:r>
-      <w:hyperlink r:id="rId63">
+      <w:hyperlink r:id="rId67">
         <w:r>
           <w:rPr>
             <w:rStyle w:val="Hyperlink"/>
@@ -12075,8 +12577,8 @@
         <w:t xml:space="preserve">.</w:t>
       </w:r>
     </w:p>
-    <w:bookmarkEnd w:id="64"/>
-    <w:bookmarkStart w:id="66" w:name="ref-chalmers2026mirtmultiplegroup"/>
+    <w:bookmarkEnd w:id="68"/>
+    <w:bookmarkStart w:id="70" w:name="ref-chalmers2026mirtmultiplegroup"/>
     <w:p>
       <w:pPr>
         <w:pStyle w:val="Bibliography"/>
@@ -12087,7 +12589,7 @@
       <w:r>
         <w:t xml:space="preserve"> </w:t>
       </w:r>
-      <w:hyperlink r:id="rId65">
+      <w:hyperlink r:id="rId69">
         <w:r>
           <w:rPr>
             <w:rStyle w:val="Hyperlink"/>
@@ -12099,8 +12601,8 @@
         <w:t xml:space="preserve">.</w:t>
       </w:r>
     </w:p>
-    <w:bookmarkEnd w:id="66"/>
-    <w:bookmarkStart w:id="68" w:name="ref-chen2025scd"/>
+    <w:bookmarkEnd w:id="70"/>
+    <w:bookmarkStart w:id="72" w:name="ref-chen2025scd"/>
     <w:p>
       <w:pPr>
         <w:pStyle w:val="Bibliography"/>
@@ -12126,7 +12628,7 @@
       <w:r>
         <w:t xml:space="preserve"> </w:t>
       </w:r>
-      <w:hyperlink r:id="rId67">
+      <w:hyperlink r:id="rId71">
         <w:r>
           <w:rPr>
             <w:rStyle w:val="Hyperlink"/>
@@ -12138,8 +12640,8 @@
         <w:t xml:space="preserve">.</w:t>
       </w:r>
     </w:p>
-    <w:bookmarkEnd w:id="68"/>
-    <w:bookmarkStart w:id="70" w:name="ref-chen2022wavlm"/>
+    <w:bookmarkEnd w:id="72"/>
+    <w:bookmarkStart w:id="74" w:name="ref-chen2022wavlm"/>
     <w:p>
       <w:pPr>
         <w:pStyle w:val="Bibliography"/>
@@ -12150,7 +12652,7 @@
       <w:r>
         <w:t xml:space="preserve"> </w:t>
       </w:r>
-      <w:hyperlink r:id="rId69">
+      <w:hyperlink r:id="rId73">
         <w:r>
           <w:rPr>
             <w:rStyle w:val="Hyperlink"/>
@@ -12162,8 +12664,8 @@
         <w:t xml:space="preserve">.</w:t>
       </w:r>
     </w:p>
-    <w:bookmarkEnd w:id="70"/>
-    <w:bookmarkStart w:id="72" w:name="ref-chen2024gnnsda"/>
+    <w:bookmarkEnd w:id="74"/>
+    <w:bookmarkStart w:id="76" w:name="ref-chen2024gnnsda"/>
     <w:p>
       <w:pPr>
         <w:pStyle w:val="Bibliography"/>
@@ -12189,7 +12691,7 @@
       <w:r>
         <w:t xml:space="preserve"> </w:t>
       </w:r>
-      <w:hyperlink r:id="rId71">
+      <w:hyperlink r:id="rId75">
         <w:r>
           <w:rPr>
             <w:rStyle w:val="Hyperlink"/>
@@ -12201,8 +12703,8 @@
         <w:t xml:space="preserve">.</w:t>
       </w:r>
     </w:p>
-    <w:bookmarkEnd w:id="72"/>
-    <w:bookmarkStart w:id="74" w:name="ref-chen2025leavingnone"/>
+    <w:bookmarkEnd w:id="76"/>
+    <w:bookmarkStart w:id="78" w:name="ref-chen2025leavingnone"/>
     <w:p>
       <w:pPr>
         <w:pStyle w:val="Bibliography"/>
@@ -12228,7 +12730,7 @@
       <w:r>
         <w:t xml:space="preserve"> </w:t>
       </w:r>
-      <w:hyperlink r:id="rId73">
+      <w:hyperlink r:id="rId77">
         <w:r>
           <w:rPr>
             <w:rStyle w:val="Hyperlink"/>
@@ -12240,8 +12742,8 @@
         <w:t xml:space="preserve">.</w:t>
       </w:r>
     </w:p>
-    <w:bookmarkEnd w:id="74"/>
-    <w:bookmarkStart w:id="76" w:name="ref-delamain2024measurement"/>
+    <w:bookmarkEnd w:id="78"/>
+    <w:bookmarkStart w:id="80" w:name="ref-delamain2024measurement"/>
     <w:p>
       <w:pPr>
         <w:pStyle w:val="Bibliography"/>
@@ -12267,7 +12769,7 @@
       <w:r>
         <w:t xml:space="preserve"> </w:t>
       </w:r>
-      <w:hyperlink r:id="rId75">
+      <w:hyperlink r:id="rId79">
         <w:r>
           <w:rPr>
             <w:rStyle w:val="Hyperlink"/>
@@ -12279,8 +12781,8 @@
         <w:t xml:space="preserve">.</w:t>
       </w:r>
     </w:p>
-    <w:bookmarkEnd w:id="76"/>
-    <w:bookmarkStart w:id="78" w:name="ref-deduro2026nlppsychometrics"/>
+    <w:bookmarkEnd w:id="80"/>
+    <w:bookmarkStart w:id="82" w:name="ref-deduro2026nlppsychometrics"/>
     <w:p>
       <w:pPr>
         <w:pStyle w:val="Bibliography"/>
@@ -12291,7 +12793,7 @@
       <w:r>
         <w:t xml:space="preserve"> </w:t>
       </w:r>
-      <w:hyperlink r:id="rId77">
+      <w:hyperlink r:id="rId81">
         <w:r>
           <w:rPr>
             <w:rStyle w:val="Hyperlink"/>
@@ -12303,8 +12805,32 @@
         <w:t xml:space="preserve">.</w:t>
       </w:r>
     </w:p>
-    <w:bookmarkEnd w:id="78"/>
-    <w:bookmarkStart w:id="80" w:name="ref-fu2025mpddchallenge"/>
+    <w:bookmarkEnd w:id="82"/>
+    <w:bookmarkStart w:id="84" w:name="ref-freiesleben2025benchmarking"/>
+    <w:p>
+      <w:pPr>
+        <w:pStyle w:val="Bibliography"/>
+      </w:pPr>
+      <w:r>
+        <w:t xml:space="preserve">Freiesleben, Timo, and Sebastian Zezulka. 2025. “The Benchmarking Epistemology: Construct Validity for Evaluating Machine Learning Models.”</w:t>
+      </w:r>
+      <w:r>
+        <w:t xml:space="preserve"> </w:t>
+      </w:r>
+      <w:hyperlink r:id="rId83">
+        <w:r>
+          <w:rPr>
+            <w:rStyle w:val="Hyperlink"/>
+          </w:rPr>
+          <w:t xml:space="preserve">https://doi.org/10.48550/arXiv.2510.23191</w:t>
+        </w:r>
+      </w:hyperlink>
+      <w:r>
+        <w:t xml:space="preserve">.</w:t>
+      </w:r>
+    </w:p>
+    <w:bookmarkEnd w:id="84"/>
+    <w:bookmarkStart w:id="86" w:name="ref-fu2025mpddchallenge"/>
     <w:p>
       <w:pPr>
         <w:pStyle w:val="Bibliography"/>
@@ -12327,7 +12853,7 @@
       <w:r>
         <w:t xml:space="preserve"> </w:t>
       </w:r>
-      <w:hyperlink r:id="rId79">
+      <w:hyperlink r:id="rId85">
         <w:r>
           <w:rPr>
             <w:rStyle w:val="Hyperlink"/>
@@ -12339,8 +12865,8 @@
         <w:t xml:space="preserve">.</w:t>
       </w:r>
     </w:p>
-    <w:bookmarkEnd w:id="80"/>
-    <w:bookmarkStart w:id="82" w:name="ref-fu2026p3hf"/>
+    <w:bookmarkEnd w:id="86"/>
+    <w:bookmarkStart w:id="88" w:name="ref-fu2026p3hf"/>
     <w:p>
       <w:pPr>
         <w:pStyle w:val="Bibliography"/>
@@ -12366,7 +12892,7 @@
       <w:r>
         <w:t xml:space="preserve"> </w:t>
       </w:r>
-      <w:hyperlink r:id="rId81">
+      <w:hyperlink r:id="rId87">
         <w:r>
           <w:rPr>
             <w:rStyle w:val="Hyperlink"/>
@@ -12378,8 +12904,8 @@
         <w:t xml:space="preserve">.</w:t>
       </w:r>
     </w:p>
-    <w:bookmarkEnd w:id="82"/>
-    <w:bookmarkStart w:id="84" w:name="ref-galenkamp2017measurement"/>
+    <w:bookmarkEnd w:id="88"/>
+    <w:bookmarkStart w:id="90" w:name="ref-galenkamp2017measurement"/>
     <w:p>
       <w:pPr>
         <w:pStyle w:val="Bibliography"/>
@@ -12405,7 +12931,7 @@
       <w:r>
         <w:t xml:space="preserve"> </w:t>
       </w:r>
-      <w:hyperlink r:id="rId83">
+      <w:hyperlink r:id="rId89">
         <w:r>
           <w:rPr>
             <w:rStyle w:val="Hyperlink"/>
@@ -12417,8 +12943,8 @@
         <w:t xml:space="preserve">.</w:t>
       </w:r>
     </w:p>
-    <w:bookmarkEnd w:id="84"/>
-    <w:bookmarkStart w:id="86" w:name="ref-ganin2016domain"/>
+    <w:bookmarkEnd w:id="90"/>
+    <w:bookmarkStart w:id="92" w:name="ref-ganin2016domain"/>
     <w:p>
       <w:pPr>
         <w:pStyle w:val="Bibliography"/>
@@ -12450,7 +12976,7 @@
       <w:r>
         <w:t xml:space="preserve"> </w:t>
       </w:r>
-      <w:hyperlink r:id="rId85">
+      <w:hyperlink r:id="rId91">
         <w:r>
           <w:rPr>
             <w:rStyle w:val="Hyperlink"/>
@@ -12462,8 +12988,8 @@
         <w:t xml:space="preserve">.</w:t>
       </w:r>
     </w:p>
-    <w:bookmarkEnd w:id="86"/>
-    <w:bookmarkStart w:id="88" w:name="ref-gratch2014distress"/>
+    <w:bookmarkEnd w:id="92"/>
+    <w:bookmarkStart w:id="94" w:name="ref-gratch2014distress"/>
     <w:p>
       <w:pPr>
         <w:pStyle w:val="Bibliography"/>
@@ -12486,7 +13012,7 @@
       <w:r>
         <w:t xml:space="preserve"> </w:t>
       </w:r>
-      <w:hyperlink r:id="rId87">
+      <w:hyperlink r:id="rId93">
         <w:r>
           <w:rPr>
             <w:rStyle w:val="Hyperlink"/>
@@ -12498,8 +13024,8 @@
         <w:t xml:space="preserve">.</w:t>
       </w:r>
     </w:p>
-    <w:bookmarkEnd w:id="88"/>
-    <w:bookmarkStart w:id="90" w:name="ref-guo2017calibration"/>
+    <w:bookmarkEnd w:id="94"/>
+    <w:bookmarkStart w:id="96" w:name="ref-guo2017calibration"/>
     <w:p>
       <w:pPr>
         <w:pStyle w:val="Bibliography"/>
@@ -12522,7 +13048,7 @@
       <w:r>
         <w:t xml:space="preserve"> </w:t>
       </w:r>
-      <w:hyperlink r:id="rId89">
+      <w:hyperlink r:id="rId95">
         <w:r>
           <w:rPr>
             <w:rStyle w:val="Hyperlink"/>
@@ -12534,8 +13060,8 @@
         <w:t xml:space="preserve">.</w:t>
       </w:r>
     </w:p>
-    <w:bookmarkEnd w:id="90"/>
-    <w:bookmarkStart w:id="92" w:name="ref-ishikawa2026multiprobe"/>
+    <w:bookmarkEnd w:id="96"/>
+    <w:bookmarkStart w:id="98" w:name="ref-ishikawa2026multiprobe"/>
     <w:p>
       <w:pPr>
         <w:pStyle w:val="Bibliography"/>
@@ -12546,7 +13072,7 @@
       <w:r>
         <w:t xml:space="preserve"> </w:t>
       </w:r>
-      <w:hyperlink r:id="rId91">
+      <w:hyperlink r:id="rId97">
         <w:r>
           <w:rPr>
             <w:rStyle w:val="Hyperlink"/>
@@ -12558,8 +13084,8 @@
         <w:t xml:space="preserve">.</w:t>
       </w:r>
     </w:p>
-    <w:bookmarkEnd w:id="92"/>
-    <w:bookmarkStart w:id="94" w:name="ref-li2025mirror"/>
+    <w:bookmarkEnd w:id="98"/>
+    <w:bookmarkStart w:id="100" w:name="ref-li2025mirror"/>
     <w:p>
       <w:pPr>
         <w:pStyle w:val="Bibliography"/>
@@ -12570,7 +13096,7 @@
       <w:r>
         <w:t xml:space="preserve"> </w:t>
       </w:r>
-      <w:hyperlink r:id="rId93">
+      <w:hyperlink r:id="rId99">
         <w:r>
           <w:rPr>
             <w:rStyle w:val="Hyperlink"/>
@@ -12582,8 +13108,8 @@
         <w:t xml:space="preserve">.</w:t>
       </w:r>
     </w:p>
-    <w:bookmarkEnd w:id="94"/>
-    <w:bookmarkStart w:id="96" w:name="ref-lipton2018labelshift"/>
+    <w:bookmarkEnd w:id="100"/>
+    <w:bookmarkStart w:id="102" w:name="ref-lipton2018labelshift"/>
     <w:p>
       <w:pPr>
         <w:pStyle w:val="Bibliography"/>
@@ -12606,7 +13132,7 @@
       <w:r>
         <w:t xml:space="preserve"> </w:t>
       </w:r>
-      <w:hyperlink r:id="rId95">
+      <w:hyperlink r:id="rId101">
         <w:r>
           <w:rPr>
             <w:rStyle w:val="Hyperlink"/>
@@ -12618,8 +13144,8 @@
         <w:t xml:space="preserve">.</w:t>
       </w:r>
     </w:p>
-    <w:bookmarkEnd w:id="96"/>
-    <w:bookmarkStart w:id="98" w:name="ref-long2015dan"/>
+    <w:bookmarkEnd w:id="102"/>
+    <w:bookmarkStart w:id="104" w:name="ref-long2015dan"/>
     <w:p>
       <w:pPr>
         <w:pStyle w:val="Bibliography"/>
@@ -12642,7 +13168,7 @@
       <w:r>
         <w:t xml:space="preserve"> </w:t>
       </w:r>
-      <w:hyperlink r:id="rId97">
+      <w:hyperlink r:id="rId103">
         <w:r>
           <w:rPr>
             <w:rStyle w:val="Hyperlink"/>
@@ -12654,8 +13180,8 @@
         <w:t xml:space="preserve">.</w:t>
       </w:r>
     </w:p>
-    <w:bookmarkEnd w:id="98"/>
-    <w:bookmarkStart w:id="100" w:name="ref-ma2021phqhamd"/>
+    <w:bookmarkEnd w:id="104"/>
+    <w:bookmarkStart w:id="106" w:name="ref-ma2021phqhamd"/>
     <w:p>
       <w:pPr>
         <w:pStyle w:val="Bibliography"/>
@@ -12681,7 +13207,7 @@
       <w:r>
         <w:t xml:space="preserve"> </w:t>
       </w:r>
-      <w:hyperlink r:id="rId99">
+      <w:hyperlink r:id="rId105">
         <w:r>
           <w:rPr>
             <w:rStyle w:val="Hyperlink"/>
@@ -12693,8 +13219,8 @@
         <w:t xml:space="preserve">.</w:t>
       </w:r>
     </w:p>
-    <w:bookmarkEnd w:id="100"/>
-    <w:bookmarkStart w:id="102" w:name="ref-mandal2025questmf"/>
+    <w:bookmarkEnd w:id="106"/>
+    <w:bookmarkStart w:id="108" w:name="ref-mandal2025questmf"/>
     <w:p>
       <w:pPr>
         <w:pStyle w:val="Bibliography"/>
@@ -12717,7 +13243,7 @@
       <w:r>
         <w:t xml:space="preserve"> </w:t>
       </w:r>
-      <w:hyperlink r:id="rId101">
+      <w:hyperlink r:id="rId107">
         <w:r>
           <w:rPr>
             <w:rStyle w:val="Hyperlink"/>
@@ -12729,8 +13255,8 @@
         <w:t xml:space="preserve">.</w:t>
       </w:r>
     </w:p>
-    <w:bookmarkEnd w:id="102"/>
-    <w:bookmarkStart w:id="104" w:name="ref-meredith1993measurement"/>
+    <w:bookmarkEnd w:id="108"/>
+    <w:bookmarkStart w:id="110" w:name="ref-meredith1993measurement"/>
     <w:p>
       <w:pPr>
         <w:pStyle w:val="Bibliography"/>
@@ -12756,7 +13282,7 @@
       <w:r>
         <w:t xml:space="preserve"> </w:t>
       </w:r>
-      <w:hyperlink r:id="rId103">
+      <w:hyperlink r:id="rId109">
         <w:r>
           <w:rPr>
             <w:rStyle w:val="Hyperlink"/>
@@ -12768,8 +13294,8 @@
         <w:t xml:space="preserve">.</w:t>
       </w:r>
     </w:p>
-    <w:bookmarkEnd w:id="104"/>
-    <w:bookmarkStart w:id="106" w:name="ref-muthen2014irt"/>
+    <w:bookmarkEnd w:id="110"/>
+    <w:bookmarkStart w:id="112" w:name="ref-muthen2014irt"/>
     <w:p>
       <w:pPr>
         <w:pStyle w:val="Bibliography"/>
@@ -12801,7 +13327,7 @@
       <w:r>
         <w:t xml:space="preserve"> </w:t>
       </w:r>
-      <w:hyperlink r:id="rId105">
+      <w:hyperlink r:id="rId111">
         <w:r>
           <w:rPr>
             <w:rStyle w:val="Hyperlink"/>
@@ -12813,8 +13339,8 @@
         <w:t xml:space="preserve">.</w:t>
       </w:r>
     </w:p>
-    <w:bookmarkEnd w:id="106"/>
-    <w:bookmarkStart w:id="108" w:name="ref-nguyen2022improving"/>
+    <w:bookmarkEnd w:id="112"/>
+    <w:bookmarkStart w:id="114" w:name="ref-nguyen2022improving"/>
     <w:p>
       <w:pPr>
         <w:pStyle w:val="Bibliography"/>
@@ -12837,7 +13363,7 @@
       <w:r>
         <w:t xml:space="preserve"> </w:t>
       </w:r>
-      <w:hyperlink r:id="rId107">
+      <w:hyperlink r:id="rId113">
         <w:r>
           <w:rPr>
             <w:rStyle w:val="Hyperlink"/>
@@ -12849,8 +13375,8 @@
         <w:t xml:space="preserve">.</w:t>
       </w:r>
     </w:p>
-    <w:bookmarkEnd w:id="108"/>
-    <w:bookmarkStart w:id="110" w:name="ref-patel2019measurement"/>
+    <w:bookmarkEnd w:id="114"/>
+    <w:bookmarkStart w:id="116" w:name="ref-patel2019measurement"/>
     <w:p>
       <w:pPr>
         <w:pStyle w:val="Bibliography"/>
@@ -12876,7 +13402,7 @@
       <w:r>
         <w:t xml:space="preserve"> </w:t>
       </w:r>
-      <w:hyperlink r:id="rId109">
+      <w:hyperlink r:id="rId115">
         <w:r>
           <w:rPr>
             <w:rStyle w:val="Hyperlink"/>
@@ -12888,8 +13414,8 @@
         <w:t xml:space="preserve">.</w:t>
       </w:r>
     </w:p>
-    <w:bookmarkEnd w:id="110"/>
-    <w:bookmarkStart w:id="112" w:name="ref-pdchrepository2026"/>
+    <w:bookmarkEnd w:id="116"/>
+    <w:bookmarkStart w:id="118" w:name="ref-pdchrepository2026"/>
     <w:p>
       <w:pPr>
         <w:pStyle w:val="Bibliography"/>
@@ -12900,7 +13426,7 @@
       <w:r>
         <w:t xml:space="preserve"> </w:t>
       </w:r>
-      <w:hyperlink r:id="rId111">
+      <w:hyperlink r:id="rId117">
         <w:r>
           <w:rPr>
             <w:rStyle w:val="Hyperlink"/>
@@ -12912,8 +13438,8 @@
         <w:t xml:space="preserve">.</w:t>
       </w:r>
     </w:p>
-    <w:bookmarkEnd w:id="112"/>
-    <w:bookmarkStart w:id="114" w:name="ref-sagawa2019groupdro"/>
+    <w:bookmarkEnd w:id="118"/>
+    <w:bookmarkStart w:id="120" w:name="ref-sagawa2019groupdro"/>
     <w:p>
       <w:pPr>
         <w:pStyle w:val="Bibliography"/>
@@ -12924,7 +13450,7 @@
       <w:r>
         <w:t xml:space="preserve"> </w:t>
       </w:r>
-      <w:hyperlink r:id="rId113">
+      <w:hyperlink r:id="rId119">
         <w:r>
           <w:rPr>
             <w:rStyle w:val="Hyperlink"/>
@@ -12936,8 +13462,8 @@
         <w:t xml:space="preserve">.</w:t>
       </w:r>
     </w:p>
-    <w:bookmarkEnd w:id="114"/>
-    <w:bookmarkStart w:id="116" w:name="ref-samejima1969graded"/>
+    <w:bookmarkEnd w:id="120"/>
+    <w:bookmarkStart w:id="122" w:name="ref-samejima1969graded"/>
     <w:p>
       <w:pPr>
         <w:pStyle w:val="Bibliography"/>
@@ -12960,7 +13486,7 @@
       <w:r>
         <w:t xml:space="preserve"> </w:t>
       </w:r>
-      <w:hyperlink r:id="rId115">
+      <w:hyperlink r:id="rId121">
         <w:r>
           <w:rPr>
             <w:rStyle w:val="Hyperlink"/>
@@ -12972,8 +13498,8 @@
         <w:t xml:space="preserve">.</w:t>
       </w:r>
     </w:p>
-    <w:bookmarkEnd w:id="116"/>
-    <w:bookmarkStart w:id="118" w:name="ref-shen2022automatic"/>
+    <w:bookmarkEnd w:id="122"/>
+    <w:bookmarkStart w:id="124" w:name="ref-shen2022automatic"/>
     <w:p>
       <w:pPr>
         <w:pStyle w:val="Bibliography"/>
@@ -12996,7 +13522,7 @@
       <w:r>
         <w:t xml:space="preserve"> </w:t>
       </w:r>
-      <w:hyperlink r:id="rId117">
+      <w:hyperlink r:id="rId123">
         <w:r>
           <w:rPr>
             <w:rStyle w:val="Hyperlink"/>
@@ -13008,8 +13534,8 @@
         <w:t xml:space="preserve">.</w:t>
       </w:r>
     </w:p>
-    <w:bookmarkEnd w:id="118"/>
-    <w:bookmarkStart w:id="120" w:name="ref-sun2016deepcoral"/>
+    <w:bookmarkEnd w:id="124"/>
+    <w:bookmarkStart w:id="126" w:name="ref-sun2016deepcoral"/>
     <w:p>
       <w:pPr>
         <w:pStyle w:val="Bibliography"/>
@@ -13032,7 +13558,7 @@
       <w:r>
         <w:t xml:space="preserve"> </w:t>
       </w:r>
-      <w:hyperlink r:id="rId119">
+      <w:hyperlink r:id="rId125">
         <w:r>
           <w:rPr>
             <w:rStyle w:val="Hyperlink"/>
@@ -13044,8 +13570,8 @@
         <w:t xml:space="preserve">.</w:t>
       </w:r>
     </w:p>
-    <w:bookmarkEnd w:id="120"/>
-    <w:bookmarkStart w:id="122" w:name="ref-teng2026depressionllm"/>
+    <w:bookmarkEnd w:id="126"/>
+    <w:bookmarkStart w:id="128" w:name="ref-teng2026depressionllm"/>
     <w:p>
       <w:pPr>
         <w:pStyle w:val="Bibliography"/>
@@ -13071,7 +13597,7 @@
       <w:r>
         <w:t xml:space="preserve"> </w:t>
       </w:r>
-      <w:hyperlink r:id="rId121">
+      <w:hyperlink r:id="rId127">
         <w:r>
           <w:rPr>
             <w:rStyle w:val="Hyperlink"/>
@@ -13083,8 +13609,8 @@
         <w:t xml:space="preserve">.</w:t>
       </w:r>
     </w:p>
-    <w:bookmarkEnd w:id="122"/>
-    <w:bookmarkStart w:id="124" w:name="ref-uscict2026daic"/>
+    <w:bookmarkEnd w:id="128"/>
+    <w:bookmarkStart w:id="130" w:name="ref-uscict2026daic"/>
     <w:p>
       <w:pPr>
         <w:pStyle w:val="Bibliography"/>
@@ -13095,7 +13621,7 @@
       <w:r>
         <w:t xml:space="preserve"> </w:t>
       </w:r>
-      <w:hyperlink r:id="rId123">
+      <w:hyperlink r:id="rId129">
         <w:r>
           <w:rPr>
             <w:rStyle w:val="Hyperlink"/>
@@ -13107,8 +13633,8 @@
         <w:t xml:space="preserve">.</w:t>
       </w:r>
     </w:p>
-    <w:bookmarkEnd w:id="124"/>
-    <w:bookmarkStart w:id="126" w:name="ref-vandenberg2000review"/>
+    <w:bookmarkEnd w:id="130"/>
+    <w:bookmarkStart w:id="132" w:name="ref-vandenberg2000review"/>
     <w:p>
       <w:pPr>
         <w:pStyle w:val="Bibliography"/>
@@ -13134,7 +13660,7 @@
       <w:r>
         <w:t xml:space="preserve"> </w:t>
       </w:r>
-      <w:hyperlink r:id="rId125">
+      <w:hyperlink r:id="rId131">
         <w:r>
           <w:rPr>
             <w:rStyle w:val="Hyperlink"/>
@@ -13146,8 +13672,8 @@
         <w:t xml:space="preserve">.</w:t>
       </w:r>
     </w:p>
-    <w:bookmarkEnd w:id="126"/>
-    <w:bookmarkStart w:id="128" w:name="ref-wang2024multilinguale5"/>
+    <w:bookmarkEnd w:id="132"/>
+    <w:bookmarkStart w:id="134" w:name="ref-wang2024multilinguale5"/>
     <w:p>
       <w:pPr>
         <w:pStyle w:val="Bibliography"/>
@@ -13158,7 +13684,7 @@
       <w:r>
         <w:t xml:space="preserve"> </w:t>
       </w:r>
-      <w:hyperlink r:id="rId127">
+      <w:hyperlink r:id="rId133">
         <w:r>
           <w:rPr>
             <w:rStyle w:val="Hyperlink"/>
@@ -13170,8 +13696,8 @@
         <w:t xml:space="preserve">.</w:t>
       </w:r>
     </w:p>
-    <w:bookmarkEnd w:id="128"/>
-    <w:bookmarkStart w:id="130" w:name="ref-zhang2025interviewer"/>
+    <w:bookmarkEnd w:id="134"/>
+    <w:bookmarkStart w:id="136" w:name="ref-zhang2025interviewer"/>
     <w:p>
       <w:pPr>
         <w:pStyle w:val="Bibliography"/>
@@ -13194,7 +13720,7 @@
       <w:r>
         <w:t xml:space="preserve"> </w:t>
       </w:r>
-      <w:hyperlink r:id="rId129">
+      <w:hyperlink r:id="rId135">
         <w:r>
           <w:rPr>
             <w:rStyle w:val="Hyperlink"/>
@@ -13206,8 +13732,8 @@
         <w:t xml:space="preserve">.</w:t>
       </w:r>
     </w:p>
-    <w:bookmarkEnd w:id="130"/>
-    <w:bookmarkStart w:id="132" w:name="ref-zhang2025red"/>
+    <w:bookmarkEnd w:id="136"/>
+    <w:bookmarkStart w:id="138" w:name="ref-zhang2025red"/>
     <w:p>
       <w:pPr>
         <w:pStyle w:val="Bibliography"/>
@@ -13230,7 +13756,7 @@
       <w:r>
         <w:t xml:space="preserve"> </w:t>
       </w:r>
-      <w:hyperlink r:id="rId131">
+      <w:hyperlink r:id="rId137">
         <w:r>
           <w:rPr>
             <w:rStyle w:val="Hyperlink"/>
@@ -13242,8 +13768,8 @@
         <w:t xml:space="preserve">.</w:t>
       </w:r>
     </w:p>
-    <w:bookmarkEnd w:id="132"/>
-    <w:bookmarkStart w:id="134" w:name="ref-zhang2025qwen3embedding"/>
+    <w:bookmarkEnd w:id="138"/>
+    <w:bookmarkStart w:id="140" w:name="ref-zhang2025qwen3embedding"/>
     <w:p>
       <w:pPr>
         <w:pStyle w:val="Bibliography"/>
@@ -13254,7 +13780,7 @@
       <w:r>
         <w:t xml:space="preserve"> </w:t>
       </w:r>
-      <w:hyperlink r:id="rId133">
+      <w:hyperlink r:id="rId139">
         <w:r>
           <w:rPr>
             <w:rStyle w:val="Hyperlink"/>
@@ -13266,8 +13792,8 @@
         <w:t xml:space="preserve">.</w:t>
       </w:r>
     </w:p>
-    <w:bookmarkEnd w:id="134"/>
-    <w:bookmarkStart w:id="136" w:name="ref-zhou2026depression"/>
+    <w:bookmarkEnd w:id="140"/>
+    <w:bookmarkStart w:id="142" w:name="ref-zhou2026depression"/>
     <w:p>
       <w:pPr>
         <w:pStyle w:val="Bibliography"/>
@@ -13293,7 +13819,7 @@
       <w:r>
         <w:t xml:space="preserve"> </w:t>
       </w:r>
-      <w:hyperlink r:id="rId135">
+      <w:hyperlink r:id="rId141">
         <w:r>
           <w:rPr>
             <w:rStyle w:val="Hyperlink"/>
@@ -13305,8 +13831,8 @@
         <w:t xml:space="preserve">.</w:t>
       </w:r>
     </w:p>
-    <w:bookmarkEnd w:id="136"/>
-    <w:bookmarkStart w:id="138" w:name="ref-zou2023cmdc"/>
+    <w:bookmarkEnd w:id="142"/>
+    <w:bookmarkStart w:id="144" w:name="ref-zou2023cmdc"/>
     <w:p>
       <w:pPr>
         <w:pStyle w:val="Bibliography"/>
@@ -13332,7 +13858,7 @@
       <w:r>
         <w:t xml:space="preserve"> </w:t>
       </w:r>
-      <w:hyperlink r:id="rId137">
+      <w:hyperlink r:id="rId143">
         <w:r>
           <w:rPr>
             <w:rStyle w:val="Hyperlink"/>
@@ -13344,8 +13870,8 @@
         <w:t xml:space="preserve">.</w:t>
       </w:r>
     </w:p>
-    <w:bookmarkEnd w:id="138"/>
-    <w:bookmarkEnd w:id="139"/>
+    <w:bookmarkEnd w:id="144"/>
+    <w:bookmarkEnd w:id="145"/>
     <w:sectPr/>
   </w:body>
 </w:document>

</xml_diff>

<commit_message>
Refine target comparability audit
</commit_message>
<xml_diff>
--- a/analysis/diagnostic_measurement_audit_paper/manuscript_reframed_rq_draft.docx
+++ b/analysis/diagnostic_measurement_audit_paper/manuscript_reframed_rq_draft.docx
@@ -6,9 +6,9 @@
       <w:pPr>
         <w:pStyle w:val="Heading1"/>
       </w:pPr>
-      <w:bookmarkStart w:id="20" w:name="Xfe60018ceb5a59dd5d5027e02c6e8f96b691b6d"/>
-      <w:r>
-        <w:t xml:space="preserve">Validate the Target Before Aligning Representations: A Target-Validity Audit of Cross-Corpus Depression Detection</w:t>
+      <w:bookmarkStart w:id="20" w:name="X2fb3220041d77f042531371b7f5505de190326a"/>
+      <w:r>
+        <w:t xml:space="preserve">Audit Target Comparability Before Aligning Representations: A Cross-Corpus Measurement Audit of Depression Detection</w:t>
       </w:r>
       <w:bookmarkEnd w:id="20"/>
     </w:p>
@@ -45,31 +45,43 @@
         <w:t xml:space="preserve"> </w:t>
       </w:r>
       <w:r>
-        <w:t xml:space="preserve">that this view leaves the clinical target unchecked. Depression scores are</w:t>
-      </w:r>
-      <w:r>
-        <w:t xml:space="preserve"> </w:t>
-      </w:r>
-      <w:r>
-        <w:t xml:space="preserve">structured measurements, and nominally aligned PHQ or HAMD labels may not</w:t>
-      </w:r>
-      <w:r>
-        <w:t xml:space="preserve"> </w:t>
-      </w:r>
-      <w:r>
-        <w:t xml:space="preserve">preserve the same response mechanism across corpora. We therefore study</w:t>
-      </w:r>
-      <w:r>
-        <w:t xml:space="preserve"> </w:t>
-      </w:r>
-      <w:r>
-        <w:t xml:space="preserve">cross-corpus depression detection as a benchmark-validity problem: before</w:t>
-      </w:r>
-      <w:r>
-        <w:t xml:space="preserve"> </w:t>
-      </w:r>
-      <w:r>
-        <w:t xml:space="preserve">aligning representations, validate the target.</w:t>
+        <w:t xml:space="preserve">that this view leaves the comparability of the observed target unchecked.</w:t>
+      </w:r>
+      <w:r>
+        <w:t xml:space="preserve"> </w:t>
+      </w:r>
+      <w:r>
+        <w:t xml:space="preserve">Depression scores are structured measurements, and nominally aligned PHQ or</w:t>
+      </w:r>
+      <w:r>
+        <w:t xml:space="preserve"> </w:t>
+      </w:r>
+      <w:r>
+        <w:t xml:space="preserve">HAMD labels may not preserve the same response mechanism across corpora. We</w:t>
+      </w:r>
+      <w:r>
+        <w:t xml:space="preserve"> </w:t>
+      </w:r>
+      <w:r>
+        <w:t xml:space="preserve">therefore study cross-corpus depression detection as a target-comparability and</w:t>
+      </w:r>
+      <w:r>
+        <w:t xml:space="preserve"> </w:t>
+      </w:r>
+      <w:r>
+        <w:t xml:space="preserve">measurement-contract audit: before aligning representations, audit whether the</w:t>
+      </w:r>
+      <w:r>
+        <w:t xml:space="preserve"> </w:t>
+      </w:r>
+      <w:r>
+        <w:t xml:space="preserve">target scores can support comparable interpretation. We do not test the</w:t>
+      </w:r>
+      <w:r>
+        <w:t xml:space="preserve"> </w:t>
+      </w:r>
+      <w:r>
+        <w:t xml:space="preserve">construct, criterion, or clinical validity of PHQ, HAMD, or SDS themselves.</w:t>
       </w:r>
     </w:p>
     <w:p>
@@ -119,13 +131,19 @@
         <w:t xml:space="preserve"> </w:t>
       </w:r>
       <w:r>
-        <w:t xml:space="preserve">baselines that match the target-label budget, trainable shared layers, and</w:t>
-      </w:r>
-      <w:r>
-        <w:t xml:space="preserve"> </w:t>
-      </w:r>
-      <w:r>
-        <w:t xml:space="preserve">optimization exposure. This fair ablation changes the interpretation of the</w:t>
+        <w:t xml:space="preserve">baselines that match the target-label budget and trainable shared-layer access</w:t>
+      </w:r>
+      <w:r>
+        <w:t xml:space="preserve"> </w:t>
+      </w:r>
+      <w:r>
+        <w:t xml:space="preserve">under fixed, comparable optimization schedules. This fair ablation changes the</w:t>
+      </w:r>
+      <w:r>
+        <w:t xml:space="preserve"> </w:t>
+      </w:r>
+      <w:r>
+        <w:t xml:space="preserve">interpretation of the</w:t>
       </w:r>
       <w:r>
         <w:t xml:space="preserve"> </w:t>
@@ -736,37 +754,64 @@
         <w:pStyle w:val="BodyText"/>
       </w:pPr>
       <w:r>
-        <w:t xml:space="preserve">We therefore study cross-corpus depression detection as a benchmark-validity</w:t>
-      </w:r>
-      <w:r>
-        <w:t xml:space="preserve"> </w:t>
-      </w:r>
-      <w:r>
-        <w:t xml:space="preserve">problem for mental health AI. The claim is not that existing depression</w:t>
-      </w:r>
-      <w:r>
-        <w:t xml:space="preserve"> </w:t>
-      </w:r>
-      <w:r>
-        <w:t xml:space="preserve">benchmarks are invalid, nor that all corpora measure different constructs. The</w:t>
-      </w:r>
-      <w:r>
-        <w:t xml:space="preserve"> </w:t>
-      </w:r>
-      <w:r>
-        <w:t xml:space="preserve">claim is more useful: cross-corpus depression detection involves both</w:t>
-      </w:r>
-      <w:r>
-        <w:t xml:space="preserve"> </w:t>
-      </w:r>
-      <w:r>
-        <w:t xml:space="preserve">representation discrepancies and potential measurement heterogeneity, and a</w:t>
-      </w:r>
-      <w:r>
-        <w:t xml:space="preserve"> </w:t>
-      </w:r>
-      <w:r>
-        <w:t xml:space="preserve">paper that aligns only representations leaves the target-validity assumption</w:t>
+        <w:t xml:space="preserve">We therefore study cross-corpus depression detection as a target-comparability</w:t>
+      </w:r>
+      <w:r>
+        <w:t xml:space="preserve"> </w:t>
+      </w:r>
+      <w:r>
+        <w:t xml:space="preserve">problem for mental health AI. Recent benchmark-validity work already argues</w:t>
+      </w:r>
+      <w:r>
+        <w:t xml:space="preserve"> </w:t>
+      </w:r>
+      <w:r>
+        <w:t xml:space="preserve">that medical AI benchmarks should be examined through construct-validity</w:t>
+      </w:r>
+      <w:r>
+        <w:t xml:space="preserve"> </w:t>
+      </w:r>
+      <w:r>
+        <w:t xml:space="preserve">questions</w:t>
+      </w:r>
+      <w:r>
+        <w:t xml:space="preserve"> </w:t>
+      </w:r>
+      <w:r>
+        <w:t xml:space="preserve">(Alaa et al. 2025)</w:t>
+      </w:r>
+      <w:r>
+        <w:t xml:space="preserve">. Our claim is narrower: we do not test</w:t>
+      </w:r>
+      <w:r>
+        <w:t xml:space="preserve"> </w:t>
+      </w:r>
+      <w:r>
+        <w:t xml:space="preserve">the clinical construct, criterion, or clinical validity of the depression</w:t>
+      </w:r>
+      <w:r>
+        <w:t xml:space="preserve"> </w:t>
+      </w:r>
+      <w:r>
+        <w:t xml:space="preserve">instruments themselves. We audit whether observed depression scores preserve</w:t>
+      </w:r>
+      <w:r>
+        <w:t xml:space="preserve"> </w:t>
+      </w:r>
+      <w:r>
+        <w:t xml:space="preserve">comparable interpretation across corpora, using item structure, response</w:t>
+      </w:r>
+      <w:r>
+        <w:t xml:space="preserve"> </w:t>
+      </w:r>
+      <w:r>
+        <w:t xml:space="preserve">thresholds, target-contract comparisons, and prediction consequences. A paper</w:t>
+      </w:r>
+      <w:r>
+        <w:t xml:space="preserve"> </w:t>
+      </w:r>
+      <w:r>
+        <w:t xml:space="preserve">that aligns only representations leaves this target-comparability assumption</w:t>
       </w:r>
       <w:r>
         <w:t xml:space="preserve"> </w:t>
@@ -1246,13 +1291,13 @@
         <w:pStyle w:val="Compact"/>
       </w:pPr>
       <w:r>
-        <w:t xml:space="preserve">We formulate cross-corpus depression detection as a benchmark-validity</w:t>
-      </w:r>
-      <w:r>
-        <w:t xml:space="preserve"> </w:t>
-      </w:r>
-      <w:r>
-        <w:t xml:space="preserve">problem that separates representation heterogeneity, target measurement</w:t>
+        <w:t xml:space="preserve">We formulate cross-corpus depression detection as a target-comparability</w:t>
+      </w:r>
+      <w:r>
+        <w:t xml:space="preserve"> </w:t>
+      </w:r>
+      <w:r>
+        <w:t xml:space="preserve">audit that separates representation heterogeneity, target measurement</w:t>
       </w:r>
       <w:r>
         <w:t xml:space="preserve"> </w:t>
@@ -1342,7 +1387,7 @@
           <wp:inline>
             <wp:extent cx="5334000" cy="2314175"/>
             <wp:effectExtent b="0" l="0" r="0" t="0"/>
-            <wp:docPr descr="Figure 1. Measurement-aware benchmark-validity framework for cross-corpus depression detection. The visual center is the target contract: scale, shared item content, response categories, rater or self-report source, language, and protocol. The proposed model routes frozen multimodal representations into shared symptom evidence and then through audited ordinal measurement heads whose sharing structure is tested empirically." title="" id="1" name="Picture"/>
+            <wp:docPr descr="Figure 1. Measurement-aware target-comparability audit for cross-corpus depression detection. The visual center is the target contract: scale, shared item content, response categories, rater or self-report source, language, and protocol. The proposed model routes frozen multimodal representations into shared symptom evidence and then through audited ordinal measurement heads whose sharing structure is tested empirically." title="" id="1" name="Picture"/>
             <a:graphic>
               <a:graphicData uri="http://schemas.openxmlformats.org/drawingml/2006/picture">
                 <pic:pic>
@@ -1385,7 +1430,7 @@
         <w:pStyle w:val="ImageCaption"/>
       </w:pPr>
       <w:r>
-        <w:t xml:space="preserve">Figure 1. Measurement-aware benchmark-validity framework for cross-corpus depression detection. The visual center is the target contract: scale, shared item content, response categories, rater or self-report source, language, and protocol. The proposed model routes frozen multimodal representations into shared symptom evidence and then through audited ordinal measurement heads whose sharing structure is tested empirically.</w:t>
+        <w:t xml:space="preserve">Figure 1. Measurement-aware target-comparability audit for cross-corpus depression detection. The visual center is the target contract: scale, shared item content, response categories, rater or self-report source, language, and protocol. The proposed model routes frozen multimodal representations into shared symptom evidence and then through audited ordinal measurement heads whose sharing structure is tested empirically.</w:t>
       </w:r>
     </w:p>
     <w:p>
@@ -2005,19 +2050,19 @@
         <w:t xml:space="preserve"> </w:t>
       </w:r>
       <w:r>
-        <w:t xml:space="preserve">and more empirical: we operationalize target-contract validity for</w:t>
-      </w:r>
-      <w:r>
-        <w:t xml:space="preserve"> </w:t>
-      </w:r>
-      <w:r>
-        <w:t xml:space="preserve">cross-corpus depression detection, where clinical labels are scale-based</w:t>
-      </w:r>
-      <w:r>
-        <w:t xml:space="preserve"> </w:t>
-      </w:r>
-      <w:r>
-        <w:t xml:space="preserve">measurements rather than generic class names.</w:t>
+        <w:t xml:space="preserve">and more empirical: we operationalize cross-corpus score-comparability and</w:t>
+      </w:r>
+      <w:r>
+        <w:t xml:space="preserve"> </w:t>
+      </w:r>
+      <w:r>
+        <w:t xml:space="preserve">target-contract auditing for depression detection, where clinical labels are</w:t>
+      </w:r>
+      <w:r>
+        <w:t xml:space="preserve"> </w:t>
+      </w:r>
+      <w:r>
+        <w:t xml:space="preserve">scale-based measurements rather than generic class names.</w:t>
       </w:r>
     </w:p>
     <w:p>
@@ -2530,9 +2575,9 @@
       <w:pPr>
         <w:pStyle w:val="Heading2"/>
       </w:pPr>
-      <w:bookmarkStart w:id="29" w:name="target-validity-audit-framework"/>
-      <w:r>
-        <w:t xml:space="preserve">3 Target-Validity Audit Framework</w:t>
+      <w:bookmarkStart w:id="29" w:name="target-comparability-audit-framework"/>
+      <w:r>
+        <w:t xml:space="preserve">3 Target-Comparability Audit Framework</w:t>
       </w:r>
       <w:bookmarkEnd w:id="29"/>
     </w:p>
@@ -3046,7 +3091,119 @@
         <w:pStyle w:val="FirstParagraph"/>
       </w:pPr>
       <w:r>
-        <w:t xml:space="preserve">We separate the input and target mechanisms:</w:t>
+        <w:t xml:space="preserve">We use a working abstraction that distinguishes two mechanisms rather than</w:t>
+      </w:r>
+      <w:r>
+        <w:t xml:space="preserve"> </w:t>
+      </w:r>
+      <w:r>
+        <w:t xml:space="preserve">asserting that they are conditionally independent in the data. The</w:t>
+      </w:r>
+      <w:r>
+        <w:t xml:space="preserve"> </w:t>
+      </w:r>
+      <w:r>
+        <w:t xml:space="preserve">representation component addresses</w:t>
+      </w:r>
+      <w:r>
+        <w:t xml:space="preserve"> </w:t>
+      </w:r>
+      <m:oMath>
+        <m:sSub>
+          <m:e>
+            <m:r>
+              <m:t>P</m:t>
+            </m:r>
+          </m:e>
+          <m:sub>
+            <m:r>
+              <m:t>D</m:t>
+            </m:r>
+          </m:sub>
+        </m:sSub>
+        <m:r>
+          <m:t>(</m:t>
+        </m:r>
+        <m:r>
+          <m:t>X</m:t>
+        </m:r>
+        <m:r>
+          <m:t>∣</m:t>
+        </m:r>
+        <m:r>
+          <m:t>θ</m:t>
+        </m:r>
+        <m:r>
+          <m:t>)</m:t>
+        </m:r>
+      </m:oMath>
+      <w:r>
+        <w:t xml:space="preserve">: how latent symptom</w:t>
+      </w:r>
+      <w:r>
+        <w:t xml:space="preserve"> </w:t>
+      </w:r>
+      <w:r>
+        <w:t xml:space="preserve">state is expressed in language, speech, facial behavior, gait, or other</w:t>
+      </w:r>
+      <w:r>
+        <w:t xml:space="preserve"> </w:t>
+      </w:r>
+      <w:r>
+        <w:t xml:space="preserve">observable signals. The measurement component addresses</w:t>
+      </w:r>
+      <w:r>
+        <w:t xml:space="preserve"> </w:t>
+      </w:r>
+      <m:oMath>
+        <m:sSub>
+          <m:e>
+            <m:r>
+              <m:t>P</m:t>
+            </m:r>
+          </m:e>
+          <m:sub>
+            <m:r>
+              <m:t>D</m:t>
+            </m:r>
+          </m:sub>
+        </m:sSub>
+        <m:r>
+          <m:t>(</m:t>
+        </m:r>
+        <m:r>
+          <m:t>Y</m:t>
+        </m:r>
+        <m:r>
+          <m:t>∣</m:t>
+        </m:r>
+        <m:r>
+          <m:t>θ</m:t>
+        </m:r>
+        <m:r>
+          <m:t>)</m:t>
+        </m:r>
+      </m:oMath>
+      <w:r>
+        <w:t xml:space="preserve">:</w:t>
+      </w:r>
+      <w:r>
+        <w:t xml:space="preserve"> </w:t>
+      </w:r>
+      <w:r>
+        <w:t xml:space="preserve">how symptom evidence is converted into item responses, total scores, or</w:t>
+      </w:r>
+      <w:r>
+        <w:t xml:space="preserve"> </w:t>
+      </w:r>
+      <w:r>
+        <w:t xml:space="preserve">severity labels under a corpus-specific assessment contract. In a strictly</w:t>
+      </w:r>
+      <w:r>
+        <w:t xml:space="preserve"> </w:t>
+      </w:r>
+      <w:r>
+        <w:t xml:space="preserve">local-independent model this decomposition could be written as</w:t>
       </w:r>
     </w:p>
     <w:p>
@@ -3159,101 +3316,46 @@
         <w:pStyle w:val="FirstParagraph"/>
       </w:pPr>
       <w:r>
-        <w:t xml:space="preserve">The representation component addresses</w:t>
-      </w:r>
-      <w:r>
-        <w:t xml:space="preserve"> </w:t>
-      </w:r>
-      <m:oMath>
-        <m:sSub>
-          <m:e>
-            <m:r>
-              <m:t>P</m:t>
-            </m:r>
-          </m:e>
-          <m:sub>
-            <m:r>
-              <m:t>D</m:t>
-            </m:r>
-          </m:sub>
-        </m:sSub>
-        <m:r>
-          <m:t>(</m:t>
-        </m:r>
-        <m:r>
-          <m:t>X</m:t>
-        </m:r>
-        <m:r>
-          <m:t>∣</m:t>
-        </m:r>
-        <m:r>
-          <m:t>θ</m:t>
-        </m:r>
-        <m:r>
-          <m:t>)</m:t>
-        </m:r>
-      </m:oMath>
-      <w:r>
-        <w:t xml:space="preserve">: how latent</w:t>
-      </w:r>
-      <w:r>
-        <w:t xml:space="preserve"> </w:t>
-      </w:r>
-      <w:r>
-        <w:t xml:space="preserve">symptom state is expressed in language, speech, facial behavior, gait, or other</w:t>
-      </w:r>
-      <w:r>
-        <w:t xml:space="preserve"> </w:t>
-      </w:r>
-      <w:r>
-        <w:t xml:space="preserve">observable signals. The measurement component addresses</w:t>
-      </w:r>
-      <w:r>
-        <w:t xml:space="preserve"> </w:t>
-      </w:r>
-      <m:oMath>
-        <m:sSub>
-          <m:e>
-            <m:r>
-              <m:t>P</m:t>
-            </m:r>
-          </m:e>
-          <m:sub>
-            <m:r>
-              <m:t>D</m:t>
-            </m:r>
-          </m:sub>
-        </m:sSub>
-        <m:r>
-          <m:t>(</m:t>
-        </m:r>
-        <m:r>
-          <m:t>Y</m:t>
-        </m:r>
-        <m:r>
-          <m:t>∣</m:t>
-        </m:r>
-        <m:r>
-          <m:t>θ</m:t>
-        </m:r>
-        <m:r>
-          <m:t>)</m:t>
-        </m:r>
-      </m:oMath>
-      <w:r>
-        <w:t xml:space="preserve">:</w:t>
-      </w:r>
-      <w:r>
-        <w:t xml:space="preserve"> </w:t>
-      </w:r>
-      <w:r>
-        <w:t xml:space="preserve">how symptom evidence is converted into item responses, total scores, or</w:t>
-      </w:r>
-      <w:r>
-        <w:t xml:space="preserve"> </w:t>
-      </w:r>
-      <w:r>
-        <w:t xml:space="preserve">severity labels under a corpus-specific assessment contract.</w:t>
+        <w:t xml:space="preserve">Clinical-interview corpora need not satisfy this exactly. Interview questions</w:t>
+      </w:r>
+      <w:r>
+        <w:t xml:space="preserve"> </w:t>
+      </w:r>
+      <w:r>
+        <w:t xml:space="preserve">may be selected or phrased around symptoms, participant language can repeat</w:t>
+      </w:r>
+      <w:r>
+        <w:t xml:space="preserve"> </w:t>
+      </w:r>
+      <w:r>
+        <w:t xml:space="preserve">questionnaire criteria, and interviewer protocol can share residual structure</w:t>
+      </w:r>
+      <w:r>
+        <w:t xml:space="preserve"> </w:t>
+      </w:r>
+      <w:r>
+        <w:t xml:space="preserve">with the observed score</w:t>
+      </w:r>
+      <w:r>
+        <w:t xml:space="preserve"> </w:t>
+      </w:r>
+      <w:r>
+        <w:t xml:space="preserve">(Burdisso et al. 2024; E. Zhang and Poellabauer 2025; Li et al. 2025)</w:t>
+      </w:r>
+      <w:r>
+        <w:t xml:space="preserve">. We therefore use the decomposition as an audit map: it tells</w:t>
+      </w:r>
+      <w:r>
+        <w:t xml:space="preserve"> </w:t>
+      </w:r>
+      <w:r>
+        <w:t xml:space="preserve">us to check representation, protocol, and measurement mechanisms separately,</w:t>
+      </w:r>
+      <w:r>
+        <w:t xml:space="preserve"> </w:t>
+      </w:r>
+      <w:r>
+        <w:t xml:space="preserve">not to assume a verified data-generating factorization.</w:t>
       </w:r>
     </w:p>
     <w:p>
@@ -3567,19 +3669,19 @@
         <w:t xml:space="preserve"> </w:t>
       </w:r>
       <w:r>
-        <w:t xml:space="preserve">work as a generic performance architecture. It adds the target-validity layer</w:t>
-      </w:r>
-      <w:r>
-        <w:t xml:space="preserve"> </w:t>
-      </w:r>
-      <w:r>
-        <w:t xml:space="preserve">that such systems need before cross-corpus clinical labels can be interpreted</w:t>
-      </w:r>
-      <w:r>
-        <w:t xml:space="preserve"> </w:t>
-      </w:r>
-      <w:r>
-        <w:t xml:space="preserve">as comparable.</w:t>
+        <w:t xml:space="preserve">work as a generic performance architecture. It adds the target-comparability</w:t>
+      </w:r>
+      <w:r>
+        <w:t xml:space="preserve"> </w:t>
+      </w:r>
+      <w:r>
+        <w:t xml:space="preserve">layer that such systems need before cross-corpus clinical labels can be</w:t>
+      </w:r>
+      <w:r>
+        <w:t xml:space="preserve"> </w:t>
+      </w:r>
+      <w:r>
+        <w:t xml:space="preserve">interpreted as comparable.</w:t>
       </w:r>
     </w:p>
     <w:p>
@@ -4414,7 +4516,7 @@
         <w:t xml:space="preserve"> </w:t>
       </w:r>
       <w:r>
-        <w:t xml:space="preserve">clinical target.</w:t>
+        <w:t xml:space="preserve">observed target contract.</w:t>
       </w:r>
     </w:p>
     <w:p>
@@ -4555,7 +4657,7 @@
         <w:t xml:space="preserve"> </w:t>
       </w:r>
       <w:r>
-        <w:t xml:space="preserve">observed-scale reconstruction, and transfer validity.</w:t>
+        <w:t xml:space="preserve">observed-scale reconstruction, and target-contract transfer.</w:t>
       </w:r>
     </w:p>
     <w:p>
@@ -5304,13 +5406,13 @@
         <w:t xml:space="preserve"> </w:t>
       </w:r>
       <w:r>
-        <w:t xml:space="preserve">cross-corpus depression model needs before its predictions can be read as</w:t>
-      </w:r>
-      <w:r>
-        <w:t xml:space="preserve"> </w:t>
-      </w:r>
-      <w:r>
-        <w:t xml:space="preserve">clinically meaningful transfer.</w:t>
+        <w:t xml:space="preserve">cross-corpus depression model needs before its predictions can support an</w:t>
+      </w:r>
+      <w:r>
+        <w:t xml:space="preserve"> </w:t>
+      </w:r>
+      <w:r>
+        <w:t xml:space="preserve">observed-score transfer claim.</w:t>
       </w:r>
     </w:p>
     <w:p>
@@ -5533,6 +5635,104 @@
       </w:r>
       <w:r>
         <w:t xml:space="preserve">near-chance controlled identity is specific to linear-probe capacity.</w:t>
+      </w:r>
+    </w:p>
+    <w:p>
+      <w:pPr>
+        <w:pStyle w:val="BodyText"/>
+      </w:pPr>
+      <w:r>
+        <w:t xml:space="preserve">We treat interviewer leakage and criterion contamination as explicit boundary</w:t>
+      </w:r>
+      <w:r>
+        <w:t xml:space="preserve"> </w:t>
+      </w:r>
+      <w:r>
+        <w:t xml:space="preserve">checks. The available E-DAIC transcript contract does not expose speaker roles:</w:t>
+      </w:r>
+      <w:r>
+        <w:t xml:space="preserve"> </w:t>
+      </w:r>
+      <w:r>
+        <w:t xml:space="preserve">the manifest speaker field is empty and the transcript CSV files contain time,</w:t>
+      </w:r>
+      <w:r>
+        <w:t xml:space="preserve"> </w:t>
+      </w:r>
+      <w:r>
+        <w:t xml:space="preserve">text, and confidence fields but no interviewer or participant label. We</w:t>
+      </w:r>
+      <w:r>
+        <w:t xml:space="preserve"> </w:t>
+      </w:r>
+      <w:r>
+        <w:t xml:space="preserve">therefore do not claim a participant-only or interviewer-only E-DAIC control.</w:t>
+      </w:r>
+      <w:r>
+        <w:t xml:space="preserve"> </w:t>
+      </w:r>
+      <w:r>
+        <w:t xml:space="preserve">Instead, we run two bounded proxy checks that target the most plausible</w:t>
+      </w:r>
+      <w:r>
+        <w:t xml:space="preserve"> </w:t>
+      </w:r>
+      <w:r>
+        <w:t xml:space="preserve">shortcut surface available from the current data. First, the text</w:t>
+      </w:r>
+      <w:r>
+        <w:t xml:space="preserve"> </w:t>
+      </w:r>
+      <w:r>
+        <w:t xml:space="preserve">protocol-control audit compares full transcripts with front, middle, and back</w:t>
+      </w:r>
+      <w:r>
+        <w:t xml:space="preserve"> </w:t>
+      </w:r>
+      <w:r>
+        <w:t xml:space="preserve">transcript slices and repeated-turn removed or repeated-turn only variants.</w:t>
+      </w:r>
+      <w:r>
+        <w:t xml:space="preserve"> </w:t>
+      </w:r>
+      <w:r>
+        <w:t xml:space="preserve">Second, a Qwen3 prompt-proxy sensitivity re-embeds the same E-DAIC transcript</w:t>
+      </w:r>
+      <w:r>
+        <w:t xml:space="preserve"> </w:t>
+      </w:r>
+      <w:r>
+        <w:t xml:space="preserve">variants and fits fixed Ridge and Logistic heads on the official train/dev</w:t>
+      </w:r>
+      <w:r>
+        <w:t xml:space="preserve"> </w:t>
+      </w:r>
+      <w:r>
+        <w:t xml:space="preserve">split. Separately, the CMDC criterion-overlap stress deletes question-position</w:t>
+      </w:r>
+      <w:r>
+        <w:t xml:space="preserve"> </w:t>
+      </w:r>
+      <w:r>
+        <w:t xml:space="preserve">segments with the highest semantic overlap to PHQ item text and compares that</w:t>
+      </w:r>
+      <w:r>
+        <w:t xml:space="preserve"> </w:t>
+      </w:r>
+      <w:r>
+        <w:t xml:space="preserve">loss with matched random deletion. These analyses cannot prove absence of</w:t>
+      </w:r>
+      <w:r>
+        <w:t xml:space="preserve"> </w:t>
+      </w:r>
+      <w:r>
+        <w:t xml:space="preserve">leakage, but they test whether the most accessible prompt-like or PHQ-overlap</w:t>
+      </w:r>
+      <w:r>
+        <w:t xml:space="preserve"> </w:t>
+      </w:r>
+      <w:r>
+        <w:t xml:space="preserve">content is the dominant shortcut under the available data contract.</w:t>
       </w:r>
     </w:p>
     <w:p>
@@ -5801,19 +6001,70 @@
         <w:t xml:space="preserve">(Putnick and Bornstein 2016)</w:t>
       </w:r>
       <w:r>
-        <w:t xml:space="preserve">. Item-level DIF is</w:t>
-      </w:r>
-      <w:r>
-        <w:t xml:space="preserve"> </w:t>
-      </w:r>
-      <w:r>
-        <w:t xml:space="preserve">flagged only when freeing an item’s loading or thresholds improves fit by both</w:t>
-      </w:r>
-      <w:r>
-        <w:t xml:space="preserve"> </w:t>
-      </w:r>
-      <w:r>
-        <w:t xml:space="preserve">the likelihood-ratio criterion (</w:t>
+        <w:t xml:space="preserve">. Because the</w:t>
+      </w:r>
+      <w:r>
+        <w:t xml:space="preserve"> </w:t>
+      </w:r>
+      <w:r>
+        <w:t xml:space="preserve">primary shared-PHQ analysis has 219 E-DAIC and 77 CMDC item-labeled subjects</w:t>
+      </w:r>
+      <w:r>
+        <w:t xml:space="preserve"> </w:t>
+      </w:r>
+      <w:r>
+        <w:t xml:space="preserve">over only eight four-category items, it sits far below sample-size ranges used</w:t>
+      </w:r>
+      <w:r>
+        <w:t xml:space="preserve"> </w:t>
+      </w:r>
+      <w:r>
+        <w:t xml:space="preserve">in recent graded-response-model parameter-recovery simulations and below</w:t>
+      </w:r>
+      <w:r>
+        <w:t xml:space="preserve"> </w:t>
+      </w:r>
+      <w:r>
+        <w:t xml:space="preserve">recommendations for precise item-parameter recovery</w:t>
+      </w:r>
+      <w:r>
+        <w:t xml:space="preserve"> </w:t>
+      </w:r>
+      <w:r>
+        <w:t xml:space="preserve">(Ikeda 2026; Jiang, Wang, and Weiss 2016)</w:t>
+      </w:r>
+      <w:r>
+        <w:t xml:space="preserve">. We therefore use the</w:t>
+      </w:r>
+      <w:r>
+        <w:t xml:space="preserve"> </w:t>
+      </w:r>
+      <w:r>
+        <w:t xml:space="preserve">multi-group graded-response model as bounded confirmation of the</w:t>
+      </w:r>
+      <w:r>
+        <w:t xml:space="preserve"> </w:t>
+      </w:r>
+      <w:r>
+        <w:t xml:space="preserve">target-comparability audit, not as definitive item-level DIF inference. An</w:t>
+      </w:r>
+      <w:r>
+        <w:t xml:space="preserve"> </w:t>
+      </w:r>
+      <w:r>
+        <w:t xml:space="preserve">item is marked as a hypothesis-generating localization candidate only when</w:t>
+      </w:r>
+      <w:r>
+        <w:t xml:space="preserve"> </w:t>
+      </w:r>
+      <w:r>
+        <w:t xml:space="preserve">freeing its loading or thresholds improves fit by both the likelihood-ratio</w:t>
+      </w:r>
+      <w:r>
+        <w:t xml:space="preserve"> </w:t>
+      </w:r>
+      <w:r>
+        <w:t xml:space="preserve">criterion (</w:t>
       </w:r>
       <m:oMath>
         <m:r>
@@ -5827,19 +6078,13 @@
         </m:r>
       </m:oMath>
       <w:r>
-        <w:t xml:space="preserve">) and a BIC improvement greater than</w:t>
-      </w:r>
-      <w:r>
-        <w:t xml:space="preserve"> </w:t>
-      </w:r>
-      <w:r>
-        <w:t xml:space="preserve">2.0.</w:t>
-      </w:r>
-      <w:r>
-        <w:t xml:space="preserve"> </w:t>
-      </w:r>
-      <w:r>
-        <w:t xml:space="preserve">The implementation uses</w:t>
+        <w:t xml:space="preserve">) and a BIC improvement greater than 2.0. The implementation</w:t>
+      </w:r>
+      <w:r>
+        <w:t xml:space="preserve"> </w:t>
+      </w:r>
+      <w:r>
+        <w:t xml:space="preserve">uses</w:t>
       </w:r>
       <w:r>
         <w:t xml:space="preserve"> </w:t>
@@ -5869,43 +6114,37 @@
         <w:t xml:space="preserve"> </w:t>
       </w:r>
       <w:r>
-        <w:t xml:space="preserve">Because the observed E-DAIC/CMDC item-labeled sample sizes are modest and</w:t>
-      </w:r>
-      <w:r>
-        <w:t xml:space="preserve"> </w:t>
-      </w:r>
-      <w:r>
-        <w:t xml:space="preserve">imbalanced, we also run a finite-sample simulation that preserves each</w:t>
-      </w:r>
-      <w:r>
-        <w:t xml:space="preserve"> </w:t>
-      </w:r>
-      <w:r>
-        <w:t xml:space="preserve">corpus’s observed sample size and severity composition. The simulation</w:t>
-      </w:r>
-      <w:r>
-        <w:t xml:space="preserve"> </w:t>
-      </w:r>
-      <w:r>
-        <w:t xml:space="preserve">contrasts a scalar invariant world with an observed-like C02/C06 threshold-DIF</w:t>
-      </w:r>
-      <w:r>
-        <w:t xml:space="preserve"> </w:t>
-      </w:r>
-      <w:r>
-        <w:t xml:space="preserve">world and reports false-localization, recovery, and anchor-recovery rates. This</w:t>
-      </w:r>
-      <w:r>
-        <w:t xml:space="preserve"> </w:t>
-      </w:r>
-      <w:r>
-        <w:t xml:space="preserve">bounds the evidential weight of localized threshold shifts under the observed</w:t>
-      </w:r>
-      <w:r>
-        <w:t xml:space="preserve"> </w:t>
-      </w:r>
-      <w:r>
-        <w:t xml:space="preserve">sample sizes.</w:t>
+        <w:t xml:space="preserve">We also run a finite-sample simulation that preserves each corpus’s observed</w:t>
+      </w:r>
+      <w:r>
+        <w:t xml:space="preserve"> </w:t>
+      </w:r>
+      <w:r>
+        <w:t xml:space="preserve">sample size and severity composition. The simulation contrasts a scalar</w:t>
+      </w:r>
+      <w:r>
+        <w:t xml:space="preserve"> </w:t>
+      </w:r>
+      <w:r>
+        <w:t xml:space="preserve">invariant world with an observed-like C02/C06 threshold-DIF world and reports</w:t>
+      </w:r>
+      <w:r>
+        <w:t xml:space="preserve"> </w:t>
+      </w:r>
+      <w:r>
+        <w:t xml:space="preserve">false-localization, recovery, and anchor-recovery rates. This bounds the</w:t>
+      </w:r>
+      <w:r>
+        <w:t xml:space="preserve"> </w:t>
+      </w:r>
+      <w:r>
+        <w:t xml:space="preserve">evidential weight of localized threshold shifts under the observed sample</w:t>
+      </w:r>
+      <w:r>
+        <w:t xml:space="preserve"> </w:t>
+      </w:r>
+      <w:r>
+        <w:t xml:space="preserve">sizes.</w:t>
       </w:r>
     </w:p>
     <w:p>
@@ -7943,7 +8182,13 @@
         <w:t xml:space="preserve"> </w:t>
       </w:r>
       <w:r>
-        <w:t xml:space="preserve">target labels, trainable shared layers, and optimization exposure. Seed-level</w:t>
+        <w:t xml:space="preserve">target labels and trainable shared-layer access under fixed, comparable</w:t>
+      </w:r>
+      <w:r>
+        <w:t xml:space="preserve"> </w:t>
+      </w:r>
+      <w:r>
+        <w:t xml:space="preserve">optimization schedules. Seed-level</w:t>
       </w:r>
       <w:r>
         <w:t xml:space="preserve"> </w:t>
@@ -8114,7 +8359,7 @@
               <w:jc w:val="left"/>
             </w:pPr>
             <w:r>
-              <w:t xml:space="preserve">Representation auditing is necessary, but raw corpus identity alone cannot decide target validity.</w:t>
+              <w:t xml:space="preserve">Representation auditing is necessary, but raw corpus identity alone cannot decide target comparability.</w:t>
             </w:r>
           </w:p>
         </w:tc>
@@ -8389,7 +8634,13 @@
         <w:t xml:space="preserve"> </w:t>
       </w:r>
       <w:r>
-        <w:t xml:space="preserve">target-validity question cannot be settled by a single corpus-identity number.</w:t>
+        <w:t xml:space="preserve">target-comparability question cannot be settled by a single corpus-identity</w:t>
+      </w:r>
+      <w:r>
+        <w:t xml:space="preserve"> </w:t>
+      </w:r>
+      <w:r>
+        <w:t xml:space="preserve">number.</w:t>
       </w:r>
     </w:p>
     <w:p>
@@ -8526,19 +8777,97 @@
         <w:t xml:space="preserve"> </w:t>
       </w:r>
       <w:r>
-        <w:t xml:space="preserve">question-position signatures. The modeling implication is direct:</w:t>
-      </w:r>
-      <w:r>
-        <w:t xml:space="preserve"> </w:t>
-      </w:r>
-      <w:r>
-        <w:t xml:space="preserve">representation alignment is a necessary audit target, but it cannot by itself</w:t>
-      </w:r>
-      <w:r>
-        <w:t xml:space="preserve"> </w:t>
-      </w:r>
-      <w:r>
-        <w:t xml:space="preserve">certify clinical target transfer.</w:t>
+        <w:t xml:space="preserve">question-position signatures. The leakage sensitivity is intentionally</w:t>
+      </w:r>
+      <w:r>
+        <w:t xml:space="preserve"> </w:t>
+      </w:r>
+      <w:r>
+        <w:t xml:space="preserve">bounded: E-DAIC speaker-resolved controls remain unavailable because neither</w:t>
+      </w:r>
+      <w:r>
+        <w:t xml:space="preserve"> </w:t>
+      </w:r>
+      <w:r>
+        <w:t xml:space="preserve">the manifest nor transcript CSV files expose populated speaker roles. Under the</w:t>
+      </w:r>
+      <w:r>
+        <w:t xml:space="preserve"> </w:t>
+      </w:r>
+      <w:r>
+        <w:t xml:space="preserve">Qwen3 prompt-proxy stress test, repeated-turn-only text does not match the full</w:t>
+      </w:r>
+      <w:r>
+        <w:t xml:space="preserve"> </w:t>
+      </w:r>
+      <w:r>
+        <w:t xml:space="preserve">transcript for PHQ-8 severity (MAE 4.806 versus 4.801) or binary depression</w:t>
+      </w:r>
+      <w:r>
+        <w:t xml:space="preserve"> </w:t>
+      </w:r>
+      <w:r>
+        <w:t xml:space="preserve">classification (Macro-F1 0.576 versus 0.665), and removing repeated turns does</w:t>
+      </w:r>
+      <w:r>
+        <w:t xml:space="preserve"> </w:t>
+      </w:r>
+      <w:r>
+        <w:t xml:space="preserve">not increase PHQ-8 error (4.577 versus 4.801), although binary Macro-F1 drops</w:t>
+      </w:r>
+      <w:r>
+        <w:t xml:space="preserve"> </w:t>
+      </w:r>
+      <w:r>
+        <w:t xml:space="preserve">modestly (0.614 versus 0.665). The CMDC criterion-overlap deletion stress is</w:t>
+      </w:r>
+      <w:r>
+        <w:t xml:space="preserve"> </w:t>
+      </w:r>
+      <w:r>
+        <w:t xml:space="preserve">similarly bounded: deleting high PHQ-overlap question-position segments is not</w:t>
+      </w:r>
+      <w:r>
+        <w:t xml:space="preserve"> </w:t>
+      </w:r>
+      <w:r>
+        <w:t xml:space="preserve">clearly worse than matched random deletion under the primary BGE-M3 view</w:t>
+      </w:r>
+      <w:r>
+        <w:t xml:space="preserve"> </w:t>
+      </w:r>
+      <w:r>
+        <w:t xml:space="preserve">(excess MAE 0.150, 95 percent interval -0.320 to 0.671). These checks do not</w:t>
+      </w:r>
+      <w:r>
+        <w:t xml:space="preserve"> </w:t>
+      </w:r>
+      <w:r>
+        <w:t xml:space="preserve">prove absence of criterion contamination, but they reduce the risk that the</w:t>
+      </w:r>
+      <w:r>
+        <w:t xml:space="preserve"> </w:t>
+      </w:r>
+      <w:r>
+        <w:t xml:space="preserve">main audit is driven only by the simplest accessible prompt or PHQ-overlap</w:t>
+      </w:r>
+      <w:r>
+        <w:t xml:space="preserve"> </w:t>
+      </w:r>
+      <w:r>
+        <w:t xml:space="preserve">shortcut. The modeling implication is direct: representation alignment is a</w:t>
+      </w:r>
+      <w:r>
+        <w:t xml:space="preserve"> </w:t>
+      </w:r>
+      <w:r>
+        <w:t xml:space="preserve">necessary audit target, but it cannot by itself certify clinical target</w:t>
+      </w:r>
+      <w:r>
+        <w:t xml:space="preserve"> </w:t>
+      </w:r>
+      <w:r>
+        <w:t xml:space="preserve">comparability.</w:t>
       </w:r>
     </w:p>
     <w:p>
@@ -8734,7 +9063,7 @@
         <w:t xml:space="preserve"> </w:t>
       </w:r>
       <w:r>
-        <w:t xml:space="preserve">localized threshold-shift items.</w:t>
+        <w:t xml:space="preserve">hypothesis-generating localized threshold-shift candidates.</w:t>
       </w:r>
     </w:p>
     <w:p>
@@ -8870,13 +9199,13 @@
         <w:pStyle w:val="BodyText"/>
       </w:pPr>
       <w:r>
-        <w:t xml:space="preserve">The formal and simulation checks support the same interpretation. Corrected</w:t>
-      </w:r>
-      <w:r>
-        <w:t xml:space="preserve"> </w:t>
-      </w:r>
-      <w:r>
-        <w:t xml:space="preserve">external</w:t>
+        <w:t xml:space="preserve">The formal and simulation checks support the same bounded interpretation.</w:t>
+      </w:r>
+      <w:r>
+        <w:t xml:space="preserve"> </w:t>
+      </w:r>
+      <w:r>
+        <w:t xml:space="preserve">Corrected external</w:t>
       </w:r>
       <w:r>
         <w:t xml:space="preserve"> </w:t>
@@ -8891,61 +9220,55 @@
         <w:t xml:space="preserve"> </w:t>
       </w:r>
       <w:r>
-        <w:t xml:space="preserve">replication preserves the qualitative anchor and</w:t>
-      </w:r>
-      <w:r>
-        <w:t xml:space="preserve"> </w:t>
-      </w:r>
-      <w:r>
-        <w:t xml:space="preserve">threshold-shift pattern. Under the observed E-DAIC/CMDC sample sizes and</w:t>
-      </w:r>
-      <w:r>
-        <w:t xml:space="preserve"> </w:t>
-      </w:r>
-      <w:r>
-        <w:t xml:space="preserve">severity distributions, C02/C06 both-flag recovery is 0.662 under the planted</w:t>
-      </w:r>
-      <w:r>
-        <w:t xml:space="preserve"> </w:t>
-      </w:r>
-      <w:r>
-        <w:t xml:space="preserve">shift world, while the H0 both-flag false rate is 0.208. We therefore treat</w:t>
-      </w:r>
-      <w:r>
-        <w:t xml:space="preserve"> </w:t>
-      </w:r>
-      <w:r>
-        <w:t xml:space="preserve">C02/C06 as recurrent threshold-shift candidates with finite-sample</w:t>
-      </w:r>
-      <w:r>
-        <w:t xml:space="preserve"> </w:t>
-      </w:r>
-      <w:r>
-        <w:t xml:space="preserve">uncertainty. For the</w:t>
-      </w:r>
-      <w:r>
-        <w:t xml:space="preserve"> </w:t>
-      </w:r>
-      <w:r>
-        <w:t xml:space="preserve">model, this is enough to justify explicit target-measurement modeling,</w:t>
-      </w:r>
-      <w:r>
-        <w:t xml:space="preserve"> </w:t>
-      </w:r>
-      <w:r>
-        <w:t xml:space="preserve">targeted calibration checks, and fair tests of whether measurement parameters</w:t>
-      </w:r>
-      <w:r>
-        <w:t xml:space="preserve"> </w:t>
-      </w:r>
-      <w:r>
-        <w:t xml:space="preserve">should be shared or corpus-specific; it is not necessary to overclaim universal</w:t>
-      </w:r>
-      <w:r>
-        <w:t xml:space="preserve"> </w:t>
-      </w:r>
-      <w:r>
-        <w:t xml:space="preserve">item-level DIF.</w:t>
+        <w:t xml:space="preserve">replication preserves the qualitative localization</w:t>
+      </w:r>
+      <w:r>
+        <w:t xml:space="preserve"> </w:t>
+      </w:r>
+      <w:r>
+        <w:t xml:space="preserve">pattern, but the sample-size caveat is substantial. Under the observed</w:t>
+      </w:r>
+      <w:r>
+        <w:t xml:space="preserve"> </w:t>
+      </w:r>
+      <w:r>
+        <w:t xml:space="preserve">E-DAIC/CMDC sample sizes and severity distributions, C02/C06 both-flag recovery</w:t>
+      </w:r>
+      <w:r>
+        <w:t xml:space="preserve"> </w:t>
+      </w:r>
+      <w:r>
+        <w:t xml:space="preserve">is 0.662 under the planted shift world, while the H0 both-flag false rate is</w:t>
+      </w:r>
+      <w:r>
+        <w:t xml:space="preserve"> </w:t>
+      </w:r>
+      <w:r>
+        <w:t xml:space="preserve">0.208. We therefore treat C02/C06 as hypothesis-generating recurrent</w:t>
+      </w:r>
+      <w:r>
+        <w:t xml:space="preserve"> </w:t>
+      </w:r>
+      <w:r>
+        <w:t xml:space="preserve">threshold-shift candidates with finite-sample uncertainty. For the model, this</w:t>
+      </w:r>
+      <w:r>
+        <w:t xml:space="preserve"> </w:t>
+      </w:r>
+      <w:r>
+        <w:t xml:space="preserve">is enough to justify explicit target-measurement modeling, targeted calibration</w:t>
+      </w:r>
+      <w:r>
+        <w:t xml:space="preserve"> </w:t>
+      </w:r>
+      <w:r>
+        <w:t xml:space="preserve">checks, and fair tests of whether measurement parameters should be shared or</w:t>
+      </w:r>
+      <w:r>
+        <w:t xml:space="preserve"> </w:t>
+      </w:r>
+      <w:r>
+        <w:t xml:space="preserve">corpus-specific; it is not evidence for definitive item-level DIF.</w:t>
       </w:r>
     </w:p>
     <w:p>
@@ -8995,25 +9318,25 @@
         <w:t xml:space="preserve"> </w:t>
       </w:r>
       <w:r>
-        <w:t xml:space="preserve">and two recurrent threshold-shift candidates with finite-sample uncertainty</w:t>
-      </w:r>
-      <w:r>
-        <w:t xml:space="preserve"> </w:t>
-      </w:r>
-      <w:r>
-        <w:t xml:space="preserve">(C02, C06). This strengthens the audit as a bounded target-contract result</w:t>
-      </w:r>
-      <w:r>
-        <w:t xml:space="preserve"> </w:t>
-      </w:r>
-      <w:r>
-        <w:t xml:space="preserve">while preserving the finite-sample caution, especially for sparse response</w:t>
-      </w:r>
-      <w:r>
-        <w:t xml:space="preserve"> </w:t>
-      </w:r>
-      <w:r>
-        <w:t xml:space="preserve">categories.</w:t>
+        <w:t xml:space="preserve">and two hypothesis-generating recurrent threshold-shift candidates with</w:t>
+      </w:r>
+      <w:r>
+        <w:t xml:space="preserve"> </w:t>
+      </w:r>
+      <w:r>
+        <w:t xml:space="preserve">finite-sample uncertainty (C02, C06). This strengthens the audit as a bounded</w:t>
+      </w:r>
+      <w:r>
+        <w:t xml:space="preserve"> </w:t>
+      </w:r>
+      <w:r>
+        <w:t xml:space="preserve">target-contract result while preserving the finite-sample caution, especially</w:t>
+      </w:r>
+      <w:r>
+        <w:t xml:space="preserve"> </w:t>
+      </w:r>
+      <w:r>
+        <w:t xml:space="preserve">for sparse response categories.</w:t>
       </w:r>
     </w:p>
     <w:p>
@@ -11484,7 +11807,7 @@
         <w:t xml:space="preserve"> </w:t>
       </w:r>
       <w:r>
-        <w:t xml:space="preserve">claim boundary without changing the main result that target validity,</w:t>
+        <w:t xml:space="preserve">claim boundary without changing the main result that target comparability,</w:t>
       </w:r>
       <w:r>
         <w:t xml:space="preserve"> </w:t>
@@ -11985,6 +12308,114 @@
     </w:p>
     <w:p>
       <w:pPr>
+        <w:pStyle w:val="BodyText"/>
+      </w:pPr>
+      <w:r>
+        <w:t xml:space="preserve">Seventh, the audit is about cross-corpus score interpretation and</w:t>
+      </w:r>
+      <w:r>
+        <w:t xml:space="preserve"> </w:t>
+      </w:r>
+      <w:r>
+        <w:t xml:space="preserve">target-comparability, not about proving the construct, criterion, or clinical</w:t>
+      </w:r>
+      <w:r>
+        <w:t xml:space="preserve"> </w:t>
+      </w:r>
+      <w:r>
+        <w:t xml:space="preserve">validity of PHQ, HAMD, or SDS. The instruments are treated as the available</w:t>
+      </w:r>
+      <w:r>
+        <w:t xml:space="preserve"> </w:t>
+      </w:r>
+      <w:r>
+        <w:t xml:space="preserve">benchmark targets, and the question is whether those targets can be compared</w:t>
+      </w:r>
+      <w:r>
+        <w:t xml:space="preserve"> </w:t>
+      </w:r>
+      <w:r>
+        <w:t xml:space="preserve">across corpus contracts.</w:t>
+      </w:r>
+    </w:p>
+    <w:p>
+      <w:pPr>
+        <w:pStyle w:val="BodyText"/>
+      </w:pPr>
+      <w:r>
+        <w:t xml:space="preserve">Eighth, the E-DAIC/CMDC shared-PHQ psychometric layer is intentionally</w:t>
+      </w:r>
+      <w:r>
+        <w:t xml:space="preserve"> </w:t>
+      </w:r>
+      <w:r>
+        <w:t xml:space="preserve">evidence-bounded. The main item-level analysis uses 219 E-DAIC and 77 CMDC</w:t>
+      </w:r>
+      <w:r>
+        <w:t xml:space="preserve"> </w:t>
+      </w:r>
+      <w:r>
+        <w:t xml:space="preserve">subjects over eight four-category items, so C02/C06 are</w:t>
+      </w:r>
+      <w:r>
+        <w:t xml:space="preserve"> </w:t>
+      </w:r>
+      <w:r>
+        <w:t xml:space="preserve">hypothesis-generating localized threshold-shift candidates, not definitive DIF</w:t>
+      </w:r>
+      <w:r>
+        <w:t xml:space="preserve"> </w:t>
+      </w:r>
+      <w:r>
+        <w:t xml:space="preserve">discoveries. The stronger conclusion is that exact observed-score</w:t>
+      </w:r>
+      <w:r>
+        <w:t xml:space="preserve"> </w:t>
+      </w:r>
+      <w:r>
+        <w:t xml:space="preserve">interchangeability is unsupported under the current audit.</w:t>
+      </w:r>
+    </w:p>
+    <w:p>
+      <w:pPr>
+        <w:pStyle w:val="BodyText"/>
+      </w:pPr>
+      <w:r>
+        <w:t xml:space="preserve">Ninth, interviewer leakage and criterion contamination remain only partially</w:t>
+      </w:r>
+      <w:r>
+        <w:t xml:space="preserve"> </w:t>
+      </w:r>
+      <w:r>
+        <w:t xml:space="preserve">controlled. E-DAIC participant-only and interviewer-only transcript controls</w:t>
+      </w:r>
+      <w:r>
+        <w:t xml:space="preserve"> </w:t>
+      </w:r>
+      <w:r>
+        <w:t xml:space="preserve">are blocked by the available transcript contract. The repeated-turn Qwen3</w:t>
+      </w:r>
+      <w:r>
+        <w:t xml:space="preserve"> </w:t>
+      </w:r>
+      <w:r>
+        <w:t xml:space="preserve">prompt-proxy and CMDC criterion-overlap deletion analyses are useful</w:t>
+      </w:r>
+      <w:r>
+        <w:t xml:space="preserve"> </w:t>
+      </w:r>
+      <w:r>
+        <w:t xml:space="preserve">stress tests, but they do not prove that prompt or questionnaire-like content</w:t>
+      </w:r>
+      <w:r>
+        <w:t xml:space="preserve"> </w:t>
+      </w:r>
+      <w:r>
+        <w:t xml:space="preserve">has no effect.</w:t>
+      </w:r>
+    </w:p>
+    <w:p>
+      <w:pPr>
         <w:pStyle w:val="Heading2"/>
       </w:pPr>
       <w:bookmarkStart w:id="50" w:name="conclusion"/>
@@ -12054,82 +12485,82 @@
         <w:pStyle w:val="BodyText"/>
       </w:pPr>
       <w:r>
-        <w:t xml:space="preserve">The resulting lesson is direct: before aligning representations, validate the</w:t>
-      </w:r>
-      <w:r>
-        <w:t xml:space="preserve"> </w:t>
-      </w:r>
-      <w:r>
-        <w:t xml:space="preserve">target. A target-validity audit framework gives future systems a practical way</w:t>
-      </w:r>
-      <w:r>
-        <w:t xml:space="preserve"> </w:t>
-      </w:r>
-      <w:r>
-        <w:t xml:space="preserve">to do that, and the fair ordinal-head ablation shows both the promise and the</w:t>
-      </w:r>
-      <w:r>
-        <w:t xml:space="preserve"> </w:t>
-      </w:r>
-      <w:r>
-        <w:t xml:space="preserve">claim boundary. The robust empirical lesson is that target-label calibration</w:t>
-      </w:r>
-      <w:r>
-        <w:t xml:space="preserve"> </w:t>
-      </w:r>
-      <w:r>
-        <w:t xml:space="preserve">and adaptation regime matter; target-only direct calibration is a strong and</w:t>
-      </w:r>
-      <w:r>
-        <w:t xml:space="preserve"> </w:t>
-      </w:r>
-      <w:r>
-        <w:t xml:space="preserve">often lower-error baseline; and corpus-specific ordinal heads have not yet</w:t>
-      </w:r>
-      <w:r>
-        <w:t xml:space="preserve"> </w:t>
-      </w:r>
-      <w:r>
-        <w:t xml:space="preserve">shown an independent overall advantage over a shared ordinal head in the real</w:t>
-      </w:r>
-      <w:r>
-        <w:t xml:space="preserve"> </w:t>
-      </w:r>
-      <w:r>
-        <w:t xml:space="preserve">E-DAIC/CMDC transfer setting. Strong encoders and multimodal foundation models</w:t>
-      </w:r>
-      <w:r>
-        <w:t xml:space="preserve"> </w:t>
-      </w:r>
-      <w:r>
-        <w:t xml:space="preserve">can still do what they do well, but clinical measurement contracts,</w:t>
-      </w:r>
-      <w:r>
-        <w:t xml:space="preserve"> </w:t>
-      </w:r>
-      <w:r>
-        <w:t xml:space="preserve">target-only calibration, source-plus-target calibration, shared-layer</w:t>
-      </w:r>
-      <w:r>
-        <w:t xml:space="preserve"> </w:t>
-      </w:r>
-      <w:r>
-        <w:t xml:space="preserve">adaptation, and corpus-specific measurement parameterization must be reported</w:t>
-      </w:r>
-      <w:r>
-        <w:t xml:space="preserve"> </w:t>
-      </w:r>
-      <w:r>
-        <w:t xml:space="preserve">separately. This makes cross-corpus depression benchmarks harder to overread,</w:t>
-      </w:r>
-      <w:r>
-        <w:t xml:space="preserve"> </w:t>
-      </w:r>
-      <w:r>
-        <w:t xml:space="preserve">but easier to trust.</w:t>
-      </w:r>
-    </w:p>
-    <w:bookmarkStart w:id="149" w:name="refs"/>
+        <w:t xml:space="preserve">The resulting lesson is direct: before aligning representations, audit target</w:t>
+      </w:r>
+      <w:r>
+        <w:t xml:space="preserve"> </w:t>
+      </w:r>
+      <w:r>
+        <w:t xml:space="preserve">comparability. A target-comparability audit framework gives future systems a</w:t>
+      </w:r>
+      <w:r>
+        <w:t xml:space="preserve"> </w:t>
+      </w:r>
+      <w:r>
+        <w:t xml:space="preserve">practical way to do that, and the fair ordinal-head ablation shows both the</w:t>
+      </w:r>
+      <w:r>
+        <w:t xml:space="preserve"> </w:t>
+      </w:r>
+      <w:r>
+        <w:t xml:space="preserve">promise and the claim boundary. The robust empirical lesson is that</w:t>
+      </w:r>
+      <w:r>
+        <w:t xml:space="preserve"> </w:t>
+      </w:r>
+      <w:r>
+        <w:t xml:space="preserve">target-label calibration and adaptation regime matter; target-only direct</w:t>
+      </w:r>
+      <w:r>
+        <w:t xml:space="preserve"> </w:t>
+      </w:r>
+      <w:r>
+        <w:t xml:space="preserve">calibration is a strong and often lower-error baseline; and corpus-specific</w:t>
+      </w:r>
+      <w:r>
+        <w:t xml:space="preserve"> </w:t>
+      </w:r>
+      <w:r>
+        <w:t xml:space="preserve">ordinal heads have not yet shown an independent overall advantage over a shared</w:t>
+      </w:r>
+      <w:r>
+        <w:t xml:space="preserve"> </w:t>
+      </w:r>
+      <w:r>
+        <w:t xml:space="preserve">ordinal head in the real E-DAIC/CMDC transfer setting. Strong encoders and</w:t>
+      </w:r>
+      <w:r>
+        <w:t xml:space="preserve"> </w:t>
+      </w:r>
+      <w:r>
+        <w:t xml:space="preserve">multimodal foundation models can still do what they do well, but clinical</w:t>
+      </w:r>
+      <w:r>
+        <w:t xml:space="preserve"> </w:t>
+      </w:r>
+      <w:r>
+        <w:t xml:space="preserve">measurement contracts, target-only calibration, source-plus-target</w:t>
+      </w:r>
+      <w:r>
+        <w:t xml:space="preserve"> </w:t>
+      </w:r>
+      <w:r>
+        <w:t xml:space="preserve">calibration, shared-layer adaptation, and corpus-specific measurement</w:t>
+      </w:r>
+      <w:r>
+        <w:t xml:space="preserve"> </w:t>
+      </w:r>
+      <w:r>
+        <w:t xml:space="preserve">parameterization must be reported separately. This makes cross-corpus</w:t>
+      </w:r>
+      <w:r>
+        <w:t xml:space="preserve"> </w:t>
+      </w:r>
+      <w:r>
+        <w:t xml:space="preserve">depression benchmarks harder to overread, but easier to trust.</w:t>
+      </w:r>
+    </w:p>
+    <w:bookmarkStart w:id="153" w:name="refs"/>
     <w:bookmarkStart w:id="52" w:name="ref-alaa2025medicalconstruct"/>
     <w:p>
       <w:pPr>
@@ -12973,18 +13404,57 @@
       </w:r>
     </w:p>
     <w:bookmarkEnd w:id="98"/>
-    <w:bookmarkStart w:id="100" w:name="ref-ishikawa2026multiprobe"/>
+    <w:bookmarkStart w:id="100" w:name="ref-ikeda2026grmsamplesize"/>
     <w:p>
       <w:pPr>
         <w:pStyle w:val="Bibliography"/>
       </w:pPr>
       <w:r>
+        <w:t xml:space="preserve">Ikeda, Tatsuya. 2026. “A Monte Carlo Simulation Study of Sample Size Requirements for the Graded Response Model.”</w:t>
+      </w:r>
+      <w:r>
+        <w:t xml:space="preserve"> </w:t>
+      </w:r>
+      <w:r>
+        <w:rPr>
+          <w:i/>
+        </w:rPr>
+        <w:t xml:space="preserve">PLOS One</w:t>
+      </w:r>
+      <w:r>
+        <w:t xml:space="preserve"> </w:t>
+      </w:r>
+      <w:r>
+        <w:t xml:space="preserve">21 (4): e0347684.</w:t>
+      </w:r>
+      <w:r>
+        <w:t xml:space="preserve"> </w:t>
+      </w:r>
+      <w:hyperlink r:id="rId99">
+        <w:r>
+          <w:rPr>
+            <w:rStyle w:val="Hyperlink"/>
+          </w:rPr>
+          <w:t xml:space="preserve">https://doi.org/10.1371/journal.pone.0347684</w:t>
+        </w:r>
+      </w:hyperlink>
+      <w:r>
+        <w:t xml:space="preserve">.</w:t>
+      </w:r>
+    </w:p>
+    <w:bookmarkEnd w:id="100"/>
+    <w:bookmarkStart w:id="102" w:name="ref-ishikawa2026multiprobe"/>
+    <w:p>
+      <w:pPr>
+        <w:pStyle w:val="Bibliography"/>
+      </w:pPr>
+      <w:r>
         <w:t xml:space="preserve">Ishikawa, Takehiro, and Jon Duke. 2026. “A Multi-Probe Audit of Clinical-Interview Depression Detection Benchmarks.”</w:t>
       </w:r>
       <w:r>
         <w:t xml:space="preserve"> </w:t>
       </w:r>
-      <w:hyperlink r:id="rId99">
+      <w:hyperlink r:id="rId101">
         <w:r>
           <w:rPr>
             <w:rStyle w:val="Hyperlink"/>
@@ -12996,19 +13466,58 @@
         <w:t xml:space="preserve">.</w:t>
       </w:r>
     </w:p>
-    <w:bookmarkEnd w:id="100"/>
-    <w:bookmarkStart w:id="102" w:name="ref-li2025mirror"/>
+    <w:bookmarkEnd w:id="102"/>
+    <w:bookmarkStart w:id="104" w:name="ref-jiang2016mgrmsamplesize"/>
     <w:p>
       <w:pPr>
         <w:pStyle w:val="Bibliography"/>
       </w:pPr>
       <w:r>
+        <w:t xml:space="preserve">Jiang, Shengyu, Chun Wang, and David J. Weiss. 2016. “Sample Size Requirements for Estimation of Item Parameters in the Multidimensional Graded Response Model.”</w:t>
+      </w:r>
+      <w:r>
+        <w:t xml:space="preserve"> </w:t>
+      </w:r>
+      <w:r>
+        <w:rPr>
+          <w:i/>
+        </w:rPr>
+        <w:t xml:space="preserve">Frontiers in Psychology</w:t>
+      </w:r>
+      <w:r>
+        <w:t xml:space="preserve"> </w:t>
+      </w:r>
+      <w:r>
+        <w:t xml:space="preserve">7: 109.</w:t>
+      </w:r>
+      <w:r>
+        <w:t xml:space="preserve"> </w:t>
+      </w:r>
+      <w:hyperlink r:id="rId103">
+        <w:r>
+          <w:rPr>
+            <w:rStyle w:val="Hyperlink"/>
+          </w:rPr>
+          <w:t xml:space="preserve">https://doi.org/10.3389/fpsyg.2016.00109</w:t>
+        </w:r>
+      </w:hyperlink>
+      <w:r>
+        <w:t xml:space="preserve">.</w:t>
+      </w:r>
+    </w:p>
+    <w:bookmarkEnd w:id="104"/>
+    <w:bookmarkStart w:id="106" w:name="ref-li2025mirror"/>
+    <w:p>
+      <w:pPr>
+        <w:pStyle w:val="Bibliography"/>
+      </w:pPr>
+      <w:r>
         <w:t xml:space="preserve">Li, Tong, Rasiq Hussain, Mehak Gupta, and Joshua R. Oltmanns. 2025. “"Mirror" Language AI Models of Depression Are Criterion-Contaminated.”</w:t>
       </w:r>
       <w:r>
         <w:t xml:space="preserve"> </w:t>
       </w:r>
-      <w:hyperlink r:id="rId101">
+      <w:hyperlink r:id="rId105">
         <w:r>
           <w:rPr>
             <w:rStyle w:val="Hyperlink"/>
@@ -13020,8 +13529,8 @@
         <w:t xml:space="preserve">.</w:t>
       </w:r>
     </w:p>
-    <w:bookmarkEnd w:id="102"/>
-    <w:bookmarkStart w:id="104" w:name="ref-lipton2018labelshift"/>
+    <w:bookmarkEnd w:id="106"/>
+    <w:bookmarkStart w:id="108" w:name="ref-lipton2018labelshift"/>
     <w:p>
       <w:pPr>
         <w:pStyle w:val="Bibliography"/>
@@ -13044,7 +13553,7 @@
       <w:r>
         <w:t xml:space="preserve"> </w:t>
       </w:r>
-      <w:hyperlink r:id="rId103">
+      <w:hyperlink r:id="rId107">
         <w:r>
           <w:rPr>
             <w:rStyle w:val="Hyperlink"/>
@@ -13056,8 +13565,8 @@
         <w:t xml:space="preserve">.</w:t>
       </w:r>
     </w:p>
-    <w:bookmarkEnd w:id="104"/>
-    <w:bookmarkStart w:id="106" w:name="ref-long2015dan"/>
+    <w:bookmarkEnd w:id="108"/>
+    <w:bookmarkStart w:id="110" w:name="ref-long2015dan"/>
     <w:p>
       <w:pPr>
         <w:pStyle w:val="Bibliography"/>
@@ -13080,7 +13589,7 @@
       <w:r>
         <w:t xml:space="preserve"> </w:t>
       </w:r>
-      <w:hyperlink r:id="rId105">
+      <w:hyperlink r:id="rId109">
         <w:r>
           <w:rPr>
             <w:rStyle w:val="Hyperlink"/>
@@ -13092,8 +13601,8 @@
         <w:t xml:space="preserve">.</w:t>
       </w:r>
     </w:p>
-    <w:bookmarkEnd w:id="106"/>
-    <w:bookmarkStart w:id="108" w:name="ref-ma2021phqhamd"/>
+    <w:bookmarkEnd w:id="110"/>
+    <w:bookmarkStart w:id="112" w:name="ref-ma2021phqhamd"/>
     <w:p>
       <w:pPr>
         <w:pStyle w:val="Bibliography"/>
@@ -13119,7 +13628,7 @@
       <w:r>
         <w:t xml:space="preserve"> </w:t>
       </w:r>
-      <w:hyperlink r:id="rId107">
+      <w:hyperlink r:id="rId111">
         <w:r>
           <w:rPr>
             <w:rStyle w:val="Hyperlink"/>
@@ -13131,8 +13640,8 @@
         <w:t xml:space="preserve">.</w:t>
       </w:r>
     </w:p>
-    <w:bookmarkEnd w:id="108"/>
-    <w:bookmarkStart w:id="110" w:name="ref-mandal2025questmf"/>
+    <w:bookmarkEnd w:id="112"/>
+    <w:bookmarkStart w:id="114" w:name="ref-mandal2025questmf"/>
     <w:p>
       <w:pPr>
         <w:pStyle w:val="Bibliography"/>
@@ -13155,7 +13664,7 @@
       <w:r>
         <w:t xml:space="preserve"> </w:t>
       </w:r>
-      <w:hyperlink r:id="rId109">
+      <w:hyperlink r:id="rId113">
         <w:r>
           <w:rPr>
             <w:rStyle w:val="Hyperlink"/>
@@ -13167,8 +13676,8 @@
         <w:t xml:space="preserve">.</w:t>
       </w:r>
     </w:p>
-    <w:bookmarkEnd w:id="110"/>
-    <w:bookmarkStart w:id="112" w:name="ref-meredith1993measurement"/>
+    <w:bookmarkEnd w:id="114"/>
+    <w:bookmarkStart w:id="116" w:name="ref-meredith1993measurement"/>
     <w:p>
       <w:pPr>
         <w:pStyle w:val="Bibliography"/>
@@ -13194,7 +13703,7 @@
       <w:r>
         <w:t xml:space="preserve"> </w:t>
       </w:r>
-      <w:hyperlink r:id="rId111">
+      <w:hyperlink r:id="rId115">
         <w:r>
           <w:rPr>
             <w:rStyle w:val="Hyperlink"/>
@@ -13206,8 +13715,8 @@
         <w:t xml:space="preserve">.</w:t>
       </w:r>
     </w:p>
-    <w:bookmarkEnd w:id="112"/>
-    <w:bookmarkStart w:id="114" w:name="ref-muthen2014irt"/>
+    <w:bookmarkEnd w:id="116"/>
+    <w:bookmarkStart w:id="118" w:name="ref-muthen2014irt"/>
     <w:p>
       <w:pPr>
         <w:pStyle w:val="Bibliography"/>
@@ -13239,7 +13748,7 @@
       <w:r>
         <w:t xml:space="preserve"> </w:t>
       </w:r>
-      <w:hyperlink r:id="rId113">
+      <w:hyperlink r:id="rId117">
         <w:r>
           <w:rPr>
             <w:rStyle w:val="Hyperlink"/>
@@ -13251,8 +13760,8 @@
         <w:t xml:space="preserve">.</w:t>
       </w:r>
     </w:p>
-    <w:bookmarkEnd w:id="114"/>
-    <w:bookmarkStart w:id="116" w:name="ref-nguyen2022improving"/>
+    <w:bookmarkEnd w:id="118"/>
+    <w:bookmarkStart w:id="120" w:name="ref-nguyen2022improving"/>
     <w:p>
       <w:pPr>
         <w:pStyle w:val="Bibliography"/>
@@ -13275,7 +13784,7 @@
       <w:r>
         <w:t xml:space="preserve"> </w:t>
       </w:r>
-      <w:hyperlink r:id="rId115">
+      <w:hyperlink r:id="rId119">
         <w:r>
           <w:rPr>
             <w:rStyle w:val="Hyperlink"/>
@@ -13287,8 +13796,8 @@
         <w:t xml:space="preserve">.</w:t>
       </w:r>
     </w:p>
-    <w:bookmarkEnd w:id="116"/>
-    <w:bookmarkStart w:id="118" w:name="ref-patel2019measurement"/>
+    <w:bookmarkEnd w:id="120"/>
+    <w:bookmarkStart w:id="122" w:name="ref-patel2019measurement"/>
     <w:p>
       <w:pPr>
         <w:pStyle w:val="Bibliography"/>
@@ -13314,7 +13823,7 @@
       <w:r>
         <w:t xml:space="preserve"> </w:t>
       </w:r>
-      <w:hyperlink r:id="rId117">
+      <w:hyperlink r:id="rId121">
         <w:r>
           <w:rPr>
             <w:rStyle w:val="Hyperlink"/>
@@ -13326,8 +13835,8 @@
         <w:t xml:space="preserve">.</w:t>
       </w:r>
     </w:p>
-    <w:bookmarkEnd w:id="118"/>
-    <w:bookmarkStart w:id="120" w:name="ref-pdchrepository2026"/>
+    <w:bookmarkEnd w:id="122"/>
+    <w:bookmarkStart w:id="124" w:name="ref-pdchrepository2026"/>
     <w:p>
       <w:pPr>
         <w:pStyle w:val="Bibliography"/>
@@ -13338,7 +13847,7 @@
       <w:r>
         <w:t xml:space="preserve"> </w:t>
       </w:r>
-      <w:hyperlink r:id="rId119">
+      <w:hyperlink r:id="rId123">
         <w:r>
           <w:rPr>
             <w:rStyle w:val="Hyperlink"/>
@@ -13350,8 +13859,8 @@
         <w:t xml:space="preserve">.</w:t>
       </w:r>
     </w:p>
-    <w:bookmarkEnd w:id="120"/>
-    <w:bookmarkStart w:id="122" w:name="ref-putnick2016measurement"/>
+    <w:bookmarkEnd w:id="124"/>
+    <w:bookmarkStart w:id="126" w:name="ref-putnick2016measurement"/>
     <w:p>
       <w:pPr>
         <w:pStyle w:val="Bibliography"/>
@@ -13377,7 +13886,7 @@
       <w:r>
         <w:t xml:space="preserve"> </w:t>
       </w:r>
-      <w:hyperlink r:id="rId121">
+      <w:hyperlink r:id="rId125">
         <w:r>
           <w:rPr>
             <w:rStyle w:val="Hyperlink"/>
@@ -13389,8 +13898,8 @@
         <w:t xml:space="preserve">.</w:t>
       </w:r>
     </w:p>
-    <w:bookmarkEnd w:id="122"/>
-    <w:bookmarkStart w:id="124" w:name="ref-sagawa2019groupdro"/>
+    <w:bookmarkEnd w:id="126"/>
+    <w:bookmarkStart w:id="128" w:name="ref-sagawa2019groupdro"/>
     <w:p>
       <w:pPr>
         <w:pStyle w:val="Bibliography"/>
@@ -13401,7 +13910,7 @@
       <w:r>
         <w:t xml:space="preserve"> </w:t>
       </w:r>
-      <w:hyperlink r:id="rId123">
+      <w:hyperlink r:id="rId127">
         <w:r>
           <w:rPr>
             <w:rStyle w:val="Hyperlink"/>
@@ -13413,8 +13922,8 @@
         <w:t xml:space="preserve">.</w:t>
       </w:r>
     </w:p>
-    <w:bookmarkEnd w:id="124"/>
-    <w:bookmarkStart w:id="126" w:name="ref-samejima1969graded"/>
+    <w:bookmarkEnd w:id="128"/>
+    <w:bookmarkStart w:id="130" w:name="ref-samejima1969graded"/>
     <w:p>
       <w:pPr>
         <w:pStyle w:val="Bibliography"/>
@@ -13437,7 +13946,7 @@
       <w:r>
         <w:t xml:space="preserve"> </w:t>
       </w:r>
-      <w:hyperlink r:id="rId125">
+      <w:hyperlink r:id="rId129">
         <w:r>
           <w:rPr>
             <w:rStyle w:val="Hyperlink"/>
@@ -13449,8 +13958,8 @@
         <w:t xml:space="preserve">.</w:t>
       </w:r>
     </w:p>
-    <w:bookmarkEnd w:id="126"/>
-    <w:bookmarkStart w:id="128" w:name="ref-shen2022automatic"/>
+    <w:bookmarkEnd w:id="130"/>
+    <w:bookmarkStart w:id="132" w:name="ref-shen2022automatic"/>
     <w:p>
       <w:pPr>
         <w:pStyle w:val="Bibliography"/>
@@ -13473,7 +13982,7 @@
       <w:r>
         <w:t xml:space="preserve"> </w:t>
       </w:r>
-      <w:hyperlink r:id="rId127">
+      <w:hyperlink r:id="rId131">
         <w:r>
           <w:rPr>
             <w:rStyle w:val="Hyperlink"/>
@@ -13485,8 +13994,8 @@
         <w:t xml:space="preserve">.</w:t>
       </w:r>
     </w:p>
-    <w:bookmarkEnd w:id="128"/>
-    <w:bookmarkStart w:id="130" w:name="ref-sun2016deepcoral"/>
+    <w:bookmarkEnd w:id="132"/>
+    <w:bookmarkStart w:id="134" w:name="ref-sun2016deepcoral"/>
     <w:p>
       <w:pPr>
         <w:pStyle w:val="Bibliography"/>
@@ -13509,7 +14018,7 @@
       <w:r>
         <w:t xml:space="preserve"> </w:t>
       </w:r>
-      <w:hyperlink r:id="rId129">
+      <w:hyperlink r:id="rId133">
         <w:r>
           <w:rPr>
             <w:rStyle w:val="Hyperlink"/>
@@ -13521,8 +14030,8 @@
         <w:t xml:space="preserve">.</w:t>
       </w:r>
     </w:p>
-    <w:bookmarkEnd w:id="130"/>
-    <w:bookmarkStart w:id="132" w:name="ref-teng2026depressionllm"/>
+    <w:bookmarkEnd w:id="134"/>
+    <w:bookmarkStart w:id="136" w:name="ref-teng2026depressionllm"/>
     <w:p>
       <w:pPr>
         <w:pStyle w:val="Bibliography"/>
@@ -13548,7 +14057,7 @@
       <w:r>
         <w:t xml:space="preserve"> </w:t>
       </w:r>
-      <w:hyperlink r:id="rId131">
+      <w:hyperlink r:id="rId135">
         <w:r>
           <w:rPr>
             <w:rStyle w:val="Hyperlink"/>
@@ -13560,8 +14069,8 @@
         <w:t xml:space="preserve">.</w:t>
       </w:r>
     </w:p>
-    <w:bookmarkEnd w:id="132"/>
-    <w:bookmarkStart w:id="134" w:name="ref-uscict2026daic"/>
+    <w:bookmarkEnd w:id="136"/>
+    <w:bookmarkStart w:id="138" w:name="ref-uscict2026daic"/>
     <w:p>
       <w:pPr>
         <w:pStyle w:val="Bibliography"/>
@@ -13572,7 +14081,7 @@
       <w:r>
         <w:t xml:space="preserve"> </w:t>
       </w:r>
-      <w:hyperlink r:id="rId133">
+      <w:hyperlink r:id="rId137">
         <w:r>
           <w:rPr>
             <w:rStyle w:val="Hyperlink"/>
@@ -13584,8 +14093,8 @@
         <w:t xml:space="preserve">.</w:t>
       </w:r>
     </w:p>
-    <w:bookmarkEnd w:id="134"/>
-    <w:bookmarkStart w:id="136" w:name="ref-vandenberg2000review"/>
+    <w:bookmarkEnd w:id="138"/>
+    <w:bookmarkStart w:id="140" w:name="ref-vandenberg2000review"/>
     <w:p>
       <w:pPr>
         <w:pStyle w:val="Bibliography"/>
@@ -13611,7 +14120,7 @@
       <w:r>
         <w:t xml:space="preserve"> </w:t>
       </w:r>
-      <w:hyperlink r:id="rId135">
+      <w:hyperlink r:id="rId139">
         <w:r>
           <w:rPr>
             <w:rStyle w:val="Hyperlink"/>
@@ -13623,8 +14132,8 @@
         <w:t xml:space="preserve">.</w:t>
       </w:r>
     </w:p>
-    <w:bookmarkEnd w:id="136"/>
-    <w:bookmarkStart w:id="138" w:name="ref-wang2024multilinguale5"/>
+    <w:bookmarkEnd w:id="140"/>
+    <w:bookmarkStart w:id="142" w:name="ref-wang2024multilinguale5"/>
     <w:p>
       <w:pPr>
         <w:pStyle w:val="Bibliography"/>
@@ -13635,7 +14144,7 @@
       <w:r>
         <w:t xml:space="preserve"> </w:t>
       </w:r>
-      <w:hyperlink r:id="rId137">
+      <w:hyperlink r:id="rId141">
         <w:r>
           <w:rPr>
             <w:rStyle w:val="Hyperlink"/>
@@ -13647,8 +14156,8 @@
         <w:t xml:space="preserve">.</w:t>
       </w:r>
     </w:p>
-    <w:bookmarkEnd w:id="138"/>
-    <w:bookmarkStart w:id="140" w:name="ref-zhang2025interviewer"/>
+    <w:bookmarkEnd w:id="142"/>
+    <w:bookmarkStart w:id="144" w:name="ref-zhang2025interviewer"/>
     <w:p>
       <w:pPr>
         <w:pStyle w:val="Bibliography"/>
@@ -13671,7 +14180,7 @@
       <w:r>
         <w:t xml:space="preserve"> </w:t>
       </w:r>
-      <w:hyperlink r:id="rId139">
+      <w:hyperlink r:id="rId143">
         <w:r>
           <w:rPr>
             <w:rStyle w:val="Hyperlink"/>
@@ -13683,8 +14192,8 @@
         <w:t xml:space="preserve">.</w:t>
       </w:r>
     </w:p>
-    <w:bookmarkEnd w:id="140"/>
-    <w:bookmarkStart w:id="142" w:name="ref-zhang2025red"/>
+    <w:bookmarkEnd w:id="144"/>
+    <w:bookmarkStart w:id="146" w:name="ref-zhang2025red"/>
     <w:p>
       <w:pPr>
         <w:pStyle w:val="Bibliography"/>
@@ -13707,7 +14216,7 @@
       <w:r>
         <w:t xml:space="preserve"> </w:t>
       </w:r>
-      <w:hyperlink r:id="rId141">
+      <w:hyperlink r:id="rId145">
         <w:r>
           <w:rPr>
             <w:rStyle w:val="Hyperlink"/>
@@ -13719,8 +14228,8 @@
         <w:t xml:space="preserve">.</w:t>
       </w:r>
     </w:p>
-    <w:bookmarkEnd w:id="142"/>
-    <w:bookmarkStart w:id="144" w:name="ref-zhang2025qwen3embedding"/>
+    <w:bookmarkEnd w:id="146"/>
+    <w:bookmarkStart w:id="148" w:name="ref-zhang2025qwen3embedding"/>
     <w:p>
       <w:pPr>
         <w:pStyle w:val="Bibliography"/>
@@ -13731,7 +14240,7 @@
       <w:r>
         <w:t xml:space="preserve"> </w:t>
       </w:r>
-      <w:hyperlink r:id="rId143">
+      <w:hyperlink r:id="rId147">
         <w:r>
           <w:rPr>
             <w:rStyle w:val="Hyperlink"/>
@@ -13743,8 +14252,8 @@
         <w:t xml:space="preserve">.</w:t>
       </w:r>
     </w:p>
-    <w:bookmarkEnd w:id="144"/>
-    <w:bookmarkStart w:id="146" w:name="ref-zhou2026depression"/>
+    <w:bookmarkEnd w:id="148"/>
+    <w:bookmarkStart w:id="150" w:name="ref-zhou2026depression"/>
     <w:p>
       <w:pPr>
         <w:pStyle w:val="Bibliography"/>
@@ -13770,7 +14279,7 @@
       <w:r>
         <w:t xml:space="preserve"> </w:t>
       </w:r>
-      <w:hyperlink r:id="rId145">
+      <w:hyperlink r:id="rId149">
         <w:r>
           <w:rPr>
             <w:rStyle w:val="Hyperlink"/>
@@ -13782,8 +14291,8 @@
         <w:t xml:space="preserve">.</w:t>
       </w:r>
     </w:p>
-    <w:bookmarkEnd w:id="146"/>
-    <w:bookmarkStart w:id="148" w:name="ref-zou2023cmdc"/>
+    <w:bookmarkEnd w:id="150"/>
+    <w:bookmarkStart w:id="152" w:name="ref-zou2023cmdc"/>
     <w:p>
       <w:pPr>
         <w:pStyle w:val="Bibliography"/>
@@ -13809,7 +14318,7 @@
       <w:r>
         <w:t xml:space="preserve"> </w:t>
       </w:r>
-      <w:hyperlink r:id="rId147">
+      <w:hyperlink r:id="rId151">
         <w:r>
           <w:rPr>
             <w:rStyle w:val="Hyperlink"/>
@@ -13821,8 +14330,8 @@
         <w:t xml:space="preserve">.</w:t>
       </w:r>
     </w:p>
-    <w:bookmarkEnd w:id="148"/>
-    <w:bookmarkEnd w:id="149"/>
+    <w:bookmarkEnd w:id="152"/>
+    <w:bookmarkEnd w:id="153"/>
     <w:sectPr/>
   </w:body>
 </w:document>

</xml_diff>